<commit_message>
docs(especificacao): v3.1 com prefixo de pacote livre e sugestão ZPK
No padrão de nomenclatura (seção 4), o pacote passa a ser
<prefixo>_PC_*, com ZPK como sugestão genérica e ZAVBS como a escolha
pessoal do autor usada no repositório; a estrutura de pacotes
(seção 23) lista os nomes equivalentes com ZPK. O .docx recebe as
mesmas alterações.

Co-Authored-By: Claude Opus 5.5 <noreply@anthropic.com>
</commit_message>
<xml_diff>
--- a/docs/Pedidos_de_Compras_-_Especificacao_Tecnica.docx
+++ b/docs/Pedidos_de_Compras_-_Especificacao_Tecnica.docx
@@ -252,7 +252,7 @@
                 <w:sz w:val="17"/>
                 <w:szCs w:val="17"/>
               </w:rPr>
-              <w:t xml:space="preserve">3.0 (21/10/2026)</w:t>
+              <w:t xml:space="preserve">3.1 (21/10/2026)</w:t>
             </w:r>
           </w:p>
         </w:tc>
@@ -5542,30 +5542,16 @@
                 <w:sz w:val="17"/>
                 <w:szCs w:val="17"/>
               </w:rPr>
-              <w:t xml:space="preserve">ZAVBS_PC_*</w:t>
-            </w:r>
-          </w:p>
-        </w:tc>
-        <w:tc>
-          <w:tcPr>
-            <w:tcW w:type="dxa" w:w="3770"/>
-            <w:tcBorders>
-              <w:top w:val="single" w:color="C9D3DD" w:sz="4"/>
-              <w:left w:val="single" w:color="C9D3DD" w:sz="4"/>
-              <w:bottom w:val="single" w:color="C9D3DD" w:sz="4"/>
-              <w:right w:val="single" w:color="C9D3DD" w:sz="4"/>
-            </w:tcBorders>
-            <w:tcMar>
-              <w:top w:type="dxa" w:w="50"/>
-              <w:left w:type="dxa" w:w="80"/>
-              <w:bottom w:type="dxa" w:w="50"/>
-              <w:right w:type="dxa" w:w="80"/>
-            </w:tcMar>
-          </w:tcPr>
-          <w:p>
-            <w:pPr>
-              <w:spacing w:before="0" w:after="0"/>
-            </w:pPr>
+              <w:t xml:space="preserve">&lt;prefixo&gt;_PC_*</w:t>
+            </w:r>
+            <w:r>
+              <w:rPr>
+                <w:rFonts w:ascii="Arial" w:cs="Arial" w:eastAsia="Arial" w:hAnsi="Arial"/>
+                <w:sz w:val="17"/>
+                <w:szCs w:val="17"/>
+              </w:rPr>
+              <w:t xml:space="preserve"> (prefixo livre; sugestão: </w:t>
+            </w:r>
             <w:r>
               <w:rPr>
                 <w:rFonts w:ascii="Consolas" w:cs="Consolas" w:eastAsia="Consolas" w:hAnsi="Consolas"/>
@@ -5573,16 +5559,38 @@
                 <w:sz w:val="17"/>
                 <w:szCs w:val="17"/>
               </w:rPr>
-              <w:t xml:space="preserve">ZAVBS_PC_COMMON</w:t>
-            </w:r>
-            <w:r>
-              <w:rPr>
-                <w:rFonts w:ascii="Arial" w:cs="Arial" w:eastAsia="Arial" w:hAnsi="Arial"/>
-                <w:sz w:val="17"/>
-                <w:szCs w:val="17"/>
-              </w:rPr>
-              <w:t xml:space="preserve">, </w:t>
-            </w:r>
+              <w:t xml:space="preserve">ZPK</w:t>
+            </w:r>
+            <w:r>
+              <w:rPr>
+                <w:rFonts w:ascii="Arial" w:cs="Arial" w:eastAsia="Arial" w:hAnsi="Arial"/>
+                <w:sz w:val="17"/>
+                <w:szCs w:val="17"/>
+              </w:rPr>
+              <w:t xml:space="preserve">)</w:t>
+            </w:r>
+          </w:p>
+        </w:tc>
+        <w:tc>
+          <w:tcPr>
+            <w:tcW w:type="dxa" w:w="3770"/>
+            <w:tcBorders>
+              <w:top w:val="single" w:color="C9D3DD" w:sz="4"/>
+              <w:left w:val="single" w:color="C9D3DD" w:sz="4"/>
+              <w:bottom w:val="single" w:color="C9D3DD" w:sz="4"/>
+              <w:right w:val="single" w:color="C9D3DD" w:sz="4"/>
+            </w:tcBorders>
+            <w:tcMar>
+              <w:top w:type="dxa" w:w="50"/>
+              <w:left w:type="dxa" w:w="80"/>
+              <w:bottom w:type="dxa" w:w="50"/>
+              <w:right w:type="dxa" w:w="80"/>
+            </w:tcMar>
+          </w:tcPr>
+          <w:p>
+            <w:pPr>
+              <w:spacing w:before="0" w:after="0"/>
+            </w:pPr>
             <w:r>
               <w:rPr>
                 <w:rFonts w:ascii="Consolas" w:cs="Consolas" w:eastAsia="Consolas" w:hAnsi="Consolas"/>
@@ -5590,7 +5598,49 @@
                 <w:sz w:val="17"/>
                 <w:szCs w:val="17"/>
               </w:rPr>
-              <w:t xml:space="preserve">ZAVBS_PC_PEDIDOS</w:t>
+              <w:t xml:space="preserve">ZPK_PC_COMMON</w:t>
+            </w:r>
+            <w:r>
+              <w:rPr>
+                <w:rFonts w:ascii="Arial" w:cs="Arial" w:eastAsia="Arial" w:hAnsi="Arial"/>
+                <w:sz w:val="17"/>
+                <w:szCs w:val="17"/>
+              </w:rPr>
+              <w:t xml:space="preserve">, </w:t>
+            </w:r>
+            <w:r>
+              <w:rPr>
+                <w:rFonts w:ascii="Consolas" w:cs="Consolas" w:eastAsia="Consolas" w:hAnsi="Consolas"/>
+                <w:color w:val="00144A"/>
+                <w:sz w:val="17"/>
+                <w:szCs w:val="17"/>
+              </w:rPr>
+              <w:t xml:space="preserve">ZPK_PC_PEDIDOS</w:t>
+            </w:r>
+            <w:r>
+              <w:rPr>
+                <w:rFonts w:ascii="Arial" w:cs="Arial" w:eastAsia="Arial" w:hAnsi="Arial"/>
+                <w:sz w:val="17"/>
+                <w:szCs w:val="17"/>
+              </w:rPr>
+              <w:t xml:space="preserve"> (neste repositório, </w:t>
+            </w:r>
+            <w:r>
+              <w:rPr>
+                <w:rFonts w:ascii="Consolas" w:cs="Consolas" w:eastAsia="Consolas" w:hAnsi="Consolas"/>
+                <w:color w:val="00144A"/>
+                <w:sz w:val="17"/>
+                <w:szCs w:val="17"/>
+              </w:rPr>
+              <w:t xml:space="preserve">ZAVBS_PC_*</w:t>
+            </w:r>
+            <w:r>
+              <w:rPr>
+                <w:rFonts w:ascii="Arial" w:cs="Arial" w:eastAsia="Arial" w:hAnsi="Arial"/>
+                <w:sz w:val="17"/>
+                <w:szCs w:val="17"/>
+              </w:rPr>
+              <w:t xml:space="preserve">)</w:t>
             </w:r>
           </w:p>
         </w:tc>
@@ -7310,6 +7360,139 @@
       <w:pPr>
         <w:spacing w:after="80"/>
       </w:pPr>
+    </w:p>
+    <w:p>
+      <w:pPr>
+        <w:spacing w:after="120"/>
+        <w:jc w:val="left"/>
+      </w:pPr>
+      <w:r>
+        <w:rPr>
+          <w:rFonts w:ascii="Arial" w:cs="Arial" w:eastAsia="Arial" w:hAnsi="Arial"/>
+          <w:sz w:val="20"/>
+          <w:szCs w:val="20"/>
+        </w:rPr>
+        <w:t xml:space="preserve">O prefixo dos pacotes é livre. </w:t>
+      </w:r>
+      <w:r>
+        <w:rPr>
+          <w:rFonts w:ascii="Consolas" w:cs="Consolas" w:eastAsia="Consolas" w:hAnsi="Consolas"/>
+          <w:color w:val="00144A"/>
+          <w:sz w:val="20"/>
+          <w:szCs w:val="20"/>
+        </w:rPr>
+        <w:t xml:space="preserve">ZAVBS</w:t>
+      </w:r>
+      <w:r>
+        <w:rPr>
+          <w:rFonts w:ascii="Arial" w:cs="Arial" w:eastAsia="Arial" w:hAnsi="Arial"/>
+          <w:sz w:val="20"/>
+          <w:szCs w:val="20"/>
+        </w:rPr>
+        <w:t xml:space="preserve">, usado neste repositório, é uma escolha pessoal do autor (as iniciais do seu nome completo) e é opcional. Cada projeto define os próprios prefixos; como sugestão genérica, adota-se </w:t>
+      </w:r>
+      <w:r>
+        <w:rPr>
+          <w:rFonts w:ascii="Consolas" w:cs="Consolas" w:eastAsia="Consolas" w:hAnsi="Consolas"/>
+          <w:color w:val="00144A"/>
+          <w:sz w:val="20"/>
+          <w:szCs w:val="20"/>
+        </w:rPr>
+        <w:t xml:space="preserve">ZPK</w:t>
+      </w:r>
+      <w:r>
+        <w:rPr>
+          <w:rFonts w:ascii="Arial" w:cs="Arial" w:eastAsia="Arial" w:hAnsi="Arial"/>
+          <w:sz w:val="20"/>
+          <w:szCs w:val="20"/>
+        </w:rPr>
+        <w:t xml:space="preserve"> (</w:t>
+      </w:r>
+      <w:r>
+        <w:rPr>
+          <w:rFonts w:ascii="Consolas" w:cs="Consolas" w:eastAsia="Consolas" w:hAnsi="Consolas"/>
+          <w:color w:val="00144A"/>
+          <w:sz w:val="20"/>
+          <w:szCs w:val="20"/>
+        </w:rPr>
+        <w:t xml:space="preserve">ZPK_PEDIDOS_COMPRAS</w:t>
+      </w:r>
+      <w:r>
+        <w:rPr>
+          <w:rFonts w:ascii="Arial" w:cs="Arial" w:eastAsia="Arial" w:hAnsi="Arial"/>
+          <w:sz w:val="20"/>
+          <w:szCs w:val="20"/>
+        </w:rPr>
+        <w:t xml:space="preserve">, </w:t>
+      </w:r>
+      <w:r>
+        <w:rPr>
+          <w:rFonts w:ascii="Consolas" w:cs="Consolas" w:eastAsia="Consolas" w:hAnsi="Consolas"/>
+          <w:color w:val="00144A"/>
+          <w:sz w:val="20"/>
+          <w:szCs w:val="20"/>
+        </w:rPr>
+        <w:t xml:space="preserve">ZPK_PC_COMMON</w:t>
+      </w:r>
+      <w:r>
+        <w:rPr>
+          <w:rFonts w:ascii="Arial" w:cs="Arial" w:eastAsia="Arial" w:hAnsi="Arial"/>
+          <w:sz w:val="20"/>
+          <w:szCs w:val="20"/>
+        </w:rPr>
+        <w:t xml:space="preserve">, </w:t>
+      </w:r>
+      <w:r>
+        <w:rPr>
+          <w:rFonts w:ascii="Consolas" w:cs="Consolas" w:eastAsia="Consolas" w:hAnsi="Consolas"/>
+          <w:color w:val="00144A"/>
+          <w:sz w:val="20"/>
+          <w:szCs w:val="20"/>
+        </w:rPr>
+        <w:t xml:space="preserve">ZPK_PC_CLIENTES</w:t>
+      </w:r>
+      <w:r>
+        <w:rPr>
+          <w:rFonts w:ascii="Arial" w:cs="Arial" w:eastAsia="Arial" w:hAnsi="Arial"/>
+          <w:sz w:val="20"/>
+          <w:szCs w:val="20"/>
+        </w:rPr>
+        <w:t xml:space="preserve"> etc.). Os demais prefixos da tabela também podem ser trocados, desde que permaneçam no namespace do cliente (</w:t>
+      </w:r>
+      <w:r>
+        <w:rPr>
+          <w:rFonts w:ascii="Consolas" w:cs="Consolas" w:eastAsia="Consolas" w:hAnsi="Consolas"/>
+          <w:color w:val="00144A"/>
+          <w:sz w:val="20"/>
+          <w:szCs w:val="20"/>
+        </w:rPr>
+        <w:t xml:space="preserve">Z</w:t>
+      </w:r>
+      <w:r>
+        <w:rPr>
+          <w:rFonts w:ascii="Arial" w:cs="Arial" w:eastAsia="Arial" w:hAnsi="Arial"/>
+          <w:sz w:val="20"/>
+          <w:szCs w:val="20"/>
+        </w:rPr>
+        <w:t xml:space="preserve"> ou </w:t>
+      </w:r>
+      <w:r>
+        <w:rPr>
+          <w:rFonts w:ascii="Consolas" w:cs="Consolas" w:eastAsia="Consolas" w:hAnsi="Consolas"/>
+          <w:color w:val="00144A"/>
+          <w:sz w:val="20"/>
+          <w:szCs w:val="20"/>
+        </w:rPr>
+        <w:t xml:space="preserve">Y</w:t>
+      </w:r>
+      <w:r>
+        <w:rPr>
+          <w:rFonts w:ascii="Arial" w:cs="Arial" w:eastAsia="Arial" w:hAnsi="Arial"/>
+          <w:sz w:val="20"/>
+          <w:szCs w:val="20"/>
+        </w:rPr>
+        <w:t xml:space="preserve">), respeitem o tamanho máximo de cada tipo de objeto e sejam aplicados de forma consistente em todos os artefatos que os referenciam.</w:t>
+      </w:r>
     </w:p>
     <w:p>
       <w:pPr>
@@ -46560,6 +46743,190 @@
           <w:szCs w:val="20"/>
         </w:rPr>
         <w:t xml:space="preserve">Versão de linguagem: ABAP for Cloud Development no SAP BTP, ABAP environment; Standard ABAP no On-Premise, com camada de transporte. As aplicações de front-end (BSPs) ficam no pacote do domínio correspondente.</w:t>
+      </w:r>
+    </w:p>
+    <w:p>
+      <w:pPr>
+        <w:spacing w:after="120"/>
+        <w:jc w:val="left"/>
+      </w:pPr>
+      <w:r>
+        <w:rPr>
+          <w:rFonts w:ascii="Arial" w:cs="Arial" w:eastAsia="Arial" w:hAnsi="Arial"/>
+          <w:sz w:val="20"/>
+          <w:szCs w:val="20"/>
+        </w:rPr>
+        <w:t xml:space="preserve">Os nomes acima usam o prefixo </w:t>
+      </w:r>
+      <w:r>
+        <w:rPr>
+          <w:rFonts w:ascii="Consolas" w:cs="Consolas" w:eastAsia="Consolas" w:hAnsi="Consolas"/>
+          <w:color w:val="00144A"/>
+          <w:sz w:val="20"/>
+          <w:szCs w:val="20"/>
+        </w:rPr>
+        <w:t xml:space="preserve">ZAVBS</w:t>
+      </w:r>
+      <w:r>
+        <w:rPr>
+          <w:rFonts w:ascii="Arial" w:cs="Arial" w:eastAsia="Arial" w:hAnsi="Arial"/>
+          <w:sz w:val="20"/>
+          <w:szCs w:val="20"/>
+        </w:rPr>
+        <w:t xml:space="preserve"> deste repositório, que é opcional (seção 4). Em outro projeto, a mesma estrutura pode ser criada com o prefixo genérico sugerido: </w:t>
+      </w:r>
+      <w:r>
+        <w:rPr>
+          <w:rFonts w:ascii="Consolas" w:cs="Consolas" w:eastAsia="Consolas" w:hAnsi="Consolas"/>
+          <w:color w:val="00144A"/>
+          <w:sz w:val="20"/>
+          <w:szCs w:val="20"/>
+        </w:rPr>
+        <w:t xml:space="preserve">ZPK_PEDIDOS_COMPRAS</w:t>
+      </w:r>
+      <w:r>
+        <w:rPr>
+          <w:rFonts w:ascii="Arial" w:cs="Arial" w:eastAsia="Arial" w:hAnsi="Arial"/>
+          <w:sz w:val="20"/>
+          <w:szCs w:val="20"/>
+        </w:rPr>
+        <w:t xml:space="preserve">, </w:t>
+      </w:r>
+      <w:r>
+        <w:rPr>
+          <w:rFonts w:ascii="Consolas" w:cs="Consolas" w:eastAsia="Consolas" w:hAnsi="Consolas"/>
+          <w:color w:val="00144A"/>
+          <w:sz w:val="20"/>
+          <w:szCs w:val="20"/>
+        </w:rPr>
+        <w:t xml:space="preserve">ZPK_PC_COMMON</w:t>
+      </w:r>
+      <w:r>
+        <w:rPr>
+          <w:rFonts w:ascii="Arial" w:cs="Arial" w:eastAsia="Arial" w:hAnsi="Arial"/>
+          <w:sz w:val="20"/>
+          <w:szCs w:val="20"/>
+        </w:rPr>
+        <w:t xml:space="preserve">, </w:t>
+      </w:r>
+      <w:r>
+        <w:rPr>
+          <w:rFonts w:ascii="Consolas" w:cs="Consolas" w:eastAsia="Consolas" w:hAnsi="Consolas"/>
+          <w:color w:val="00144A"/>
+          <w:sz w:val="20"/>
+          <w:szCs w:val="20"/>
+        </w:rPr>
+        <w:t xml:space="preserve">ZPK_PC_CLIENTES</w:t>
+      </w:r>
+      <w:r>
+        <w:rPr>
+          <w:rFonts w:ascii="Arial" w:cs="Arial" w:eastAsia="Arial" w:hAnsi="Arial"/>
+          <w:sz w:val="20"/>
+          <w:szCs w:val="20"/>
+        </w:rPr>
+        <w:t xml:space="preserve">, </w:t>
+      </w:r>
+      <w:r>
+        <w:rPr>
+          <w:rFonts w:ascii="Consolas" w:cs="Consolas" w:eastAsia="Consolas" w:hAnsi="Consolas"/>
+          <w:color w:val="00144A"/>
+          <w:sz w:val="20"/>
+          <w:szCs w:val="20"/>
+        </w:rPr>
+        <w:t xml:space="preserve">ZPK_PC_ESTOQUE</w:t>
+      </w:r>
+      <w:r>
+        <w:rPr>
+          <w:rFonts w:ascii="Arial" w:cs="Arial" w:eastAsia="Arial" w:hAnsi="Arial"/>
+          <w:sz w:val="20"/>
+          <w:szCs w:val="20"/>
+        </w:rPr>
+        <w:t xml:space="preserve">, </w:t>
+      </w:r>
+      <w:r>
+        <w:rPr>
+          <w:rFonts w:ascii="Consolas" w:cs="Consolas" w:eastAsia="Consolas" w:hAnsi="Consolas"/>
+          <w:color w:val="00144A"/>
+          <w:sz w:val="20"/>
+          <w:szCs w:val="20"/>
+        </w:rPr>
+        <w:t xml:space="preserve">ZPK_PC_PEDIDOS</w:t>
+      </w:r>
+      <w:r>
+        <w:rPr>
+          <w:rFonts w:ascii="Arial" w:cs="Arial" w:eastAsia="Arial" w:hAnsi="Arial"/>
+          <w:sz w:val="20"/>
+          <w:szCs w:val="20"/>
+        </w:rPr>
+        <w:t xml:space="preserve"> (com </w:t>
+      </w:r>
+      <w:r>
+        <w:rPr>
+          <w:rFonts w:ascii="Consolas" w:cs="Consolas" w:eastAsia="Consolas" w:hAnsi="Consolas"/>
+          <w:color w:val="00144A"/>
+          <w:sz w:val="20"/>
+          <w:szCs w:val="20"/>
+        </w:rPr>
+        <w:t xml:space="preserve">ZPK_PC_PEDIDOS_PAGAMENTOS</w:t>
+      </w:r>
+      <w:r>
+        <w:rPr>
+          <w:rFonts w:ascii="Arial" w:cs="Arial" w:eastAsia="Arial" w:hAnsi="Arial"/>
+          <w:sz w:val="20"/>
+          <w:szCs w:val="20"/>
+        </w:rPr>
+        <w:t xml:space="preserve"> e </w:t>
+      </w:r>
+      <w:r>
+        <w:rPr>
+          <w:rFonts w:ascii="Consolas" w:cs="Consolas" w:eastAsia="Consolas" w:hAnsi="Consolas"/>
+          <w:color w:val="00144A"/>
+          <w:sz w:val="20"/>
+          <w:szCs w:val="20"/>
+        </w:rPr>
+        <w:t xml:space="preserve">ZPK_PC_PEDIDOS_SNAPSHOTS</w:t>
+      </w:r>
+      <w:r>
+        <w:rPr>
+          <w:rFonts w:ascii="Arial" w:cs="Arial" w:eastAsia="Arial" w:hAnsi="Arial"/>
+          <w:sz w:val="20"/>
+          <w:szCs w:val="20"/>
+        </w:rPr>
+        <w:t xml:space="preserve">) e </w:t>
+      </w:r>
+      <w:r>
+        <w:rPr>
+          <w:rFonts w:ascii="Consolas" w:cs="Consolas" w:eastAsia="Consolas" w:hAnsi="Consolas"/>
+          <w:color w:val="00144A"/>
+          <w:sz w:val="20"/>
+          <w:szCs w:val="20"/>
+        </w:rPr>
+        <w:t xml:space="preserve">ZPK_PC_REEMBOLSOS</w:t>
+      </w:r>
+      <w:r>
+        <w:rPr>
+          <w:rFonts w:ascii="Arial" w:cs="Arial" w:eastAsia="Arial" w:hAnsi="Arial"/>
+          <w:sz w:val="20"/>
+          <w:szCs w:val="20"/>
+        </w:rPr>
+        <w:t xml:space="preserve">. O código ABAP não referencia o nome dos pacotes; só o descritor de deploy de cada aplicação (</w:t>
+      </w:r>
+      <w:r>
+        <w:rPr>
+          <w:rFonts w:ascii="Consolas" w:cs="Consolas" w:eastAsia="Consolas" w:hAnsi="Consolas"/>
+          <w:color w:val="00144A"/>
+          <w:sz w:val="20"/>
+          <w:szCs w:val="20"/>
+        </w:rPr>
+        <w:t xml:space="preserve">ui5-deploy.yaml</w:t>
+      </w:r>
+      <w:r>
+        <w:rPr>
+          <w:rFonts w:ascii="Arial" w:cs="Arial" w:eastAsia="Arial" w:hAnsi="Arial"/>
+          <w:sz w:val="20"/>
+          <w:szCs w:val="20"/>
+        </w:rPr>
+        <w:t xml:space="preserve">) informa o pacote de destino da BSP.</w:t>
       </w:r>
     </w:p>
     <w:p>

</xml_diff>

<commit_message>
docs: ADT no VS Code como alternativa ao Eclipse
- abap/README.md: nova seção 1.3 com as duas IDEs (conexão HTTP no BTP,
  RFC no On-Premise a partir do S/4HANA 2025, comando de criação de
  objetos e cobertura dos objetos do projeto na extensão); linha "IDE"
  na comparação entre cenários; ferramentas da seção 4.1; nota na 8.1
  e no passo a passo do domínio ZPC_NR_NUMC10, que a extensão ainda
  não oferece; referências.
- README.md: ferramentas e pré-requisitos.
- Especificação técnica v3.2 (.md e .docx): linha "Ferramenta de
  desenvolvimento" em 3.1 e passo 6 da arquitetura On-Premise.
- Slides da etapa 01: card "Ferramentas" cita Eclipse ou VS Code.

Co-Authored-By: Claude Opus 5.5 <noreply@anthropic.com>
</commit_message>
<xml_diff>
--- a/docs/Pedidos_de_Compras_-_Especificacao_Tecnica.docx
+++ b/docs/Pedidos_de_Compras_-_Especificacao_Tecnica.docx
@@ -252,7 +252,7 @@
                 <w:sz w:val="17"/>
                 <w:szCs w:val="17"/>
               </w:rPr>
-              <w:t xml:space="preserve">3.1 (21/10/2026)</w:t>
+              <w:t xml:space="preserve">3.2 (21/10/2026)</w:t>
             </w:r>
           </w:p>
         </w:tc>
@@ -2150,6 +2150,101 @@
                 <w:szCs w:val="17"/>
               </w:rPr>
               <w:t xml:space="preserve">Igual nos dois ambientes</w:t>
+            </w:r>
+          </w:p>
+        </w:tc>
+      </w:tr>
+      <w:tr>
+        <w:trPr>
+          <w:cantSplit/>
+        </w:trPr>
+        <w:tc>
+          <w:tcPr>
+            <w:tcW w:type="dxa" w:w="2619"/>
+            <w:tcBorders>
+              <w:top w:val="single" w:color="C9D3DD" w:sz="4"/>
+              <w:left w:val="single" w:color="C9D3DD" w:sz="4"/>
+              <w:bottom w:val="single" w:color="C9D3DD" w:sz="4"/>
+              <w:right w:val="single" w:color="C9D3DD" w:sz="4"/>
+            </w:tcBorders>
+            <w:tcMar>
+              <w:top w:type="dxa" w:w="50"/>
+              <w:left w:type="dxa" w:w="80"/>
+              <w:bottom w:type="dxa" w:w="50"/>
+              <w:right w:type="dxa" w:w="80"/>
+            </w:tcMar>
+          </w:tcPr>
+          <w:p>
+            <w:pPr>
+              <w:spacing w:before="0" w:after="0"/>
+            </w:pPr>
+            <w:r>
+              <w:rPr>
+                <w:rFonts w:ascii="Arial" w:cs="Arial" w:eastAsia="Arial" w:hAnsi="Arial"/>
+                <w:sz w:val="17"/>
+                <w:szCs w:val="17"/>
+              </w:rPr>
+              <w:t xml:space="preserve">Ferramenta de desenvolvimento</w:t>
+            </w:r>
+          </w:p>
+        </w:tc>
+        <w:tc>
+          <w:tcPr>
+            <w:tcW w:type="dxa" w:w="3391"/>
+            <w:tcBorders>
+              <w:top w:val="single" w:color="C9D3DD" w:sz="4"/>
+              <w:left w:val="single" w:color="C9D3DD" w:sz="4"/>
+              <w:bottom w:val="single" w:color="C9D3DD" w:sz="4"/>
+              <w:right w:val="single" w:color="C9D3DD" w:sz="4"/>
+            </w:tcBorders>
+            <w:tcMar>
+              <w:top w:type="dxa" w:w="50"/>
+              <w:left w:type="dxa" w:w="80"/>
+              <w:bottom w:type="dxa" w:w="50"/>
+              <w:right w:type="dxa" w:w="80"/>
+            </w:tcMar>
+          </w:tcPr>
+          <w:p>
+            <w:pPr>
+              <w:spacing w:before="0" w:after="0"/>
+            </w:pPr>
+            <w:r>
+              <w:rPr>
+                <w:rFonts w:ascii="Arial" w:cs="Arial" w:eastAsia="Arial" w:hAnsi="Arial"/>
+                <w:sz w:val="17"/>
+                <w:szCs w:val="17"/>
+              </w:rPr>
+              <w:t xml:space="preserve">ADT no Eclipse ou no VS Code (extensão ABAP Development Tools, conexão HTTP)</w:t>
+            </w:r>
+          </w:p>
+        </w:tc>
+        <w:tc>
+          <w:tcPr>
+            <w:tcW w:type="dxa" w:w="3856"/>
+            <w:tcBorders>
+              <w:top w:val="single" w:color="C9D3DD" w:sz="4"/>
+              <w:left w:val="single" w:color="C9D3DD" w:sz="4"/>
+              <w:bottom w:val="single" w:color="C9D3DD" w:sz="4"/>
+              <w:right w:val="single" w:color="C9D3DD" w:sz="4"/>
+            </w:tcBorders>
+            <w:tcMar>
+              <w:top w:type="dxa" w:w="50"/>
+              <w:left w:type="dxa" w:w="80"/>
+              <w:bottom w:type="dxa" w:w="50"/>
+              <w:right w:type="dxa" w:w="80"/>
+            </w:tcMar>
+          </w:tcPr>
+          <w:p>
+            <w:pPr>
+              <w:spacing w:before="0" w:after="0"/>
+            </w:pPr>
+            <w:r>
+              <w:rPr>
+                <w:rFonts w:ascii="Arial" w:cs="Arial" w:eastAsia="Arial" w:hAnsi="Arial"/>
+                <w:sz w:val="17"/>
+                <w:szCs w:val="17"/>
+              </w:rPr>
+              <w:t xml:space="preserve">ADT no Eclipse ou no VS Code (conexão RFC, a partir do S/4HANA 2025) e SAP GUI</w:t>
             </w:r>
           </w:p>
         </w:tc>
@@ -4345,7 +4440,7 @@
           <w:sz w:val="20"/>
           <w:szCs w:val="20"/>
         </w:rPr>
-        <w:t xml:space="preserve">O desenvolvimento ocorre no ADT (e SAP GUI para Basis) em DEV, e tudo segue por transporte para QAS e PRD.</w:t>
+        <w:t xml:space="preserve">O desenvolvimento ocorre no ADT, no Eclipse ou no VS Code (e no SAP GUI para Basis), em DEV, e tudo segue por transporte para QAS e PRD.</w:t>
       </w:r>
     </w:p>
     <w:p>

</xml_diff>

<commit_message>
docs: mapa de cobertura dos testes ABAP Unit
- abap/README.md, seção 11.1: as 13 classes com testes (204 no total),
  por pacote e tipo; tabela das novas classes de teste locais e o que
  cobrem; test doubles sem COMMIT, mensagens conferidas pelo número
  T100, autorização fora do modo trial e o include da versão _T2.
- Especificação Técnica v3.3 (.md e .docx): seção 25 com a matriz de
  cobertura mínima por objeto e os requisitos dos testes de integração.
- README.md: v2.13 no histórico de versões.

Co-Authored-By: Claude Opus 5.5 <noreply@anthropic.com>
</commit_message>
<xml_diff>
--- a/docs/Pedidos_de_Compras_-_Especificacao_Tecnica.docx
+++ b/docs/Pedidos_de_Compras_-_Especificacao_Tecnica.docx
@@ -252,7 +252,7 @@
                 <w:sz w:val="17"/>
                 <w:szCs w:val="17"/>
               </w:rPr>
-              <w:t xml:space="preserve">3.2 (21/10/2026)</w:t>
+              <w:t xml:space="preserve">3.3 (22/10/2026)</w:t>
             </w:r>
           </w:p>
         </w:tc>
@@ -49240,7 +49240,7 @@
           <w:sz w:val="20"/>
           <w:szCs w:val="20"/>
         </w:rPr>
-        <w:t xml:space="preserve">Devem cobrir: validações de CPF, telefone, e-mail e imagem; status de estoque; registro do pedido com reserva; edição de itens com reserva incremental; pagamento aprovado e recusado; aprovação e cancelamento; reembolso aprovado e rejeitado; geração de SKU; persistência de endereços; pagamento simulado; leitura de planilhas e as três importações, inclusive a reimportação.</w:t>
+        <w:t xml:space="preserve">Toda classe com lógica e todo behavior pool devem ter a sua própria classe de teste local. Ficam de fora apenas as classes de carga e limpeza de dados de demonstração, que confirmam gravações e são executadas manualmente.</w:t>
       </w:r>
     </w:p>
     <w:p>
@@ -49258,7 +49258,1295 @@
           <w:sz w:val="20"/>
           <w:szCs w:val="20"/>
         </w:rPr>
-        <w:t xml:space="preserve">Os testes de integração devem semear os próprios dados e usar test doubles (</w:t>
+        <w:t xml:space="preserve">A cobertura mínima por objeto é a da matriz abaixo.</w:t>
+      </w:r>
+    </w:p>
+    <w:tbl>
+      <w:tblPr>
+        <w:tblW w:type="dxa" w:w="9866"/>
+        <w:tblBorders>
+          <w:top w:val="single" w:color="auto" w:sz="4"/>
+          <w:left w:val="single" w:color="auto" w:sz="4"/>
+          <w:bottom w:val="single" w:color="auto" w:sz="4"/>
+          <w:right w:val="single" w:color="auto" w:sz="4"/>
+          <w:insideH w:val="single" w:color="auto" w:sz="4"/>
+          <w:insideV w:val="single" w:color="auto" w:sz="4"/>
+        </w:tblBorders>
+      </w:tblPr>
+      <w:tblGrid>
+        <w:gridCol w:w="2120"/>
+        <w:gridCol w:w="3767"/>
+        <w:gridCol w:w="3979"/>
+      </w:tblGrid>
+      <w:tr>
+        <w:trPr>
+          <w:tblHeader/>
+        </w:trPr>
+        <w:tc>
+          <w:tcPr>
+            <w:tcW w:type="dxa" w:w="2120"/>
+            <w:tcBorders>
+              <w:top w:val="single" w:color="C9D3DD" w:sz="4"/>
+              <w:left w:val="single" w:color="C9D3DD" w:sz="4"/>
+              <w:bottom w:val="single" w:color="C9D3DD" w:sz="4"/>
+              <w:right w:val="single" w:color="C9D3DD" w:sz="4"/>
+            </w:tcBorders>
+            <w:shd w:fill="0A6ED1" w:color="auto" w:val="clear"/>
+            <w:tcMar>
+              <w:top w:type="dxa" w:w="50"/>
+              <w:left w:type="dxa" w:w="80"/>
+              <w:bottom w:type="dxa" w:w="50"/>
+              <w:right w:type="dxa" w:w="80"/>
+            </w:tcMar>
+          </w:tcPr>
+          <w:p>
+            <w:pPr>
+              <w:spacing w:before="0" w:after="0"/>
+            </w:pPr>
+            <w:r>
+              <w:rPr>
+                <w:rFonts w:ascii="Arial" w:cs="Arial" w:eastAsia="Arial" w:hAnsi="Arial"/>
+                <w:b/>
+                <w:bCs/>
+                <w:color w:val="FFFFFF"/>
+                <w:sz w:val="17"/>
+                <w:szCs w:val="17"/>
+              </w:rPr>
+              <w:t xml:space="preserve">Objeto</w:t>
+            </w:r>
+          </w:p>
+        </w:tc>
+        <w:tc>
+          <w:tcPr>
+            <w:tcW w:type="dxa" w:w="3767"/>
+            <w:tcBorders>
+              <w:top w:val="single" w:color="C9D3DD" w:sz="4"/>
+              <w:left w:val="single" w:color="C9D3DD" w:sz="4"/>
+              <w:bottom w:val="single" w:color="C9D3DD" w:sz="4"/>
+              <w:right w:val="single" w:color="C9D3DD" w:sz="4"/>
+            </w:tcBorders>
+            <w:shd w:fill="0A6ED1" w:color="auto" w:val="clear"/>
+            <w:tcMar>
+              <w:top w:type="dxa" w:w="50"/>
+              <w:left w:type="dxa" w:w="80"/>
+              <w:bottom w:type="dxa" w:w="50"/>
+              <w:right w:type="dxa" w:w="80"/>
+            </w:tcMar>
+          </w:tcPr>
+          <w:p>
+            <w:pPr>
+              <w:spacing w:before="0" w:after="0"/>
+            </w:pPr>
+            <w:r>
+              <w:rPr>
+                <w:rFonts w:ascii="Arial" w:cs="Arial" w:eastAsia="Arial" w:hAnsi="Arial"/>
+                <w:b/>
+                <w:bCs/>
+                <w:color w:val="FFFFFF"/>
+                <w:sz w:val="17"/>
+                <w:szCs w:val="17"/>
+              </w:rPr>
+              <w:t xml:space="preserve">Tipo de teste</w:t>
+            </w:r>
+          </w:p>
+        </w:tc>
+        <w:tc>
+          <w:tcPr>
+            <w:tcW w:type="dxa" w:w="3979"/>
+            <w:tcBorders>
+              <w:top w:val="single" w:color="C9D3DD" w:sz="4"/>
+              <w:left w:val="single" w:color="C9D3DD" w:sz="4"/>
+              <w:bottom w:val="single" w:color="C9D3DD" w:sz="4"/>
+              <w:right w:val="single" w:color="C9D3DD" w:sz="4"/>
+            </w:tcBorders>
+            <w:shd w:fill="0A6ED1" w:color="auto" w:val="clear"/>
+            <w:tcMar>
+              <w:top w:type="dxa" w:w="50"/>
+              <w:left w:type="dxa" w:w="80"/>
+              <w:bottom w:type="dxa" w:w="50"/>
+              <w:right w:type="dxa" w:w="80"/>
+            </w:tcMar>
+          </w:tcPr>
+          <w:p>
+            <w:pPr>
+              <w:spacing w:before="0" w:after="0"/>
+            </w:pPr>
+            <w:r>
+              <w:rPr>
+                <w:rFonts w:ascii="Arial" w:cs="Arial" w:eastAsia="Arial" w:hAnsi="Arial"/>
+                <w:b/>
+                <w:bCs/>
+                <w:color w:val="FFFFFF"/>
+                <w:sz w:val="17"/>
+                <w:szCs w:val="17"/>
+              </w:rPr>
+              <w:t xml:space="preserve">Deve cobrir</w:t>
+            </w:r>
+          </w:p>
+        </w:tc>
+      </w:tr>
+      <w:tr>
+        <w:trPr>
+          <w:cantSplit/>
+        </w:trPr>
+        <w:tc>
+          <w:tcPr>
+            <w:tcW w:type="dxa" w:w="2120"/>
+            <w:tcBorders>
+              <w:top w:val="single" w:color="C9D3DD" w:sz="4"/>
+              <w:left w:val="single" w:color="C9D3DD" w:sz="4"/>
+              <w:bottom w:val="single" w:color="C9D3DD" w:sz="4"/>
+              <w:right w:val="single" w:color="C9D3DD" w:sz="4"/>
+            </w:tcBorders>
+            <w:tcMar>
+              <w:top w:type="dxa" w:w="50"/>
+              <w:left w:type="dxa" w:w="80"/>
+              <w:bottom w:type="dxa" w:w="50"/>
+              <w:right w:type="dxa" w:w="80"/>
+            </w:tcMar>
+          </w:tcPr>
+          <w:p>
+            <w:pPr>
+              <w:spacing w:before="0" w:after="0"/>
+            </w:pPr>
+            <w:r>
+              <w:rPr>
+                <w:rFonts w:ascii="Arial" w:cs="Arial" w:eastAsia="Arial" w:hAnsi="Arial"/>
+                <w:sz w:val="17"/>
+                <w:szCs w:val="17"/>
+              </w:rPr>
+              <w:t xml:space="preserve">Utilitários</w:t>
+            </w:r>
+          </w:p>
+        </w:tc>
+        <w:tc>
+          <w:tcPr>
+            <w:tcW w:type="dxa" w:w="3767"/>
+            <w:tcBorders>
+              <w:top w:val="single" w:color="C9D3DD" w:sz="4"/>
+              <w:left w:val="single" w:color="C9D3DD" w:sz="4"/>
+              <w:bottom w:val="single" w:color="C9D3DD" w:sz="4"/>
+              <w:right w:val="single" w:color="C9D3DD" w:sz="4"/>
+            </w:tcBorders>
+            <w:tcMar>
+              <w:top w:type="dxa" w:w="50"/>
+              <w:left w:type="dxa" w:w="80"/>
+              <w:bottom w:type="dxa" w:w="50"/>
+              <w:right w:type="dxa" w:w="80"/>
+            </w:tcMar>
+          </w:tcPr>
+          <w:p>
+            <w:pPr>
+              <w:spacing w:before="0" w:after="0"/>
+            </w:pPr>
+            <w:r>
+              <w:rPr>
+                <w:rFonts w:ascii="Arial" w:cs="Arial" w:eastAsia="Arial" w:hAnsi="Arial"/>
+                <w:sz w:val="17"/>
+                <w:szCs w:val="17"/>
+              </w:rPr>
+              <w:t xml:space="preserve">Regra pura</w:t>
+            </w:r>
+          </w:p>
+        </w:tc>
+        <w:tc>
+          <w:tcPr>
+            <w:tcW w:type="dxa" w:w="3979"/>
+            <w:tcBorders>
+              <w:top w:val="single" w:color="C9D3DD" w:sz="4"/>
+              <w:left w:val="single" w:color="C9D3DD" w:sz="4"/>
+              <w:bottom w:val="single" w:color="C9D3DD" w:sz="4"/>
+              <w:right w:val="single" w:color="C9D3DD" w:sz="4"/>
+            </w:tcBorders>
+            <w:tcMar>
+              <w:top w:type="dxa" w:w="50"/>
+              <w:left w:type="dxa" w:w="80"/>
+              <w:bottom w:type="dxa" w:w="50"/>
+              <w:right w:type="dxa" w:w="80"/>
+            </w:tcMar>
+          </w:tcPr>
+          <w:p>
+            <w:pPr>
+              <w:spacing w:before="0" w:after="0"/>
+            </w:pPr>
+            <w:r>
+              <w:rPr>
+                <w:rFonts w:ascii="Arial" w:cs="Arial" w:eastAsia="Arial" w:hAnsi="Arial"/>
+                <w:sz w:val="17"/>
+                <w:szCs w:val="17"/>
+              </w:rPr>
+              <w:t xml:space="preserve">CPF, telefone, e-mail, imagem (MIME, extensão e assinatura), status de estoque e endereço formatado</w:t>
+            </w:r>
+          </w:p>
+        </w:tc>
+      </w:tr>
+      <w:tr>
+        <w:trPr>
+          <w:cantSplit/>
+        </w:trPr>
+        <w:tc>
+          <w:tcPr>
+            <w:tcW w:type="dxa" w:w="2120"/>
+            <w:tcBorders>
+              <w:top w:val="single" w:color="C9D3DD" w:sz="4"/>
+              <w:left w:val="single" w:color="C9D3DD" w:sz="4"/>
+              <w:bottom w:val="single" w:color="C9D3DD" w:sz="4"/>
+              <w:right w:val="single" w:color="C9D3DD" w:sz="4"/>
+            </w:tcBorders>
+            <w:tcMar>
+              <w:top w:type="dxa" w:w="50"/>
+              <w:left w:type="dxa" w:w="80"/>
+              <w:bottom w:type="dxa" w:w="50"/>
+              <w:right w:type="dxa" w:w="80"/>
+            </w:tcMar>
+          </w:tcPr>
+          <w:p>
+            <w:pPr>
+              <w:spacing w:before="0" w:after="0"/>
+            </w:pPr>
+            <w:r>
+              <w:rPr>
+                <w:rFonts w:ascii="Arial" w:cs="Arial" w:eastAsia="Arial" w:hAnsi="Arial"/>
+                <w:sz w:val="17"/>
+                <w:szCs w:val="17"/>
+              </w:rPr>
+              <w:t xml:space="preserve">Exceção de mensagens</w:t>
+            </w:r>
+          </w:p>
+        </w:tc>
+        <w:tc>
+          <w:tcPr>
+            <w:tcW w:type="dxa" w:w="3767"/>
+            <w:tcBorders>
+              <w:top w:val="single" w:color="C9D3DD" w:sz="4"/>
+              <w:left w:val="single" w:color="C9D3DD" w:sz="4"/>
+              <w:bottom w:val="single" w:color="C9D3DD" w:sz="4"/>
+              <w:right w:val="single" w:color="C9D3DD" w:sz="4"/>
+            </w:tcBorders>
+            <w:tcMar>
+              <w:top w:type="dxa" w:w="50"/>
+              <w:left w:type="dxa" w:w="80"/>
+              <w:bottom w:type="dxa" w:w="50"/>
+              <w:right w:type="dxa" w:w="80"/>
+            </w:tcMar>
+          </w:tcPr>
+          <w:p>
+            <w:pPr>
+              <w:spacing w:before="0" w:after="0"/>
+            </w:pPr>
+            <w:r>
+              <w:rPr>
+                <w:rFonts w:ascii="Arial" w:cs="Arial" w:eastAsia="Arial" w:hAnsi="Arial"/>
+                <w:sz w:val="17"/>
+                <w:szCs w:val="17"/>
+              </w:rPr>
+              <w:t xml:space="preserve">Regra pura</w:t>
+            </w:r>
+          </w:p>
+        </w:tc>
+        <w:tc>
+          <w:tcPr>
+            <w:tcW w:type="dxa" w:w="3979"/>
+            <w:tcBorders>
+              <w:top w:val="single" w:color="C9D3DD" w:sz="4"/>
+              <w:left w:val="single" w:color="C9D3DD" w:sz="4"/>
+              <w:bottom w:val="single" w:color="C9D3DD" w:sz="4"/>
+              <w:right w:val="single" w:color="C9D3DD" w:sz="4"/>
+            </w:tcBorders>
+            <w:tcMar>
+              <w:top w:type="dxa" w:w="50"/>
+              <w:left w:type="dxa" w:w="80"/>
+              <w:bottom w:type="dxa" w:w="50"/>
+              <w:right w:type="dxa" w:w="80"/>
+            </w:tcMar>
+          </w:tcPr>
+          <w:p>
+            <w:pPr>
+              <w:spacing w:before="0" w:after="0"/>
+            </w:pPr>
+            <w:r>
+              <w:rPr>
+                <w:rFonts w:ascii="Arial" w:cs="Arial" w:eastAsia="Arial" w:hAnsi="Arial"/>
+                <w:sz w:val="17"/>
+                <w:szCs w:val="17"/>
+              </w:rPr>
+              <w:t xml:space="preserve">Chave da mensagem, severidade padrão e informada, mensagem de sucesso e texto livre em blocos</w:t>
+            </w:r>
+          </w:p>
+        </w:tc>
+      </w:tr>
+      <w:tr>
+        <w:trPr>
+          <w:cantSplit/>
+        </w:trPr>
+        <w:tc>
+          <w:tcPr>
+            <w:tcW w:type="dxa" w:w="2120"/>
+            <w:tcBorders>
+              <w:top w:val="single" w:color="C9D3DD" w:sz="4"/>
+              <w:left w:val="single" w:color="C9D3DD" w:sz="4"/>
+              <w:bottom w:val="single" w:color="C9D3DD" w:sz="4"/>
+              <w:right w:val="single" w:color="C9D3DD" w:sz="4"/>
+            </w:tcBorders>
+            <w:tcMar>
+              <w:top w:type="dxa" w:w="50"/>
+              <w:left w:type="dxa" w:w="80"/>
+              <w:bottom w:type="dxa" w:w="50"/>
+              <w:right w:type="dxa" w:w="80"/>
+            </w:tcMar>
+          </w:tcPr>
+          <w:p>
+            <w:pPr>
+              <w:spacing w:before="0" w:after="0"/>
+            </w:pPr>
+            <w:r>
+              <w:rPr>
+                <w:rFonts w:ascii="Arial" w:cs="Arial" w:eastAsia="Arial" w:hAnsi="Arial"/>
+                <w:sz w:val="17"/>
+                <w:szCs w:val="17"/>
+              </w:rPr>
+              <w:t xml:space="preserve">Numeração</w:t>
+            </w:r>
+          </w:p>
+        </w:tc>
+        <w:tc>
+          <w:tcPr>
+            <w:tcW w:type="dxa" w:w="3767"/>
+            <w:tcBorders>
+              <w:top w:val="single" w:color="C9D3DD" w:sz="4"/>
+              <w:left w:val="single" w:color="C9D3DD" w:sz="4"/>
+              <w:bottom w:val="single" w:color="C9D3DD" w:sz="4"/>
+              <w:right w:val="single" w:color="C9D3DD" w:sz="4"/>
+            </w:tcBorders>
+            <w:tcMar>
+              <w:top w:type="dxa" w:w="50"/>
+              <w:left w:type="dxa" w:w="80"/>
+              <w:bottom w:type="dxa" w:w="50"/>
+              <w:right w:type="dxa" w:w="80"/>
+            </w:tcMar>
+          </w:tcPr>
+          <w:p>
+            <w:pPr>
+              <w:spacing w:before="0" w:after="0"/>
+            </w:pPr>
+            <w:r>
+              <w:rPr>
+                <w:rFonts w:ascii="Arial" w:cs="Arial" w:eastAsia="Arial" w:hAnsi="Arial"/>
+                <w:sz w:val="17"/>
+                <w:szCs w:val="17"/>
+              </w:rPr>
+              <w:t xml:space="preserve">Regra pura e objeto de numeração</w:t>
+            </w:r>
+          </w:p>
+        </w:tc>
+        <w:tc>
+          <w:tcPr>
+            <w:tcW w:type="dxa" w:w="3979"/>
+            <w:tcBorders>
+              <w:top w:val="single" w:color="C9D3DD" w:sz="4"/>
+              <w:left w:val="single" w:color="C9D3DD" w:sz="4"/>
+              <w:bottom w:val="single" w:color="C9D3DD" w:sz="4"/>
+              <w:right w:val="single" w:color="C9D3DD" w:sz="4"/>
+            </w:tcBorders>
+            <w:tcMar>
+              <w:top w:type="dxa" w:w="50"/>
+              <w:left w:type="dxa" w:w="80"/>
+              <w:bottom w:type="dxa" w:w="50"/>
+              <w:right w:type="dxa" w:w="80"/>
+            </w:tcMar>
+          </w:tcPr>
+          <w:p>
+            <w:pPr>
+              <w:spacing w:before="0" w:after="0"/>
+            </w:pPr>
+            <w:r>
+              <w:rPr>
+                <w:rFonts w:ascii="Arial" w:cs="Arial" w:eastAsia="Arial" w:hAnsi="Arial"/>
+                <w:sz w:val="17"/>
+                <w:szCs w:val="17"/>
+              </w:rPr>
+              <w:t xml:space="preserve">Prefixo do SKU, número do pedido com 10 dígitos e crescente, SKU único</w:t>
+            </w:r>
+          </w:p>
+        </w:tc>
+      </w:tr>
+      <w:tr>
+        <w:trPr>
+          <w:cantSplit/>
+        </w:trPr>
+        <w:tc>
+          <w:tcPr>
+            <w:tcW w:type="dxa" w:w="2120"/>
+            <w:tcBorders>
+              <w:top w:val="single" w:color="C9D3DD" w:sz="4"/>
+              <w:left w:val="single" w:color="C9D3DD" w:sz="4"/>
+              <w:bottom w:val="single" w:color="C9D3DD" w:sz="4"/>
+              <w:right w:val="single" w:color="C9D3DD" w:sz="4"/>
+            </w:tcBorders>
+            <w:tcMar>
+              <w:top w:type="dxa" w:w="50"/>
+              <w:left w:type="dxa" w:w="80"/>
+              <w:bottom w:type="dxa" w:w="50"/>
+              <w:right w:type="dxa" w:w="80"/>
+            </w:tcMar>
+          </w:tcPr>
+          <w:p>
+            <w:pPr>
+              <w:spacing w:before="0" w:after="0"/>
+            </w:pPr>
+            <w:r>
+              <w:rPr>
+                <w:rFonts w:ascii="Arial" w:cs="Arial" w:eastAsia="Arial" w:hAnsi="Arial"/>
+                <w:sz w:val="17"/>
+                <w:szCs w:val="17"/>
+              </w:rPr>
+              <w:t xml:space="preserve">Verificação de perfil</w:t>
+            </w:r>
+          </w:p>
+        </w:tc>
+        <w:tc>
+          <w:tcPr>
+            <w:tcW w:type="dxa" w:w="3767"/>
+            <w:tcBorders>
+              <w:top w:val="single" w:color="C9D3DD" w:sz="4"/>
+              <w:left w:val="single" w:color="C9D3DD" w:sz="4"/>
+              <w:bottom w:val="single" w:color="C9D3DD" w:sz="4"/>
+              <w:right w:val="single" w:color="C9D3DD" w:sz="4"/>
+            </w:tcBorders>
+            <w:tcMar>
+              <w:top w:type="dxa" w:w="50"/>
+              <w:left w:type="dxa" w:w="80"/>
+              <w:bottom w:type="dxa" w:w="50"/>
+              <w:right w:type="dxa" w:w="80"/>
+            </w:tcMar>
+          </w:tcPr>
+          <w:p>
+            <w:pPr>
+              <w:spacing w:before="0" w:after="0"/>
+            </w:pPr>
+            <w:r>
+              <w:rPr>
+                <w:rFonts w:ascii="Arial" w:cs="Arial" w:eastAsia="Arial" w:hAnsi="Arial"/>
+                <w:sz w:val="17"/>
+                <w:szCs w:val="17"/>
+              </w:rPr>
+              <w:t xml:space="preserve">Autorização simulada</w:t>
+            </w:r>
+          </w:p>
+        </w:tc>
+        <w:tc>
+          <w:tcPr>
+            <w:tcW w:type="dxa" w:w="3979"/>
+            <w:tcBorders>
+              <w:top w:val="single" w:color="C9D3DD" w:sz="4"/>
+              <w:left w:val="single" w:color="C9D3DD" w:sz="4"/>
+              <w:bottom w:val="single" w:color="C9D3DD" w:sz="4"/>
+              <w:right w:val="single" w:color="C9D3DD" w:sz="4"/>
+            </w:tcBorders>
+            <w:tcMar>
+              <w:top w:type="dxa" w:w="50"/>
+              <w:left w:type="dxa" w:w="80"/>
+              <w:bottom w:type="dxa" w:w="50"/>
+              <w:right w:type="dxa" w:w="80"/>
+            </w:tcMar>
+          </w:tcPr>
+          <w:p>
+            <w:pPr>
+              <w:spacing w:before="0" w:after="0"/>
+            </w:pPr>
+            <w:r>
+              <w:rPr>
+                <w:rFonts w:ascii="Arial" w:cs="Arial" w:eastAsia="Arial" w:hAnsi="Arial"/>
+                <w:sz w:val="17"/>
+                <w:szCs w:val="17"/>
+              </w:rPr>
+              <w:t xml:space="preserve">Modo de demonstração liberado; fora dele, cada atividade só com a sua autorização</w:t>
+            </w:r>
+          </w:p>
+        </w:tc>
+      </w:tr>
+      <w:tr>
+        <w:trPr>
+          <w:cantSplit/>
+        </w:trPr>
+        <w:tc>
+          <w:tcPr>
+            <w:tcW w:type="dxa" w:w="2120"/>
+            <w:tcBorders>
+              <w:top w:val="single" w:color="C9D3DD" w:sz="4"/>
+              <w:left w:val="single" w:color="C9D3DD" w:sz="4"/>
+              <w:bottom w:val="single" w:color="C9D3DD" w:sz="4"/>
+              <w:right w:val="single" w:color="C9D3DD" w:sz="4"/>
+            </w:tcBorders>
+            <w:tcMar>
+              <w:top w:type="dxa" w:w="50"/>
+              <w:left w:type="dxa" w:w="80"/>
+              <w:bottom w:type="dxa" w:w="50"/>
+              <w:right w:type="dxa" w:w="80"/>
+            </w:tcMar>
+          </w:tcPr>
+          <w:p>
+            <w:pPr>
+              <w:spacing w:before="0" w:after="0"/>
+            </w:pPr>
+            <w:r>
+              <w:rPr>
+                <w:rFonts w:ascii="Arial" w:cs="Arial" w:eastAsia="Arial" w:hAnsi="Arial"/>
+                <w:sz w:val="17"/>
+                <w:szCs w:val="17"/>
+              </w:rPr>
+              <w:t xml:space="preserve">Consulta de CEP</w:t>
+            </w:r>
+          </w:p>
+        </w:tc>
+        <w:tc>
+          <w:tcPr>
+            <w:tcW w:type="dxa" w:w="3767"/>
+            <w:tcBorders>
+              <w:top w:val="single" w:color="C9D3DD" w:sz="4"/>
+              <w:left w:val="single" w:color="C9D3DD" w:sz="4"/>
+              <w:bottom w:val="single" w:color="C9D3DD" w:sz="4"/>
+              <w:right w:val="single" w:color="C9D3DD" w:sz="4"/>
+            </w:tcBorders>
+            <w:tcMar>
+              <w:top w:type="dxa" w:w="50"/>
+              <w:left w:type="dxa" w:w="80"/>
+              <w:bottom w:type="dxa" w:w="50"/>
+              <w:right w:type="dxa" w:w="80"/>
+            </w:tcMar>
+          </w:tcPr>
+          <w:p>
+            <w:pPr>
+              <w:spacing w:before="0" w:after="0"/>
+            </w:pPr>
+            <w:r>
+              <w:rPr>
+                <w:rFonts w:ascii="Arial" w:cs="Arial" w:eastAsia="Arial" w:hAnsi="Arial"/>
+                <w:sz w:val="17"/>
+                <w:szCs w:val="17"/>
+              </w:rPr>
+              <w:t xml:space="preserve">Regra pura, sem chamada externa</w:t>
+            </w:r>
+          </w:p>
+        </w:tc>
+        <w:tc>
+          <w:tcPr>
+            <w:tcW w:type="dxa" w:w="3979"/>
+            <w:tcBorders>
+              <w:top w:val="single" w:color="C9D3DD" w:sz="4"/>
+              <w:left w:val="single" w:color="C9D3DD" w:sz="4"/>
+              <w:bottom w:val="single" w:color="C9D3DD" w:sz="4"/>
+              <w:right w:val="single" w:color="C9D3DD" w:sz="4"/>
+            </w:tcBorders>
+            <w:tcMar>
+              <w:top w:type="dxa" w:w="50"/>
+              <w:left w:type="dxa" w:w="80"/>
+              <w:bottom w:type="dxa" w:w="50"/>
+              <w:right w:type="dxa" w:w="80"/>
+            </w:tcMar>
+          </w:tcPr>
+          <w:p>
+            <w:pPr>
+              <w:spacing w:before="0" w:after="0"/>
+            </w:pPr>
+            <w:r>
+              <w:rPr>
+                <w:rFonts w:ascii="Arial" w:cs="Arial" w:eastAsia="Arial" w:hAnsi="Arial"/>
+                <w:sz w:val="17"/>
+                <w:szCs w:val="17"/>
+              </w:rPr>
+              <w:t xml:space="preserve">Leitura da resposta, CEP fora do formato sem consulta e cache da sessão, nos dois ambientes</w:t>
+            </w:r>
+          </w:p>
+        </w:tc>
+      </w:tr>
+      <w:tr>
+        <w:trPr>
+          <w:cantSplit/>
+        </w:trPr>
+        <w:tc>
+          <w:tcPr>
+            <w:tcW w:type="dxa" w:w="2120"/>
+            <w:tcBorders>
+              <w:top w:val="single" w:color="C9D3DD" w:sz="4"/>
+              <w:left w:val="single" w:color="C9D3DD" w:sz="4"/>
+              <w:bottom w:val="single" w:color="C9D3DD" w:sz="4"/>
+              <w:right w:val="single" w:color="C9D3DD" w:sz="4"/>
+            </w:tcBorders>
+            <w:tcMar>
+              <w:top w:type="dxa" w:w="50"/>
+              <w:left w:type="dxa" w:w="80"/>
+              <w:bottom w:type="dxa" w:w="50"/>
+              <w:right w:type="dxa" w:w="80"/>
+            </w:tcMar>
+          </w:tcPr>
+          <w:p>
+            <w:pPr>
+              <w:spacing w:before="0" w:after="0"/>
+            </w:pPr>
+            <w:r>
+              <w:rPr>
+                <w:rFonts w:ascii="Arial" w:cs="Arial" w:eastAsia="Arial" w:hAnsi="Arial"/>
+                <w:sz w:val="17"/>
+                <w:szCs w:val="17"/>
+              </w:rPr>
+              <w:t xml:space="preserve">Virtual elements do cliente</w:t>
+            </w:r>
+          </w:p>
+        </w:tc>
+        <w:tc>
+          <w:tcPr>
+            <w:tcW w:type="dxa" w:w="3767"/>
+            <w:tcBorders>
+              <w:top w:val="single" w:color="C9D3DD" w:sz="4"/>
+              <w:left w:val="single" w:color="C9D3DD" w:sz="4"/>
+              <w:bottom w:val="single" w:color="C9D3DD" w:sz="4"/>
+              <w:right w:val="single" w:color="C9D3DD" w:sz="4"/>
+            </w:tcBorders>
+            <w:tcMar>
+              <w:top w:type="dxa" w:w="50"/>
+              <w:left w:type="dxa" w:w="80"/>
+              <w:bottom w:type="dxa" w:w="50"/>
+              <w:right w:type="dxa" w:w="80"/>
+            </w:tcMar>
+          </w:tcPr>
+          <w:p>
+            <w:pPr>
+              <w:spacing w:before="0" w:after="0"/>
+            </w:pPr>
+            <w:r>
+              <w:rPr>
+                <w:rFonts w:ascii="Arial" w:cs="Arial" w:eastAsia="Arial" w:hAnsi="Arial"/>
+                <w:sz w:val="17"/>
+                <w:szCs w:val="17"/>
+              </w:rPr>
+              <w:t xml:space="preserve">Regra pura</w:t>
+            </w:r>
+          </w:p>
+        </w:tc>
+        <w:tc>
+          <w:tcPr>
+            <w:tcW w:type="dxa" w:w="3979"/>
+            <w:tcBorders>
+              <w:top w:val="single" w:color="C9D3DD" w:sz="4"/>
+              <w:left w:val="single" w:color="C9D3DD" w:sz="4"/>
+              <w:bottom w:val="single" w:color="C9D3DD" w:sz="4"/>
+              <w:right w:val="single" w:color="C9D3DD" w:sz="4"/>
+            </w:tcBorders>
+            <w:tcMar>
+              <w:top w:type="dxa" w:w="50"/>
+              <w:left w:type="dxa" w:w="80"/>
+              <w:bottom w:type="dxa" w:w="50"/>
+              <w:right w:type="dxa" w:w="80"/>
+            </w:tcMar>
+          </w:tcPr>
+          <w:p>
+            <w:pPr>
+              <w:spacing w:before="0" w:after="0"/>
+            </w:pPr>
+            <w:r>
+              <w:rPr>
+                <w:rFonts w:ascii="Arial" w:cs="Arial" w:eastAsia="Arial" w:hAnsi="Arial"/>
+                <w:sz w:val="17"/>
+                <w:szCs w:val="17"/>
+              </w:rPr>
+              <w:t xml:space="preserve">CPF e telefone formatados e faixas de cor do score</w:t>
+            </w:r>
+          </w:p>
+        </w:tc>
+      </w:tr>
+      <w:tr>
+        <w:trPr>
+          <w:cantSplit/>
+        </w:trPr>
+        <w:tc>
+          <w:tcPr>
+            <w:tcW w:type="dxa" w:w="2120"/>
+            <w:tcBorders>
+              <w:top w:val="single" w:color="C9D3DD" w:sz="4"/>
+              <w:left w:val="single" w:color="C9D3DD" w:sz="4"/>
+              <w:bottom w:val="single" w:color="C9D3DD" w:sz="4"/>
+              <w:right w:val="single" w:color="C9D3DD" w:sz="4"/>
+            </w:tcBorders>
+            <w:tcMar>
+              <w:top w:type="dxa" w:w="50"/>
+              <w:left w:type="dxa" w:w="80"/>
+              <w:bottom w:type="dxa" w:w="50"/>
+              <w:right w:type="dxa" w:w="80"/>
+            </w:tcMar>
+          </w:tcPr>
+          <w:p>
+            <w:pPr>
+              <w:spacing w:before="0" w:after="0"/>
+            </w:pPr>
+            <w:r>
+              <w:rPr>
+                <w:rFonts w:ascii="Arial" w:cs="Arial" w:eastAsia="Arial" w:hAnsi="Arial"/>
+                <w:sz w:val="17"/>
+                <w:szCs w:val="17"/>
+              </w:rPr>
+              <w:t xml:space="preserve">Pagamento simulado</w:t>
+            </w:r>
+          </w:p>
+        </w:tc>
+        <w:tc>
+          <w:tcPr>
+            <w:tcW w:type="dxa" w:w="3767"/>
+            <w:tcBorders>
+              <w:top w:val="single" w:color="C9D3DD" w:sz="4"/>
+              <w:left w:val="single" w:color="C9D3DD" w:sz="4"/>
+              <w:bottom w:val="single" w:color="C9D3DD" w:sz="4"/>
+              <w:right w:val="single" w:color="C9D3DD" w:sz="4"/>
+            </w:tcBorders>
+            <w:tcMar>
+              <w:top w:type="dxa" w:w="50"/>
+              <w:left w:type="dxa" w:w="80"/>
+              <w:bottom w:type="dxa" w:w="50"/>
+              <w:right w:type="dxa" w:w="80"/>
+            </w:tcMar>
+          </w:tcPr>
+          <w:p>
+            <w:pPr>
+              <w:spacing w:before="0" w:after="0"/>
+            </w:pPr>
+            <w:r>
+              <w:rPr>
+                <w:rFonts w:ascii="Arial" w:cs="Arial" w:eastAsia="Arial" w:hAnsi="Arial"/>
+                <w:sz w:val="17"/>
+                <w:szCs w:val="17"/>
+              </w:rPr>
+              <w:t xml:space="preserve">Regra pura</w:t>
+            </w:r>
+          </w:p>
+        </w:tc>
+        <w:tc>
+          <w:tcPr>
+            <w:tcW w:type="dxa" w:w="3979"/>
+            <w:tcBorders>
+              <w:top w:val="single" w:color="C9D3DD" w:sz="4"/>
+              <w:left w:val="single" w:color="C9D3DD" w:sz="4"/>
+              <w:bottom w:val="single" w:color="C9D3DD" w:sz="4"/>
+              <w:right w:val="single" w:color="C9D3DD" w:sz="4"/>
+            </w:tcBorders>
+            <w:tcMar>
+              <w:top w:type="dxa" w:w="50"/>
+              <w:left w:type="dxa" w:w="80"/>
+              <w:bottom w:type="dxa" w:w="50"/>
+              <w:right w:type="dxa" w:w="80"/>
+            </w:tcMar>
+          </w:tcPr>
+          <w:p>
+            <w:pPr>
+              <w:spacing w:before="0" w:after="0"/>
+            </w:pPr>
+            <w:r>
+              <w:rPr>
+                <w:rFonts w:ascii="Arial" w:cs="Arial" w:eastAsia="Arial" w:hAnsi="Arial"/>
+                <w:sz w:val="17"/>
+                <w:szCs w:val="17"/>
+              </w:rPr>
+              <w:t xml:space="preserve">Bandeira, máscara, aprovação, recusa e dados inválidos</w:t>
+            </w:r>
+          </w:p>
+        </w:tc>
+      </w:tr>
+      <w:tr>
+        <w:trPr>
+          <w:cantSplit/>
+        </w:trPr>
+        <w:tc>
+          <w:tcPr>
+            <w:tcW w:type="dxa" w:w="2120"/>
+            <w:tcBorders>
+              <w:top w:val="single" w:color="C9D3DD" w:sz="4"/>
+              <w:left w:val="single" w:color="C9D3DD" w:sz="4"/>
+              <w:bottom w:val="single" w:color="C9D3DD" w:sz="4"/>
+              <w:right w:val="single" w:color="C9D3DD" w:sz="4"/>
+            </w:tcBorders>
+            <w:tcMar>
+              <w:top w:type="dxa" w:w="50"/>
+              <w:left w:type="dxa" w:w="80"/>
+              <w:bottom w:type="dxa" w:w="50"/>
+              <w:right w:type="dxa" w:w="80"/>
+            </w:tcMar>
+          </w:tcPr>
+          <w:p>
+            <w:pPr>
+              <w:spacing w:before="0" w:after="0"/>
+            </w:pPr>
+            <w:r>
+              <w:rPr>
+                <w:rFonts w:ascii="Arial" w:cs="Arial" w:eastAsia="Arial" w:hAnsi="Arial"/>
+                <w:sz w:val="17"/>
+                <w:szCs w:val="17"/>
+              </w:rPr>
+              <w:t xml:space="preserve">Leitura de planilhas e importações</w:t>
+            </w:r>
+          </w:p>
+        </w:tc>
+        <w:tc>
+          <w:tcPr>
+            <w:tcW w:type="dxa" w:w="3767"/>
+            <w:tcBorders>
+              <w:top w:val="single" w:color="C9D3DD" w:sz="4"/>
+              <w:left w:val="single" w:color="C9D3DD" w:sz="4"/>
+              <w:bottom w:val="single" w:color="C9D3DD" w:sz="4"/>
+              <w:right w:val="single" w:color="C9D3DD" w:sz="4"/>
+            </w:tcBorders>
+            <w:tcMar>
+              <w:top w:type="dxa" w:w="50"/>
+              <w:left w:type="dxa" w:w="80"/>
+              <w:bottom w:type="dxa" w:w="50"/>
+              <w:right w:type="dxa" w:w="80"/>
+            </w:tcMar>
+          </w:tcPr>
+          <w:p>
+            <w:pPr>
+              <w:spacing w:before="0" w:after="0"/>
+            </w:pPr>
+            <w:r>
+              <w:rPr>
+                <w:rFonts w:ascii="Arial" w:cs="Arial" w:eastAsia="Arial" w:hAnsi="Arial"/>
+                <w:sz w:val="17"/>
+                <w:szCs w:val="17"/>
+              </w:rPr>
+              <w:t xml:space="preserve">Integração</w:t>
+            </w:r>
+          </w:p>
+        </w:tc>
+        <w:tc>
+          <w:tcPr>
+            <w:tcW w:type="dxa" w:w="3979"/>
+            <w:tcBorders>
+              <w:top w:val="single" w:color="C9D3DD" w:sz="4"/>
+              <w:left w:val="single" w:color="C9D3DD" w:sz="4"/>
+              <w:bottom w:val="single" w:color="C9D3DD" w:sz="4"/>
+              <w:right w:val="single" w:color="C9D3DD" w:sz="4"/>
+            </w:tcBorders>
+            <w:tcMar>
+              <w:top w:type="dxa" w:w="50"/>
+              <w:left w:type="dxa" w:w="80"/>
+              <w:bottom w:type="dxa" w:w="50"/>
+              <w:right w:type="dxa" w:w="80"/>
+            </w:tcMar>
+          </w:tcPr>
+          <w:p>
+            <w:pPr>
+              <w:spacing w:before="0" w:after="0"/>
+            </w:pPr>
+            <w:r>
+              <w:rPr>
+                <w:rFonts w:ascii="Arial" w:cs="Arial" w:eastAsia="Arial" w:hAnsi="Arial"/>
+                <w:sz w:val="17"/>
+                <w:szCs w:val="17"/>
+              </w:rPr>
+              <w:t xml:space="preserve">Formatos XLSX e CSV, as três importações e a reimportação recusada</w:t>
+            </w:r>
+          </w:p>
+        </w:tc>
+      </w:tr>
+      <w:tr>
+        <w:trPr>
+          <w:cantSplit/>
+        </w:trPr>
+        <w:tc>
+          <w:tcPr>
+            <w:tcW w:type="dxa" w:w="2120"/>
+            <w:tcBorders>
+              <w:top w:val="single" w:color="C9D3DD" w:sz="4"/>
+              <w:left w:val="single" w:color="C9D3DD" w:sz="4"/>
+              <w:bottom w:val="single" w:color="C9D3DD" w:sz="4"/>
+              <w:right w:val="single" w:color="C9D3DD" w:sz="4"/>
+            </w:tcBorders>
+            <w:tcMar>
+              <w:top w:type="dxa" w:w="50"/>
+              <w:left w:type="dxa" w:w="80"/>
+              <w:bottom w:type="dxa" w:w="50"/>
+              <w:right w:type="dxa" w:w="80"/>
+            </w:tcMar>
+          </w:tcPr>
+          <w:p>
+            <w:pPr>
+              <w:spacing w:before="0" w:after="0"/>
+            </w:pPr>
+            <w:r>
+              <w:rPr>
+                <w:rFonts w:ascii="Arial" w:cs="Arial" w:eastAsia="Arial" w:hAnsi="Arial"/>
+                <w:sz w:val="17"/>
+                <w:szCs w:val="17"/>
+              </w:rPr>
+              <w:t xml:space="preserve">BO Cliente</w:t>
+            </w:r>
+          </w:p>
+        </w:tc>
+        <w:tc>
+          <w:tcPr>
+            <w:tcW w:type="dxa" w:w="3767"/>
+            <w:tcBorders>
+              <w:top w:val="single" w:color="C9D3DD" w:sz="4"/>
+              <w:left w:val="single" w:color="C9D3DD" w:sz="4"/>
+              <w:bottom w:val="single" w:color="C9D3DD" w:sz="4"/>
+              <w:right w:val="single" w:color="C9D3DD" w:sz="4"/>
+            </w:tcBorders>
+            <w:tcMar>
+              <w:top w:type="dxa" w:w="50"/>
+              <w:left w:type="dxa" w:w="80"/>
+              <w:bottom w:type="dxa" w:w="50"/>
+              <w:right w:type="dxa" w:w="80"/>
+            </w:tcMar>
+          </w:tcPr>
+          <w:p>
+            <w:pPr>
+              <w:spacing w:before="0" w:after="0"/>
+            </w:pPr>
+            <w:r>
+              <w:rPr>
+                <w:rFonts w:ascii="Arial" w:cs="Arial" w:eastAsia="Arial" w:hAnsi="Arial"/>
+                <w:sz w:val="17"/>
+                <w:szCs w:val="17"/>
+              </w:rPr>
+              <w:t xml:space="preserve">Integração com test doubles</w:t>
+            </w:r>
+          </w:p>
+        </w:tc>
+        <w:tc>
+          <w:tcPr>
+            <w:tcW w:type="dxa" w:w="3979"/>
+            <w:tcBorders>
+              <w:top w:val="single" w:color="C9D3DD" w:sz="4"/>
+              <w:left w:val="single" w:color="C9D3DD" w:sz="4"/>
+              <w:bottom w:val="single" w:color="C9D3DD" w:sz="4"/>
+              <w:right w:val="single" w:color="C9D3DD" w:sz="4"/>
+            </w:tcBorders>
+            <w:tcMar>
+              <w:top w:type="dxa" w:w="50"/>
+              <w:left w:type="dxa" w:w="80"/>
+              <w:bottom w:type="dxa" w:w="50"/>
+              <w:right w:type="dxa" w:w="80"/>
+            </w:tcMar>
+          </w:tcPr>
+          <w:p>
+            <w:pPr>
+              <w:spacing w:before="0" w:after="0"/>
+            </w:pPr>
+            <w:r>
+              <w:rPr>
+                <w:rFonts w:ascii="Arial" w:cs="Arial" w:eastAsia="Arial" w:hAnsi="Arial"/>
+                <w:sz w:val="17"/>
+                <w:szCs w:val="17"/>
+              </w:rPr>
+              <w:t xml:space="preserve">Validações do Save, normalização, preenchimento pelo CEP, endereço principal, CEP único e exclusão bloqueada</w:t>
+            </w:r>
+          </w:p>
+        </w:tc>
+      </w:tr>
+      <w:tr>
+        <w:trPr>
+          <w:cantSplit/>
+        </w:trPr>
+        <w:tc>
+          <w:tcPr>
+            <w:tcW w:type="dxa" w:w="2120"/>
+            <w:tcBorders>
+              <w:top w:val="single" w:color="C9D3DD" w:sz="4"/>
+              <w:left w:val="single" w:color="C9D3DD" w:sz="4"/>
+              <w:bottom w:val="single" w:color="C9D3DD" w:sz="4"/>
+              <w:right w:val="single" w:color="C9D3DD" w:sz="4"/>
+            </w:tcBorders>
+            <w:tcMar>
+              <w:top w:type="dxa" w:w="50"/>
+              <w:left w:type="dxa" w:w="80"/>
+              <w:bottom w:type="dxa" w:w="50"/>
+              <w:right w:type="dxa" w:w="80"/>
+            </w:tcMar>
+          </w:tcPr>
+          <w:p>
+            <w:pPr>
+              <w:spacing w:before="0" w:after="0"/>
+            </w:pPr>
+            <w:r>
+              <w:rPr>
+                <w:rFonts w:ascii="Arial" w:cs="Arial" w:eastAsia="Arial" w:hAnsi="Arial"/>
+                <w:sz w:val="17"/>
+                <w:szCs w:val="17"/>
+              </w:rPr>
+              <w:t xml:space="preserve">BO Item</w:t>
+            </w:r>
+          </w:p>
+        </w:tc>
+        <w:tc>
+          <w:tcPr>
+            <w:tcW w:type="dxa" w:w="3767"/>
+            <w:tcBorders>
+              <w:top w:val="single" w:color="C9D3DD" w:sz="4"/>
+              <w:left w:val="single" w:color="C9D3DD" w:sz="4"/>
+              <w:bottom w:val="single" w:color="C9D3DD" w:sz="4"/>
+              <w:right w:val="single" w:color="C9D3DD" w:sz="4"/>
+            </w:tcBorders>
+            <w:tcMar>
+              <w:top w:type="dxa" w:w="50"/>
+              <w:left w:type="dxa" w:w="80"/>
+              <w:bottom w:type="dxa" w:w="50"/>
+              <w:right w:type="dxa" w:w="80"/>
+            </w:tcMar>
+          </w:tcPr>
+          <w:p>
+            <w:pPr>
+              <w:spacing w:before="0" w:after="0"/>
+            </w:pPr>
+            <w:r>
+              <w:rPr>
+                <w:rFonts w:ascii="Arial" w:cs="Arial" w:eastAsia="Arial" w:hAnsi="Arial"/>
+                <w:sz w:val="17"/>
+                <w:szCs w:val="17"/>
+              </w:rPr>
+              <w:t xml:space="preserve">Integração com test doubles</w:t>
+            </w:r>
+          </w:p>
+        </w:tc>
+        <w:tc>
+          <w:tcPr>
+            <w:tcW w:type="dxa" w:w="3979"/>
+            <w:tcBorders>
+              <w:top w:val="single" w:color="C9D3DD" w:sz="4"/>
+              <w:left w:val="single" w:color="C9D3DD" w:sz="4"/>
+              <w:bottom w:val="single" w:color="C9D3DD" w:sz="4"/>
+              <w:right w:val="single" w:color="C9D3DD" w:sz="4"/>
+            </w:tcBorders>
+            <w:tcMar>
+              <w:top w:type="dxa" w:w="50"/>
+              <w:left w:type="dxa" w:w="80"/>
+              <w:bottom w:type="dxa" w:w="50"/>
+              <w:right w:type="dxa" w:w="80"/>
+            </w:tcMar>
+          </w:tcPr>
+          <w:p>
+            <w:pPr>
+              <w:spacing w:before="0" w:after="0"/>
+            </w:pPr>
+            <w:r>
+              <w:rPr>
+                <w:rFonts w:ascii="Arial" w:cs="Arial" w:eastAsia="Arial" w:hAnsi="Arial"/>
+                <w:sz w:val="17"/>
+                <w:szCs w:val="17"/>
+              </w:rPr>
+              <w:t xml:space="preserve">Reserva, liberação e baixa com recálculo do saldo, validações, inativação e exclusão bloqueadas</w:t>
+            </w:r>
+          </w:p>
+        </w:tc>
+      </w:tr>
+      <w:tr>
+        <w:trPr>
+          <w:cantSplit/>
+        </w:trPr>
+        <w:tc>
+          <w:tcPr>
+            <w:tcW w:type="dxa" w:w="2120"/>
+            <w:tcBorders>
+              <w:top w:val="single" w:color="C9D3DD" w:sz="4"/>
+              <w:left w:val="single" w:color="C9D3DD" w:sz="4"/>
+              <w:bottom w:val="single" w:color="C9D3DD" w:sz="4"/>
+              <w:right w:val="single" w:color="C9D3DD" w:sz="4"/>
+            </w:tcBorders>
+            <w:tcMar>
+              <w:top w:type="dxa" w:w="50"/>
+              <w:left w:type="dxa" w:w="80"/>
+              <w:bottom w:type="dxa" w:w="50"/>
+              <w:right w:type="dxa" w:w="80"/>
+            </w:tcMar>
+          </w:tcPr>
+          <w:p>
+            <w:pPr>
+              <w:spacing w:before="0" w:after="0"/>
+            </w:pPr>
+            <w:r>
+              <w:rPr>
+                <w:rFonts w:ascii="Arial" w:cs="Arial" w:eastAsia="Arial" w:hAnsi="Arial"/>
+                <w:sz w:val="17"/>
+                <w:szCs w:val="17"/>
+              </w:rPr>
+              <w:t xml:space="preserve">BO Pedido</w:t>
+            </w:r>
+          </w:p>
+        </w:tc>
+        <w:tc>
+          <w:tcPr>
+            <w:tcW w:type="dxa" w:w="3767"/>
+            <w:tcBorders>
+              <w:top w:val="single" w:color="C9D3DD" w:sz="4"/>
+              <w:left w:val="single" w:color="C9D3DD" w:sz="4"/>
+              <w:bottom w:val="single" w:color="C9D3DD" w:sz="4"/>
+              <w:right w:val="single" w:color="C9D3DD" w:sz="4"/>
+            </w:tcBorders>
+            <w:tcMar>
+              <w:top w:type="dxa" w:w="50"/>
+              <w:left w:type="dxa" w:w="80"/>
+              <w:bottom w:type="dxa" w:w="50"/>
+              <w:right w:type="dxa" w:w="80"/>
+            </w:tcMar>
+          </w:tcPr>
+          <w:p>
+            <w:pPr>
+              <w:spacing w:before="0" w:after="0"/>
+            </w:pPr>
+            <w:r>
+              <w:rPr>
+                <w:rFonts w:ascii="Arial" w:cs="Arial" w:eastAsia="Arial" w:hAnsi="Arial"/>
+                <w:sz w:val="17"/>
+                <w:szCs w:val="17"/>
+              </w:rPr>
+              <w:t xml:space="preserve">Integração com test doubles e com o banco</w:t>
+            </w:r>
+          </w:p>
+        </w:tc>
+        <w:tc>
+          <w:tcPr>
+            <w:tcW w:type="dxa" w:w="3979"/>
+            <w:tcBorders>
+              <w:top w:val="single" w:color="C9D3DD" w:sz="4"/>
+              <w:left w:val="single" w:color="C9D3DD" w:sz="4"/>
+              <w:bottom w:val="single" w:color="C9D3DD" w:sz="4"/>
+              <w:right w:val="single" w:color="C9D3DD" w:sz="4"/>
+            </w:tcBorders>
+            <w:tcMar>
+              <w:top w:type="dxa" w:w="50"/>
+              <w:left w:type="dxa" w:w="80"/>
+              <w:bottom w:type="dxa" w:w="50"/>
+              <w:right w:type="dxa" w:w="80"/>
+            </w:tcMar>
+          </w:tcPr>
+          <w:p>
+            <w:pPr>
+              <w:spacing w:before="0" w:after="0"/>
+            </w:pPr>
+            <w:r>
+              <w:rPr>
+                <w:rFonts w:ascii="Arial" w:cs="Arial" w:eastAsia="Arial" w:hAnsi="Arial"/>
+                <w:sz w:val="17"/>
+                <w:szCs w:val="17"/>
+              </w:rPr>
+              <w:t xml:space="preserve">Registro com reserva, edição de itens, validações do Save, precheck de estoque, total, pagamento, aprovação, cancelamento e snapshots</w:t>
+            </w:r>
+          </w:p>
+        </w:tc>
+      </w:tr>
+      <w:tr>
+        <w:trPr>
+          <w:cantSplit/>
+        </w:trPr>
+        <w:tc>
+          <w:tcPr>
+            <w:tcW w:type="dxa" w:w="2120"/>
+            <w:tcBorders>
+              <w:top w:val="single" w:color="C9D3DD" w:sz="4"/>
+              <w:left w:val="single" w:color="C9D3DD" w:sz="4"/>
+              <w:bottom w:val="single" w:color="C9D3DD" w:sz="4"/>
+              <w:right w:val="single" w:color="C9D3DD" w:sz="4"/>
+            </w:tcBorders>
+            <w:tcMar>
+              <w:top w:type="dxa" w:w="50"/>
+              <w:left w:type="dxa" w:w="80"/>
+              <w:bottom w:type="dxa" w:w="50"/>
+              <w:right w:type="dxa" w:w="80"/>
+            </w:tcMar>
+          </w:tcPr>
+          <w:p>
+            <w:pPr>
+              <w:spacing w:before="0" w:after="0"/>
+            </w:pPr>
+            <w:r>
+              <w:rPr>
+                <w:rFonts w:ascii="Arial" w:cs="Arial" w:eastAsia="Arial" w:hAnsi="Arial"/>
+                <w:sz w:val="17"/>
+                <w:szCs w:val="17"/>
+              </w:rPr>
+              <w:t xml:space="preserve">BO Reembolso</w:t>
+            </w:r>
+          </w:p>
+        </w:tc>
+        <w:tc>
+          <w:tcPr>
+            <w:tcW w:type="dxa" w:w="3767"/>
+            <w:tcBorders>
+              <w:top w:val="single" w:color="C9D3DD" w:sz="4"/>
+              <w:left w:val="single" w:color="C9D3DD" w:sz="4"/>
+              <w:bottom w:val="single" w:color="C9D3DD" w:sz="4"/>
+              <w:right w:val="single" w:color="C9D3DD" w:sz="4"/>
+            </w:tcBorders>
+            <w:tcMar>
+              <w:top w:type="dxa" w:w="50"/>
+              <w:left w:type="dxa" w:w="80"/>
+              <w:bottom w:type="dxa" w:w="50"/>
+              <w:right w:type="dxa" w:w="80"/>
+            </w:tcMar>
+          </w:tcPr>
+          <w:p>
+            <w:pPr>
+              <w:spacing w:before="0" w:after="0"/>
+            </w:pPr>
+            <w:r>
+              <w:rPr>
+                <w:rFonts w:ascii="Arial" w:cs="Arial" w:eastAsia="Arial" w:hAnsi="Arial"/>
+                <w:sz w:val="17"/>
+                <w:szCs w:val="17"/>
+              </w:rPr>
+              <w:t xml:space="preserve">Integração com test doubles e com o banco</w:t>
+            </w:r>
+          </w:p>
+        </w:tc>
+        <w:tc>
+          <w:tcPr>
+            <w:tcW w:type="dxa" w:w="3979"/>
+            <w:tcBorders>
+              <w:top w:val="single" w:color="C9D3DD" w:sz="4"/>
+              <w:left w:val="single" w:color="C9D3DD" w:sz="4"/>
+              <w:bottom w:val="single" w:color="C9D3DD" w:sz="4"/>
+              <w:right w:val="single" w:color="C9D3DD" w:sz="4"/>
+            </w:tcBorders>
+            <w:tcMar>
+              <w:top w:type="dxa" w:w="50"/>
+              <w:left w:type="dxa" w:w="80"/>
+              <w:bottom w:type="dxa" w:w="50"/>
+              <w:right w:type="dxa" w:w="80"/>
+            </w:tcMar>
+          </w:tcPr>
+          <w:p>
+            <w:pPr>
+              <w:spacing w:before="0" w:after="0"/>
+            </w:pPr>
+            <w:r>
+              <w:rPr>
+                <w:rFonts w:ascii="Arial" w:cs="Arial" w:eastAsia="Arial" w:hAnsi="Arial"/>
+                <w:sz w:val="17"/>
+                <w:szCs w:val="17"/>
+              </w:rPr>
+              <w:t xml:space="preserve">Aprovação e rejeição na mesma transação do pedido e recusa de solicitação já decidida</w:t>
+            </w:r>
+          </w:p>
+        </w:tc>
+      </w:tr>
+    </w:tbl>
+    <w:p>
+      <w:pPr>
+        <w:spacing w:after="80"/>
+      </w:pPr>
+    </w:p>
+    <w:p>
+      <w:pPr>
+        <w:pStyle w:val="ListParagraph"/>
+        <w:numPr>
+          <w:ilvl w:val="0"/>
+          <w:numId w:val="2"/>
+        </w:numPr>
+        <w:spacing w:after="60"/>
+      </w:pPr>
+      <w:r>
+        <w:rPr>
+          <w:rFonts w:ascii="Arial" w:cs="Arial" w:eastAsia="Arial" w:hAnsi="Arial"/>
+          <w:sz w:val="20"/>
+          <w:szCs w:val="20"/>
+        </w:rPr>
+        <w:t xml:space="preserve">Os testes de integração devem semear os próprios dados e usar test doubles das entidades e das tabelas de rascunho (</w:t>
       </w:r>
       <w:r>
         <w:rPr>
@@ -49292,7 +50580,7 @@
           <w:sz w:val="20"/>
           <w:szCs w:val="20"/>
         </w:rPr>
-        <w:t xml:space="preserve">) quando precisarem de </w:t>
+        <w:t xml:space="preserve">), para começar de tabelas vazias e não gravar no banco; a persistência real (</w:t>
       </w:r>
       <w:r>
         <w:rPr>
@@ -49309,7 +50597,43 @@
           <w:sz w:val="20"/>
           <w:szCs w:val="20"/>
         </w:rPr>
-        <w:t xml:space="preserve">.</w:t>
+        <w:t xml:space="preserve">) só é testada sobre test doubles.</w:t>
+      </w:r>
+    </w:p>
+    <w:p>
+      <w:pPr>
+        <w:pStyle w:val="ListParagraph"/>
+        <w:numPr>
+          <w:ilvl w:val="0"/>
+          <w:numId w:val="2"/>
+        </w:numPr>
+        <w:spacing w:after="60"/>
+      </w:pPr>
+      <w:r>
+        <w:rPr>
+          <w:rFonts w:ascii="Arial" w:cs="Arial" w:eastAsia="Arial" w:hAnsi="Arial"/>
+          <w:sz w:val="20"/>
+          <w:szCs w:val="20"/>
+        </w:rPr>
+        <w:t xml:space="preserve">Os testes não devem depender de serviços externos (ViaCEP) nem dos dados de demonstração do sistema.</w:t>
+      </w:r>
+    </w:p>
+    <w:p>
+      <w:pPr>
+        <w:pStyle w:val="ListParagraph"/>
+        <w:numPr>
+          <w:ilvl w:val="0"/>
+          <w:numId w:val="2"/>
+        </w:numPr>
+        <w:spacing w:after="60"/>
+      </w:pPr>
+      <w:r>
+        <w:rPr>
+          <w:rFonts w:ascii="Arial" w:cs="Arial" w:eastAsia="Arial" w:hAnsi="Arial"/>
+          <w:sz w:val="20"/>
+          <w:szCs w:val="20"/>
+        </w:rPr>
+        <w:t xml:space="preserve">As mensagens devem ser verificadas pelo número da Message Class, não pelo texto.</w:t>
       </w:r>
     </w:p>
     <w:p>

</xml_diff>

<commit_message>
docs(especificacao): v3.4 com confirmações, prechecks e processamento em lote
Regras de inativação de cliente e item, endereço principal com seleção única e
precheck, pagamento com máscaras e precheck de todos os campos, nova seção 18.3
(confirmações e ações customizadas, com duas figuras), actions e mensagens
050 a 053, processamento em lote, critérios de aceite e cobertura de testes.
Markdown e Word com o mesmo conteúdo.

Co-Authored-By: Claude Opus 5.5 <noreply@anthropic.com>
</commit_message>
<xml_diff>
--- a/docs/Pedidos_de_Compras_-_Especificacao_Tecnica.docx
+++ b/docs/Pedidos_de_Compras_-_Especificacao_Tecnica.docx
@@ -252,7 +252,7 @@
                 <w:sz w:val="17"/>
                 <w:szCs w:val="17"/>
               </w:rPr>
-              <w:t xml:space="preserve">3.3 (22/10/2026)</w:t>
+              <w:t xml:space="preserve">3.4 (30/10/2026)</w:t>
             </w:r>
           </w:p>
         </w:tc>
@@ -434,15 +434,7 @@
           <w:sz w:val="20"/>
           <w:szCs w:val="20"/>
         </w:rPr>
-        <w:t xml:space="preserve">1. </w:t>
-      </w:r>
-      <w:r>
-        <w:rPr>
-          <w:rFonts w:ascii="Arial" w:cs="Arial" w:eastAsia="Arial" w:hAnsi="Arial"/>
-          <w:sz w:val="20"/>
-          <w:szCs w:val="20"/>
-        </w:rPr>
-        <w:t xml:space="preserve">Objetivo</w:t>
+        <w:t xml:space="preserve">1. Objetivo</w:t>
       </w:r>
     </w:p>
     <w:p>
@@ -456,15 +448,7 @@
           <w:sz w:val="20"/>
           <w:szCs w:val="20"/>
         </w:rPr>
-        <w:t xml:space="preserve">2. </w:t>
-      </w:r>
-      <w:r>
-        <w:rPr>
-          <w:rFonts w:ascii="Arial" w:cs="Arial" w:eastAsia="Arial" w:hAnsi="Arial"/>
-          <w:sz w:val="20"/>
-          <w:szCs w:val="20"/>
-        </w:rPr>
-        <w:t xml:space="preserve">Escopo</w:t>
+        <w:t xml:space="preserve">2. Escopo</w:t>
       </w:r>
     </w:p>
     <w:p>
@@ -478,15 +462,7 @@
           <w:sz w:val="20"/>
           <w:szCs w:val="20"/>
         </w:rPr>
-        <w:t xml:space="preserve">3. </w:t>
-      </w:r>
-      <w:r>
-        <w:rPr>
-          <w:rFonts w:ascii="Arial" w:cs="Arial" w:eastAsia="Arial" w:hAnsi="Arial"/>
-          <w:sz w:val="20"/>
-          <w:szCs w:val="20"/>
-        </w:rPr>
-        <w:t xml:space="preserve">Ambientes de implementação e arquitetura</w:t>
+        <w:t xml:space="preserve">3. Ambientes de implementação e arquitetura</w:t>
       </w:r>
     </w:p>
     <w:p>
@@ -500,15 +476,7 @@
           <w:sz w:val="20"/>
           <w:szCs w:val="20"/>
         </w:rPr>
-        <w:t xml:space="preserve">4. </w:t>
-      </w:r>
-      <w:r>
-        <w:rPr>
-          <w:rFonts w:ascii="Arial" w:cs="Arial" w:eastAsia="Arial" w:hAnsi="Arial"/>
-          <w:sz w:val="20"/>
-          <w:szCs w:val="20"/>
-        </w:rPr>
-        <w:t xml:space="preserve">Padrão de nomenclatura</w:t>
+        <w:t xml:space="preserve">4. Padrão de nomenclatura</w:t>
       </w:r>
     </w:p>
     <w:p>
@@ -522,15 +490,7 @@
           <w:sz w:val="20"/>
           <w:szCs w:val="20"/>
         </w:rPr>
-        <w:t xml:space="preserve">5. </w:t>
-      </w:r>
-      <w:r>
-        <w:rPr>
-          <w:rFonts w:ascii="Arial" w:cs="Arial" w:eastAsia="Arial" w:hAnsi="Arial"/>
-          <w:sz w:val="20"/>
-          <w:szCs w:val="20"/>
-        </w:rPr>
-        <w:t xml:space="preserve">Perfis de usuário e permissões</w:t>
+        <w:t xml:space="preserve">5. Perfis de usuário e permissões</w:t>
       </w:r>
     </w:p>
     <w:p>
@@ -544,15 +504,7 @@
           <w:sz w:val="20"/>
           <w:szCs w:val="20"/>
         </w:rPr>
-        <w:t xml:space="preserve">6. </w:t>
-      </w:r>
-      <w:r>
-        <w:rPr>
-          <w:rFonts w:ascii="Arial" w:cs="Arial" w:eastAsia="Arial" w:hAnsi="Arial"/>
-          <w:sz w:val="20"/>
-          <w:szCs w:val="20"/>
-        </w:rPr>
-        <w:t xml:space="preserve">Autenticação e autorização</w:t>
+        <w:t xml:space="preserve">6. Autenticação e autorização</w:t>
       </w:r>
     </w:p>
     <w:p>
@@ -566,15 +518,7 @@
           <w:sz w:val="20"/>
           <w:szCs w:val="20"/>
         </w:rPr>
-        <w:t xml:space="preserve">7. </w:t>
-      </w:r>
-      <w:r>
-        <w:rPr>
-          <w:rFonts w:ascii="Arial" w:cs="Arial" w:eastAsia="Arial" w:hAnsi="Arial"/>
-          <w:sz w:val="20"/>
-          <w:szCs w:val="20"/>
-        </w:rPr>
-        <w:t xml:space="preserve">Modelo de dados</w:t>
+        <w:t xml:space="preserve">7. Modelo de dados</w:t>
       </w:r>
     </w:p>
     <w:p>
@@ -588,15 +532,7 @@
           <w:sz w:val="20"/>
           <w:szCs w:val="20"/>
         </w:rPr>
-        <w:t xml:space="preserve">8. </w:t>
-      </w:r>
-      <w:r>
-        <w:rPr>
-          <w:rFonts w:ascii="Arial" w:cs="Arial" w:eastAsia="Arial" w:hAnsi="Arial"/>
-          <w:sz w:val="20"/>
-          <w:szCs w:val="20"/>
-        </w:rPr>
-        <w:t xml:space="preserve">Business Objects RAP</w:t>
+        <w:t xml:space="preserve">8. Business Objects RAP</w:t>
       </w:r>
     </w:p>
     <w:p>
@@ -610,15 +546,7 @@
           <w:sz w:val="20"/>
           <w:szCs w:val="20"/>
         </w:rPr>
-        <w:t xml:space="preserve">9. </w:t>
-      </w:r>
-      <w:r>
-        <w:rPr>
-          <w:rFonts w:ascii="Arial" w:cs="Arial" w:eastAsia="Arial" w:hAnsi="Arial"/>
-          <w:sz w:val="20"/>
-          <w:szCs w:val="20"/>
-        </w:rPr>
-        <w:t xml:space="preserve">Comunicação entre as aplicações</w:t>
+        <w:t xml:space="preserve">9. Comunicação entre as aplicações</w:t>
       </w:r>
     </w:p>
     <w:p>
@@ -632,15 +560,7 @@
           <w:sz w:val="20"/>
           <w:szCs w:val="20"/>
         </w:rPr>
-        <w:t xml:space="preserve">10. </w:t>
-      </w:r>
-      <w:r>
-        <w:rPr>
-          <w:rFonts w:ascii="Arial" w:cs="Arial" w:eastAsia="Arial" w:hAnsi="Arial"/>
-          <w:sz w:val="20"/>
-          <w:szCs w:val="20"/>
-        </w:rPr>
-        <w:t xml:space="preserve">Regras de negócio</w:t>
+        <w:t xml:space="preserve">10. Regras de negócio</w:t>
       </w:r>
     </w:p>
     <w:p>
@@ -654,15 +574,7 @@
           <w:sz w:val="20"/>
           <w:szCs w:val="20"/>
         </w:rPr>
-        <w:t xml:space="preserve">11. </w:t>
-      </w:r>
-      <w:r>
-        <w:rPr>
-          <w:rFonts w:ascii="Arial" w:cs="Arial" w:eastAsia="Arial" w:hAnsi="Arial"/>
-          <w:sz w:val="20"/>
-          <w:szCs w:val="20"/>
-        </w:rPr>
-        <w:t xml:space="preserve">Fluxo de status do pedido</w:t>
+        <w:t xml:space="preserve">11. Fluxo de status do pedido</w:t>
       </w:r>
     </w:p>
     <w:p>
@@ -676,15 +588,7 @@
           <w:sz w:val="20"/>
           <w:szCs w:val="20"/>
         </w:rPr>
-        <w:t xml:space="preserve">12. </w:t>
-      </w:r>
-      <w:r>
-        <w:rPr>
-          <w:rFonts w:ascii="Arial" w:cs="Arial" w:eastAsia="Arial" w:hAnsi="Arial"/>
-          <w:sz w:val="20"/>
-          <w:szCs w:val="20"/>
-        </w:rPr>
-        <w:t xml:space="preserve">Reserva, baixa, liberação e concorrência de estoque</w:t>
+        <w:t xml:space="preserve">12. Reserva, baixa, liberação e concorrência de estoque</w:t>
       </w:r>
     </w:p>
     <w:p>
@@ -698,15 +602,7 @@
           <w:sz w:val="20"/>
           <w:szCs w:val="20"/>
         </w:rPr>
-        <w:t xml:space="preserve">13. </w:t>
-      </w:r>
-      <w:r>
-        <w:rPr>
-          <w:rFonts w:ascii="Arial" w:cs="Arial" w:eastAsia="Arial" w:hAnsi="Arial"/>
-          <w:sz w:val="20"/>
-          <w:szCs w:val="20"/>
-        </w:rPr>
-        <w:t xml:space="preserve">Reembolso de pedidos</w:t>
+        <w:t xml:space="preserve">13. Reembolso de pedidos</w:t>
       </w:r>
     </w:p>
     <w:p>
@@ -720,15 +616,7 @@
           <w:sz w:val="20"/>
           <w:szCs w:val="20"/>
         </w:rPr>
-        <w:t xml:space="preserve">14. </w:t>
-      </w:r>
-      <w:r>
-        <w:rPr>
-          <w:rFonts w:ascii="Arial" w:cs="Arial" w:eastAsia="Arial" w:hAnsi="Arial"/>
-          <w:sz w:val="20"/>
-          <w:szCs w:val="20"/>
-        </w:rPr>
-        <w:t xml:space="preserve">Pagamento simulado com cartão</w:t>
+        <w:t xml:space="preserve">14. Pagamento simulado com cartão</w:t>
       </w:r>
     </w:p>
     <w:p>
@@ -742,15 +630,7 @@
           <w:sz w:val="20"/>
           <w:szCs w:val="20"/>
         </w:rPr>
-        <w:t xml:space="preserve">15. </w:t>
-      </w:r>
-      <w:r>
-        <w:rPr>
-          <w:rFonts w:ascii="Arial" w:cs="Arial" w:eastAsia="Arial" w:hAnsi="Arial"/>
-          <w:sz w:val="20"/>
-          <w:szCs w:val="20"/>
-        </w:rPr>
-        <w:t xml:space="preserve">Cálculos do pedido</w:t>
+        <w:t xml:space="preserve">15. Cálculos do pedido</w:t>
       </w:r>
     </w:p>
     <w:p>
@@ -764,15 +644,7 @@
           <w:sz w:val="20"/>
           <w:szCs w:val="20"/>
         </w:rPr>
-        <w:t xml:space="preserve">16. </w:t>
-      </w:r>
-      <w:r>
-        <w:rPr>
-          <w:rFonts w:ascii="Arial" w:cs="Arial" w:eastAsia="Arial" w:hAnsi="Arial"/>
-          <w:sz w:val="20"/>
-          <w:szCs w:val="20"/>
-        </w:rPr>
-        <w:t xml:space="preserve">Endereço e integração com o ViaCEP</w:t>
+        <w:t xml:space="preserve">16. Endereço e integração com o ViaCEP</w:t>
       </w:r>
     </w:p>
     <w:p>
@@ -786,15 +658,7 @@
           <w:sz w:val="20"/>
           <w:szCs w:val="20"/>
         </w:rPr>
-        <w:t xml:space="preserve">17. </w:t>
-      </w:r>
-      <w:r>
-        <w:rPr>
-          <w:rFonts w:ascii="Arial" w:cs="Arial" w:eastAsia="Arial" w:hAnsi="Arial"/>
-          <w:sz w:val="20"/>
-          <w:szCs w:val="20"/>
-        </w:rPr>
-        <w:t xml:space="preserve">Importação em massa por planilha</w:t>
+        <w:t xml:space="preserve">17. Importação em massa por planilha</w:t>
       </w:r>
     </w:p>
     <w:p>
@@ -808,15 +672,7 @@
           <w:sz w:val="20"/>
           <w:szCs w:val="20"/>
         </w:rPr>
-        <w:t xml:space="preserve">18. </w:t>
-      </w:r>
-      <w:r>
-        <w:rPr>
-          <w:rFonts w:ascii="Arial" w:cs="Arial" w:eastAsia="Arial" w:hAnsi="Arial"/>
-          <w:sz w:val="20"/>
-          <w:szCs w:val="20"/>
-        </w:rPr>
-        <w:t xml:space="preserve">Interface do usuário — SAP Fiori Elements</w:t>
+        <w:t xml:space="preserve">18. Interface do usuário — SAP Fiori Elements</w:t>
       </w:r>
     </w:p>
     <w:p>
@@ -830,15 +686,7 @@
           <w:sz w:val="20"/>
           <w:szCs w:val="20"/>
         </w:rPr>
-        <w:t xml:space="preserve">19. </w:t>
-      </w:r>
-      <w:r>
-        <w:rPr>
-          <w:rFonts w:ascii="Arial" w:cs="Arial" w:eastAsia="Arial" w:hAnsi="Arial"/>
-          <w:sz w:val="20"/>
-          <w:szCs w:val="20"/>
-        </w:rPr>
-        <w:t xml:space="preserve">Camada analítica</w:t>
+        <w:t xml:space="preserve">19. Camada analítica</w:t>
       </w:r>
     </w:p>
     <w:p>
@@ -852,15 +700,7 @@
           <w:sz w:val="20"/>
           <w:szCs w:val="20"/>
         </w:rPr>
-        <w:t xml:space="preserve">20. </w:t>
-      </w:r>
-      <w:r>
-        <w:rPr>
-          <w:rFonts w:ascii="Arial" w:cs="Arial" w:eastAsia="Arial" w:hAnsi="Arial"/>
-          <w:sz w:val="20"/>
-          <w:szCs w:val="20"/>
-        </w:rPr>
-        <w:t xml:space="preserve">Actions, validations e determinations</w:t>
+        <w:t xml:space="preserve">20. Actions, validations e determinations</w:t>
       </w:r>
     </w:p>
     <w:p>
@@ -874,15 +714,7 @@
           <w:sz w:val="20"/>
           <w:szCs w:val="20"/>
         </w:rPr>
-        <w:t xml:space="preserve">21. </w:t>
-      </w:r>
-      <w:r>
-        <w:rPr>
-          <w:rFonts w:ascii="Arial" w:cs="Arial" w:eastAsia="Arial" w:hAnsi="Arial"/>
-          <w:sz w:val="20"/>
-          <w:szCs w:val="20"/>
-        </w:rPr>
-        <w:t xml:space="preserve">Mensagens de erro e sucesso</w:t>
+        <w:t xml:space="preserve">21. Mensagens de erro e sucesso</w:t>
       </w:r>
     </w:p>
     <w:p>
@@ -896,15 +728,7 @@
           <w:sz w:val="20"/>
           <w:szCs w:val="20"/>
         </w:rPr>
-        <w:t xml:space="preserve">22. </w:t>
-      </w:r>
-      <w:r>
-        <w:rPr>
-          <w:rFonts w:ascii="Arial" w:cs="Arial" w:eastAsia="Arial" w:hAnsi="Arial"/>
-          <w:sz w:val="20"/>
-          <w:szCs w:val="20"/>
-        </w:rPr>
-        <w:t xml:space="preserve">Critérios de aceite</w:t>
+        <w:t xml:space="preserve">22. Critérios de aceite</w:t>
       </w:r>
     </w:p>
     <w:p>
@@ -918,15 +742,7 @@
           <w:sz w:val="20"/>
           <w:szCs w:val="20"/>
         </w:rPr>
-        <w:t xml:space="preserve">23. </w:t>
-      </w:r>
-      <w:r>
-        <w:rPr>
-          <w:rFonts w:ascii="Arial" w:cs="Arial" w:eastAsia="Arial" w:hAnsi="Arial"/>
-          <w:sz w:val="20"/>
-          <w:szCs w:val="20"/>
-        </w:rPr>
-        <w:t xml:space="preserve">Estrutura de pacotes</w:t>
+        <w:t xml:space="preserve">23. Estrutura de pacotes</w:t>
       </w:r>
     </w:p>
     <w:p>
@@ -940,15 +756,7 @@
           <w:sz w:val="20"/>
           <w:szCs w:val="20"/>
         </w:rPr>
-        <w:t xml:space="preserve">24. </w:t>
-      </w:r>
-      <w:r>
-        <w:rPr>
-          <w:rFonts w:ascii="Arial" w:cs="Arial" w:eastAsia="Arial" w:hAnsi="Arial"/>
-          <w:sz w:val="20"/>
-          <w:szCs w:val="20"/>
-        </w:rPr>
-        <w:t xml:space="preserve">Implantação e operação</w:t>
+        <w:t xml:space="preserve">24. Implantação e operação</w:t>
       </w:r>
     </w:p>
     <w:p>
@@ -962,15 +770,7 @@
           <w:sz w:val="20"/>
           <w:szCs w:val="20"/>
         </w:rPr>
-        <w:t xml:space="preserve">25. </w:t>
-      </w:r>
-      <w:r>
-        <w:rPr>
-          <w:rFonts w:ascii="Arial" w:cs="Arial" w:eastAsia="Arial" w:hAnsi="Arial"/>
-          <w:sz w:val="20"/>
-          <w:szCs w:val="20"/>
-        </w:rPr>
-        <w:t xml:space="preserve">Testes automatizados</w:t>
+        <w:t xml:space="preserve">25. Testes automatizados</w:t>
       </w:r>
     </w:p>
     <w:p>
@@ -984,15 +784,7 @@
           <w:sz w:val="20"/>
           <w:szCs w:val="20"/>
         </w:rPr>
-        <w:t xml:space="preserve">26. </w:t>
-      </w:r>
-      <w:r>
-        <w:rPr>
-          <w:rFonts w:ascii="Arial" w:cs="Arial" w:eastAsia="Arial" w:hAnsi="Arial"/>
-          <w:sz w:val="20"/>
-          <w:szCs w:val="20"/>
-        </w:rPr>
-        <w:t xml:space="preserve">Considerações de segurança</w:t>
+        <w:t xml:space="preserve">26. Considerações de segurança</w:t>
       </w:r>
     </w:p>
     <w:p>
@@ -1006,15 +798,7 @@
           <w:sz w:val="20"/>
           <w:szCs w:val="20"/>
         </w:rPr>
-        <w:t xml:space="preserve">27. </w:t>
-      </w:r>
-      <w:r>
-        <w:rPr>
-          <w:rFonts w:ascii="Arial" w:cs="Arial" w:eastAsia="Arial" w:hAnsi="Arial"/>
-          <w:sz w:val="20"/>
-          <w:szCs w:val="20"/>
-        </w:rPr>
-        <w:t xml:space="preserve">Restrições técnicas</w:t>
+        <w:t xml:space="preserve">27. Restrições técnicas</w:t>
       </w:r>
     </w:p>
     <w:p>
@@ -30249,19 +30033,58 @@
           <w:sz w:val="20"/>
           <w:szCs w:val="20"/>
         </w:rPr>
-        <w:t xml:space="preserve">Fotos apenas em JPEG, PNG ou WEBP, validando MIME, extensão e assinatura binária.</w:t>
-      </w:r>
-    </w:p>
-    <w:p>
-      <w:pPr>
-        <w:pStyle w:val="Heading2"/>
-        <w:keepNext/>
-      </w:pPr>
-      <w:r>
-        <w:rPr>
-          <w:rFonts w:ascii="Arial" w:cs="Arial" w:eastAsia="Arial" w:hAnsi="Arial"/>
-        </w:rPr>
-        <w:t xml:space="preserve">10.2 Endereços</w:t>
+        <w:t xml:space="preserve">Cliente com pedido em andamento (</w:t>
+      </w:r>
+      <w:r>
+        <w:rPr>
+          <w:rFonts w:ascii="Consolas" w:cs="Consolas" w:eastAsia="Consolas" w:hAnsi="Consolas"/>
+          <w:color w:val="00144A"/>
+          <w:sz w:val="20"/>
+          <w:szCs w:val="20"/>
+        </w:rPr>
+        <w:t xml:space="preserve">ABERTO</w:t>
+      </w:r>
+      <w:r>
+        <w:rPr>
+          <w:rFonts w:ascii="Arial" w:cs="Arial" w:eastAsia="Arial" w:hAnsi="Arial"/>
+          <w:sz w:val="20"/>
+          <w:szCs w:val="20"/>
+        </w:rPr>
+        <w:t xml:space="preserve">, </w:t>
+      </w:r>
+      <w:r>
+        <w:rPr>
+          <w:rFonts w:ascii="Consolas" w:cs="Consolas" w:eastAsia="Consolas" w:hAnsi="Consolas"/>
+          <w:color w:val="00144A"/>
+          <w:sz w:val="20"/>
+          <w:szCs w:val="20"/>
+        </w:rPr>
+        <w:t xml:space="preserve">AGUARDANDO_APROVACAO</w:t>
+      </w:r>
+      <w:r>
+        <w:rPr>
+          <w:rFonts w:ascii="Arial" w:cs="Arial" w:eastAsia="Arial" w:hAnsi="Arial"/>
+          <w:sz w:val="20"/>
+          <w:szCs w:val="20"/>
+        </w:rPr>
+        <w:t xml:space="preserve">, </w:t>
+      </w:r>
+      <w:r>
+        <w:rPr>
+          <w:rFonts w:ascii="Consolas" w:cs="Consolas" w:eastAsia="Consolas" w:hAnsi="Consolas"/>
+          <w:color w:val="00144A"/>
+          <w:sz w:val="20"/>
+          <w:szCs w:val="20"/>
+        </w:rPr>
+        <w:t xml:space="preserve">PROCESSANDO_REEMBOLSO</w:t>
+      </w:r>
+      <w:r>
+        <w:rPr>
+          <w:rFonts w:ascii="Arial" w:cs="Arial" w:eastAsia="Arial" w:hAnsi="Arial"/>
+          <w:sz w:val="20"/>
+          <w:szCs w:val="20"/>
+        </w:rPr>
+        <w:t xml:space="preserve"> ou rascunho) não pode ser inativado: o precheck do update barra a alteração do campo e uma validation repete a regra no Save.</w:t>
       </w:r>
     </w:p>
     <w:p>
@@ -30279,7 +30102,19 @@
           <w:sz w:val="20"/>
           <w:szCs w:val="20"/>
         </w:rPr>
-        <w:t xml:space="preserve">O ViaCEP é obrigatório para validar o CEP; se estiver indisponível, o cadastro e a alteração são bloqueados.</w:t>
+        <w:t xml:space="preserve">Fotos apenas em JPEG, PNG ou WEBP, validando MIME, extensão e assinatura binária.</w:t>
+      </w:r>
+    </w:p>
+    <w:p>
+      <w:pPr>
+        <w:pStyle w:val="Heading2"/>
+        <w:keepNext/>
+      </w:pPr>
+      <w:r>
+        <w:rPr>
+          <w:rFonts w:ascii="Arial" w:cs="Arial" w:eastAsia="Arial" w:hAnsi="Arial"/>
+        </w:rPr>
+        <w:t xml:space="preserve">10.2 Endereços</w:t>
       </w:r>
     </w:p>
     <w:p>
@@ -30297,7 +30132,7 @@
           <w:sz w:val="20"/>
           <w:szCs w:val="20"/>
         </w:rPr>
-        <w:t xml:space="preserve">Campos retornados pelo ViaCEP não são editáveis, exceto Logradouro e Bairro para CEP geral de município.</w:t>
+        <w:t xml:space="preserve">O ViaCEP é obrigatório para validar o CEP; se estiver indisponível, o cadastro e a alteração são bloqueados.</w:t>
       </w:r>
     </w:p>
     <w:p>
@@ -30315,7 +30150,7 @@
           <w:sz w:val="20"/>
           <w:szCs w:val="20"/>
         </w:rPr>
-        <w:t xml:space="preserve">O número é obrigatório.</w:t>
+        <w:t xml:space="preserve">Campos retornados pelo ViaCEP não são editáveis, exceto Logradouro e Bairro para CEP geral de município.</w:t>
       </w:r>
     </w:p>
     <w:p>
@@ -30333,7 +30168,7 @@
           <w:sz w:val="20"/>
           <w:szCs w:val="20"/>
         </w:rPr>
-        <w:t xml:space="preserve">Um CEP só pode aparecer uma vez por cliente; clientes diferentes podem compartilhar o mesmo CEP.</w:t>
+        <w:t xml:space="preserve">O número é obrigatório.</w:t>
       </w:r>
     </w:p>
     <w:p>
@@ -30351,19 +30186,7 @@
           <w:sz w:val="20"/>
           <w:szCs w:val="20"/>
         </w:rPr>
-        <w:t xml:space="preserve">Ao marcar um endereço como principal, os demais do cliente são desmarcados.</w:t>
-      </w:r>
-    </w:p>
-    <w:p>
-      <w:pPr>
-        <w:pStyle w:val="Heading2"/>
-        <w:keepNext/>
-      </w:pPr>
-      <w:r>
-        <w:rPr>
-          <w:rFonts w:ascii="Arial" w:cs="Arial" w:eastAsia="Arial" w:hAnsi="Arial"/>
-        </w:rPr>
-        <w:t xml:space="preserve">10.3 Itens e estoque</w:t>
+        <w:t xml:space="preserve">Um CEP só pode aparecer uma vez por cliente; clientes diferentes podem compartilhar o mesmo CEP.</w:t>
       </w:r>
     </w:p>
     <w:p>
@@ -30381,7 +30204,7 @@
           <w:sz w:val="20"/>
           <w:szCs w:val="20"/>
         </w:rPr>
-        <w:t xml:space="preserve">Cadastro e edição com draft; SKU obrigatório, único e gerado no backend.</w:t>
+        <w:t xml:space="preserve">Ao marcar um endereço como principal, os demais do cliente são desmarcados.</w:t>
       </w:r>
     </w:p>
     <w:p>
@@ -30399,7 +30222,19 @@
           <w:sz w:val="20"/>
           <w:szCs w:val="20"/>
         </w:rPr>
-        <w:t xml:space="preserve">QtdeDisponivel = QtdeEstoque − QtdeReservada, recalculada a cada movimentação.</w:t>
+        <w:t xml:space="preserve">A tabela de endereços aceita só uma linha selecionada (seleção única). O precheck da ação recusa mais de um endereço do mesmo cliente na mesma chamada, o endereço que já é o principal e endereço com CEP não validado.</w:t>
+      </w:r>
+    </w:p>
+    <w:p>
+      <w:pPr>
+        <w:pStyle w:val="Heading2"/>
+        <w:keepNext/>
+      </w:pPr>
+      <w:r>
+        <w:rPr>
+          <w:rFonts w:ascii="Arial" w:cs="Arial" w:eastAsia="Arial" w:hAnsi="Arial"/>
+        </w:rPr>
+        <w:t xml:space="preserve">10.3 Itens e estoque</w:t>
       </w:r>
     </w:p>
     <w:p>
@@ -30417,7 +30252,43 @@
           <w:sz w:val="20"/>
           <w:szCs w:val="20"/>
         </w:rPr>
-        <w:t xml:space="preserve">Item inativo não entra em novos pedidos; a inativação é bloqueada com estoque disponível ou pedido ativo.</w:t>
+        <w:t xml:space="preserve">Cadastro e edição com draft; SKU obrigatório, único e gerado no backend.</w:t>
+      </w:r>
+    </w:p>
+    <w:p>
+      <w:pPr>
+        <w:pStyle w:val="ListParagraph"/>
+        <w:numPr>
+          <w:ilvl w:val="0"/>
+          <w:numId w:val="2"/>
+        </w:numPr>
+        <w:spacing w:after="60"/>
+      </w:pPr>
+      <w:r>
+        <w:rPr>
+          <w:rFonts w:ascii="Arial" w:cs="Arial" w:eastAsia="Arial" w:hAnsi="Arial"/>
+          <w:sz w:val="20"/>
+          <w:szCs w:val="20"/>
+        </w:rPr>
+        <w:t xml:space="preserve">QtdeDisponivel = QtdeEstoque − QtdeReservada, recalculada a cada movimentação.</w:t>
+      </w:r>
+    </w:p>
+    <w:p>
+      <w:pPr>
+        <w:pStyle w:val="ListParagraph"/>
+        <w:numPr>
+          <w:ilvl w:val="0"/>
+          <w:numId w:val="2"/>
+        </w:numPr>
+        <w:spacing w:after="60"/>
+      </w:pPr>
+      <w:r>
+        <w:rPr>
+          <w:rFonts w:ascii="Arial" w:cs="Arial" w:eastAsia="Arial" w:hAnsi="Arial"/>
+          <w:sz w:val="20"/>
+          <w:szCs w:val="20"/>
+        </w:rPr>
+        <w:t xml:space="preserve">Item inativo não entra em novos pedidos; a inativação é bloqueada com estoque disponível ou pedido ativo, já na alteração do campo (precheck do update) e novamente no Save (validation).</w:t>
       </w:r>
     </w:p>
     <w:tbl>
@@ -33900,41 +33771,7 @@
           <w:sz w:val="20"/>
           <w:szCs w:val="20"/>
         </w:rPr>
-        <w:t xml:space="preserve">Pagamento aprovado leva o pedido a </w:t>
-      </w:r>
-      <w:r>
-        <w:rPr>
-          <w:rFonts w:ascii="Consolas" w:cs="Consolas" w:eastAsia="Consolas" w:hAnsi="Consolas"/>
-          <w:color w:val="00144A"/>
-          <w:sz w:val="20"/>
-          <w:szCs w:val="20"/>
-        </w:rPr>
-        <w:t xml:space="preserve">AGUARDANDO_APROVACAO</w:t>
-      </w:r>
-      <w:r>
-        <w:rPr>
-          <w:rFonts w:ascii="Arial" w:cs="Arial" w:eastAsia="Arial" w:hAnsi="Arial"/>
-          <w:sz w:val="20"/>
-          <w:szCs w:val="20"/>
-        </w:rPr>
-        <w:t xml:space="preserve">; recusado mantém </w:t>
-      </w:r>
-      <w:r>
-        <w:rPr>
-          <w:rFonts w:ascii="Consolas" w:cs="Consolas" w:eastAsia="Consolas" w:hAnsi="Consolas"/>
-          <w:color w:val="00144A"/>
-          <w:sz w:val="20"/>
-          <w:szCs w:val="20"/>
-        </w:rPr>
-        <w:t xml:space="preserve">ABERTO</w:t>
-      </w:r>
-      <w:r>
-        <w:rPr>
-          <w:rFonts w:ascii="Arial" w:cs="Arial" w:eastAsia="Arial" w:hAnsi="Arial"/>
-          <w:sz w:val="20"/>
-          <w:szCs w:val="20"/>
-        </w:rPr>
-        <w:t xml:space="preserve"> e permite nova tentativa.</w:t>
+        <w:t xml:space="preserve">O precheck da action confere todos os campos de uma vez (obrigatórios e formato), antes da execução, com a mesma regra usada na simulação.</w:t>
       </w:r>
     </w:p>
     <w:p>
@@ -33952,7 +33789,41 @@
           <w:sz w:val="20"/>
           <w:szCs w:val="20"/>
         </w:rPr>
-        <w:t xml:space="preserve">Apenas a última tentativa é mantida.</w:t>
+        <w:t xml:space="preserve">Pagamento aprovado leva o pedido a </w:t>
+      </w:r>
+      <w:r>
+        <w:rPr>
+          <w:rFonts w:ascii="Consolas" w:cs="Consolas" w:eastAsia="Consolas" w:hAnsi="Consolas"/>
+          <w:color w:val="00144A"/>
+          <w:sz w:val="20"/>
+          <w:szCs w:val="20"/>
+        </w:rPr>
+        <w:t xml:space="preserve">AGUARDANDO_APROVACAO</w:t>
+      </w:r>
+      <w:r>
+        <w:rPr>
+          <w:rFonts w:ascii="Arial" w:cs="Arial" w:eastAsia="Arial" w:hAnsi="Arial"/>
+          <w:sz w:val="20"/>
+          <w:szCs w:val="20"/>
+        </w:rPr>
+        <w:t xml:space="preserve">; recusado mantém </w:t>
+      </w:r>
+      <w:r>
+        <w:rPr>
+          <w:rFonts w:ascii="Consolas" w:cs="Consolas" w:eastAsia="Consolas" w:hAnsi="Consolas"/>
+          <w:color w:val="00144A"/>
+          <w:sz w:val="20"/>
+          <w:szCs w:val="20"/>
+        </w:rPr>
+        <w:t xml:space="preserve">ABERTO</w:t>
+      </w:r>
+      <w:r>
+        <w:rPr>
+          <w:rFonts w:ascii="Arial" w:cs="Arial" w:eastAsia="Arial" w:hAnsi="Arial"/>
+          <w:sz w:val="20"/>
+          <w:szCs w:val="20"/>
+        </w:rPr>
+        <w:t xml:space="preserve"> e permite nova tentativa. A mensagem de recusa tem severidade de informação: um aviso numa action faz o Fiori Elements abrir um segundo pop-up de confirmação.</w:t>
       </w:r>
     </w:p>
     <w:p>
@@ -33970,7 +33841,76 @@
           <w:sz w:val="20"/>
           <w:szCs w:val="20"/>
         </w:rPr>
-        <w:t xml:space="preserve">Em cenário real, a captura deve usar componente dedicado ou tokenização do provedor de pagamento, porque os parâmetros de action aparecem sem máscara no Fiori Elements.</w:t>
+        <w:t xml:space="preserve">Apenas a última tentativa é mantida.</w:t>
+      </w:r>
+    </w:p>
+    <w:p>
+      <w:pPr>
+        <w:pStyle w:val="ListParagraph"/>
+        <w:numPr>
+          <w:ilvl w:val="0"/>
+          <w:numId w:val="2"/>
+        </w:numPr>
+        <w:spacing w:after="60"/>
+      </w:pPr>
+      <w:r>
+        <w:rPr>
+          <w:rFonts w:ascii="Arial" w:cs="Arial" w:eastAsia="Arial" w:hAnsi="Arial"/>
+          <w:sz w:val="20"/>
+          <w:szCs w:val="20"/>
+        </w:rPr>
+        <w:t xml:space="preserve">A aplicação Pedidos de Compras coleta os dados num diálogo próprio, com máscaras de entrada: número </w:t>
+      </w:r>
+      <w:r>
+        <w:rPr>
+          <w:rFonts w:ascii="Consolas" w:cs="Consolas" w:eastAsia="Consolas" w:hAnsi="Consolas"/>
+          <w:color w:val="00144A"/>
+          <w:sz w:val="20"/>
+          <w:szCs w:val="20"/>
+        </w:rPr>
+        <w:t xml:space="preserve">9999 9999 9999 9999</w:t>
+      </w:r>
+      <w:r>
+        <w:rPr>
+          <w:rFonts w:ascii="Arial" w:cs="Arial" w:eastAsia="Arial" w:hAnsi="Arial"/>
+          <w:sz w:val="20"/>
+          <w:szCs w:val="20"/>
+        </w:rPr>
+        <w:t xml:space="preserve">, validade </w:t>
+      </w:r>
+      <w:r>
+        <w:rPr>
+          <w:rFonts w:ascii="Consolas" w:cs="Consolas" w:eastAsia="Consolas" w:hAnsi="Consolas"/>
+          <w:color w:val="00144A"/>
+          <w:sz w:val="20"/>
+          <w:szCs w:val="20"/>
+        </w:rPr>
+        <w:t xml:space="preserve">99/99</w:t>
+      </w:r>
+      <w:r>
+        <w:rPr>
+          <w:rFonts w:ascii="Arial" w:cs="Arial" w:eastAsia="Arial" w:hAnsi="Arial"/>
+          <w:sz w:val="20"/>
+          <w:szCs w:val="20"/>
+        </w:rPr>
+        <w:t xml:space="preserve"> e CVV </w:t>
+      </w:r>
+      <w:r>
+        <w:rPr>
+          <w:rFonts w:ascii="Consolas" w:cs="Consolas" w:eastAsia="Consolas" w:hAnsi="Consolas"/>
+          <w:color w:val="00144A"/>
+          <w:sz w:val="20"/>
+          <w:szCs w:val="20"/>
+        </w:rPr>
+        <w:t xml:space="preserve">999</w:t>
+      </w:r>
+      <w:r>
+        <w:rPr>
+          <w:rFonts w:ascii="Arial" w:cs="Arial" w:eastAsia="Arial" w:hAnsi="Arial"/>
+          <w:sz w:val="20"/>
+          <w:szCs w:val="20"/>
+        </w:rPr>
+        <w:t xml:space="preserve">. Em cenário real, a captura deve usar componente dedicado ou tokenização do provedor de pagamento.</w:t>
       </w:r>
     </w:p>
     <w:p>
@@ -33984,7 +33924,7 @@
           <wp:inline distT="0" distB="0" distL="0" distR="0">
             <wp:extent cx="4876800" cy="2914650"/>
             <wp:effectExtent t="0" r="0" b="0" l="0"/>
-            <wp:docPr id="1" name="pagamento.png" descr="Diálogo da action Efetuar Pagamento" title="Figura 11 — Diálogo Efetuar Pagamento"/>
+            <wp:docPr id="1" name="pagamento.png" descr="Diálogo Efetuar Pagamento com máscaras no número do cartão, na validade e no CVV" title="Figura 11 — Diálogo Efetuar Pagamento, com máscaras de entrada"/>
             <wp:cNvGraphicFramePr>
               <a:graphicFrameLocks xmlns:a="http://schemas.openxmlformats.org/drawingml/2006/main" noChangeAspect="1"/>
             </wp:cNvGraphicFramePr>
@@ -34034,7 +33974,7 @@
           <w:sz w:val="18"/>
           <w:szCs w:val="18"/>
         </w:rPr>
-        <w:t xml:space="preserve">Figura 11 — Diálogo Efetuar Pagamento</w:t>
+        <w:t xml:space="preserve">Figura 11 — Diálogo Efetuar Pagamento, com máscaras de entrada</w:t>
       </w:r>
     </w:p>
     <w:p>
@@ -35548,29 +35488,7 @@
                 <w:sz w:val="17"/>
                 <w:szCs w:val="17"/>
               </w:rPr>
-              <w:t xml:space="preserve">Colunas (obrigatórias em </w:t>
-            </w:r>
-            <w:r>
-              <w:rPr>
-                <w:rFonts w:ascii="Arial" w:cs="Arial" w:eastAsia="Arial" w:hAnsi="Arial"/>
-                <w:b/>
-                <w:bCs/>
-                <w:color w:val="FFFFFF"/>
-                <w:sz w:val="17"/>
-                <w:szCs w:val="17"/>
-              </w:rPr>
-              <w:t xml:space="preserve">negrito</w:t>
-            </w:r>
-            <w:r>
-              <w:rPr>
-                <w:rFonts w:ascii="Arial" w:cs="Arial" w:eastAsia="Arial" w:hAnsi="Arial"/>
-                <w:b/>
-                <w:bCs/>
-                <w:color w:val="FFFFFF"/>
-                <w:sz w:val="17"/>
-                <w:szCs w:val="17"/>
-              </w:rPr>
-              <w:t xml:space="preserve">)</w:t>
+              <w:t xml:space="preserve">Colunas (obrigatórias em negrito)</w:t>
             </w:r>
           </w:p>
         </w:tc>
@@ -37158,7 +37076,7 @@
                 <w:sz w:val="17"/>
                 <w:szCs w:val="17"/>
               </w:rPr>
-              <w:t xml:space="preserve">Editar, Excluir, Definir endereço principal, Importar planilha</w:t>
+              <w:t xml:space="preserve">Editar, Excluir, Definir endereço principal (seleção única na tabela de endereços), Importar planilha</w:t>
             </w:r>
           </w:p>
         </w:tc>
@@ -37452,7 +37370,7 @@
                 <w:sz w:val="17"/>
                 <w:szCs w:val="17"/>
               </w:rPr>
-              <w:t xml:space="preserve">Aprovar reembolso, Rejeitar reembolso</w:t>
+              <w:t xml:space="preserve">Aprovar reembolso, Rejeitar reembolso (agrupadas no menu "Ações")</w:t>
             </w:r>
           </w:p>
         </w:tc>
@@ -37519,7 +37437,7 @@
         <w:rPr>
           <w:rFonts w:ascii="Arial" w:cs="Arial" w:eastAsia="Arial" w:hAnsi="Arial"/>
         </w:rPr>
-        <w:t xml:space="preserve">18.3 Apresentação</w:t>
+        <w:t xml:space="preserve">18.3 Confirmações e ações customizadas</w:t>
       </w:r>
     </w:p>
     <w:p>
@@ -37537,7 +37455,7 @@
           <w:sz w:val="20"/>
           <w:szCs w:val="20"/>
         </w:rPr>
-        <w:t xml:space="preserve">Campos de cliente, endereço e item mostram o texto descritivo, sem o UUID técnico.</w:t>
+        <w:t xml:space="preserve">Toda ação que muda o ciclo de vida pede confirmação antes de executar: Efetuar Pagamento, Aprovar pedido, Cancelar pedido, Aprovar reembolso e Rejeitar reembolso.</w:t>
       </w:r>
     </w:p>
     <w:p>
@@ -37555,7 +37473,24 @@
           <w:sz w:val="20"/>
           <w:szCs w:val="20"/>
         </w:rPr>
-        <w:t xml:space="preserve">Códigos de CodeList aparecem só como texto, com criticidade nos status.</w:t>
+        <w:t xml:space="preserve">O Fiori Elements só confirma ações sem diálogo de parâmetros (</w:t>
+      </w:r>
+      <w:r>
+        <w:rPr>
+          <w:rFonts w:ascii="Consolas" w:cs="Consolas" w:eastAsia="Consolas" w:hAnsi="Consolas"/>
+          <w:color w:val="00144A"/>
+          <w:sz w:val="20"/>
+          <w:szCs w:val="20"/>
+        </w:rPr>
+        <w:t xml:space="preserve">Common.IsActionCritical</w:t>
+      </w:r>
+      <w:r>
+        <w:rPr>
+          <w:rFonts w:ascii="Arial" w:cs="Arial" w:eastAsia="Arial" w:hAnsi="Arial"/>
+          <w:sz w:val="20"/>
+          <w:szCs w:val="20"/>
+        </w:rPr>
+        <w:t xml:space="preserve">). Aprovar pedido usa essa confirmação padrão; as demais têm parâmetros e são botões customizados das aplicações, que pedem a confirmação e então executam a action do RAP.</w:t>
       </w:r>
     </w:p>
     <w:p>
@@ -37573,25 +37508,41 @@
           <w:sz w:val="20"/>
           <w:szCs w:val="20"/>
         </w:rPr>
-        <w:t xml:space="preserve">Score do cliente em %, como </w:t>
-      </w:r>
-      <w:r>
-        <w:rPr>
-          <w:rFonts w:ascii="Arial" w:cs="Arial" w:eastAsia="Arial" w:hAnsi="Arial"/>
-          <w:i/>
-          <w:iCs/>
-          <w:sz w:val="20"/>
-          <w:szCs w:val="20"/>
-        </w:rPr>
-        <w:t xml:space="preserve">Process Indicator</w:t>
-      </w:r>
-      <w:r>
-        <w:rPr>
-          <w:rFonts w:ascii="Arial" w:cs="Arial" w:eastAsia="Arial" w:hAnsi="Arial"/>
-          <w:sz w:val="20"/>
-          <w:szCs w:val="20"/>
-        </w:rPr>
-        <w:t xml:space="preserve">: vermelho até 40, amarelo de 40 a 70, verde a partir de 70.</w:t>
+        <w:t xml:space="preserve">As metadata extensions mantêm as ações padrão no menu "Ações" (</w:t>
+      </w:r>
+      <w:r>
+        <w:rPr>
+          <w:rFonts w:ascii="Consolas" w:cs="Consolas" w:eastAsia="Consolas" w:hAnsi="Consolas"/>
+          <w:color w:val="00144A"/>
+          <w:sz w:val="20"/>
+          <w:szCs w:val="20"/>
+        </w:rPr>
+        <w:t xml:space="preserve">#FOR_ACTION_GROUP</w:t>
+      </w:r>
+      <w:r>
+        <w:rPr>
+          <w:rFonts w:ascii="Arial" w:cs="Arial" w:eastAsia="Arial" w:hAnsi="Arial"/>
+          <w:sz w:val="20"/>
+          <w:szCs w:val="20"/>
+        </w:rPr>
+        <w:t xml:space="preserve">), para o Preview do serviço. Nas aplicações, o </w:t>
+      </w:r>
+      <w:r>
+        <w:rPr>
+          <w:rFonts w:ascii="Consolas" w:cs="Consolas" w:eastAsia="Consolas" w:hAnsi="Consolas"/>
+          <w:color w:val="00144A"/>
+          <w:sz w:val="20"/>
+          <w:szCs w:val="20"/>
+        </w:rPr>
+        <w:t xml:space="preserve">manifest.json</w:t>
+      </w:r>
+      <w:r>
+        <w:rPr>
+          <w:rFonts w:ascii="Arial" w:cs="Arial" w:eastAsia="Arial" w:hAnsi="Arial"/>
+          <w:sz w:val="20"/>
+          <w:szCs w:val="20"/>
+        </w:rPr>
+        <w:t xml:space="preserve"> substitui os itens desse menu pelos botões customizados.</w:t>
       </w:r>
     </w:p>
     <w:p>
@@ -37609,7 +37560,164 @@
           <w:sz w:val="20"/>
           <w:szCs w:val="20"/>
         </w:rPr>
-        <w:t xml:space="preserve">Fotos de cliente e item na Object Page; cliente sem foto mostra um avatar.</w:t>
+        <w:t xml:space="preserve">Os botões customizados seguem o mesmo feature control das ações padrão (</w:t>
+      </w:r>
+      <w:r>
+        <w:rPr>
+          <w:rFonts w:ascii="Consolas" w:cs="Consolas" w:eastAsia="Consolas" w:hAnsi="Consolas"/>
+          <w:color w:val="00144A"/>
+          <w:sz w:val="20"/>
+          <w:szCs w:val="20"/>
+        </w:rPr>
+        <w:t xml:space="preserve">__OperationControl</w:t>
+      </w:r>
+      <w:r>
+        <w:rPr>
+          <w:rFonts w:ascii="Arial" w:cs="Arial" w:eastAsia="Arial" w:hAnsi="Arial"/>
+          <w:sz w:val="20"/>
+          <w:szCs w:val="20"/>
+        </w:rPr>
+        <w:t xml:space="preserve"> de cada action), na lista e na Object Page.</w:t>
+      </w:r>
+    </w:p>
+    <w:p>
+      <w:pPr>
+        <w:keepNext/>
+        <w:spacing w:before="120" w:after="60"/>
+        <w:jc w:val="center"/>
+      </w:pPr>
+      <w:r>
+        <w:drawing>
+          <wp:inline distT="0" distB="0" distL="0" distR="0">
+            <wp:extent cx="4876800" cy="2914650"/>
+            <wp:effectExtent t="0" r="0" b="0" l="0"/>
+            <wp:docPr id="901" name="acoes-menu.png" descr="Object Page do pedido com o menu Ações aberto: Efetuar Pagamento, Aprovar pedido e Cancelar pedido" title="Figura 17 — Menu &quot;Ações&quot; do pedido, com os itens habilitados pelo status"/>
+            <wp:cNvGraphicFramePr>
+              <a:graphicFrameLocks xmlns:a="http://schemas.openxmlformats.org/drawingml/2006/main" noChangeAspect="1"/>
+            </wp:cNvGraphicFramePr>
+            <a:graphic xmlns:a="http://schemas.openxmlformats.org/drawingml/2006/main">
+              <a:graphicData uri="http://schemas.openxmlformats.org/drawingml/2006/picture">
+                <pic:pic xmlns:pic="http://schemas.openxmlformats.org/drawingml/2006/picture">
+                  <pic:nvPicPr>
+                    <pic:cNvPr id="0" name="" descr=""/>
+                    <pic:cNvPicPr>
+                      <a:picLocks noChangeAspect="1" noChangeArrowheads="1"/>
+                    </pic:cNvPicPr>
+                  </pic:nvPicPr>
+                  <pic:blipFill>
+                    <a:blip r:embed="rId34" cstate="none"/>
+                    <a:srcRect/>
+                    <a:stretch>
+                      <a:fillRect/>
+                    </a:stretch>
+                  </pic:blipFill>
+                  <pic:spPr bwMode="auto">
+                    <a:xfrm>
+                      <a:off x="0" y="0"/>
+                      <a:ext cx="4876800" cy="2914650"/>
+                    </a:xfrm>
+                    <a:prstGeom prst="rect">
+                      <a:avLst/>
+                    </a:prstGeom>
+                  </pic:spPr>
+                </pic:pic>
+              </a:graphicData>
+            </a:graphic>
+          </wp:inline>
+        </w:drawing>
+      </w:r>
+    </w:p>
+    <w:p>
+      <w:pPr>
+        <w:spacing w:after="200"/>
+        <w:jc w:val="center"/>
+      </w:pPr>
+      <w:r>
+        <w:rPr>
+          <w:rFonts w:ascii="Arial" w:cs="Arial" w:eastAsia="Arial" w:hAnsi="Arial"/>
+          <w:i/>
+          <w:iCs/>
+          <w:color w:val="5B6770"/>
+          <w:sz w:val="18"/>
+          <w:szCs w:val="18"/>
+        </w:rPr>
+        <w:t xml:space="preserve">Figura 17 — Menu "Ações" do pedido, com os itens habilitados pelo status</w:t>
+      </w:r>
+    </w:p>
+    <w:p>
+      <w:pPr>
+        <w:keepNext/>
+        <w:spacing w:before="120" w:after="60"/>
+        <w:jc w:val="center"/>
+      </w:pPr>
+      <w:r>
+        <w:drawing>
+          <wp:inline distT="0" distB="0" distL="0" distR="0">
+            <wp:extent cx="4876800" cy="2914650"/>
+            <wp:effectExtent t="0" r="0" b="0" l="0"/>
+            <wp:docPr id="902" name="confirmacao.png" descr="Pop-up de confirmação antes de cancelar o pedido" title="Figura 18 — Confirmação antes de cancelar o pedido"/>
+            <wp:cNvGraphicFramePr>
+              <a:graphicFrameLocks xmlns:a="http://schemas.openxmlformats.org/drawingml/2006/main" noChangeAspect="1"/>
+            </wp:cNvGraphicFramePr>
+            <a:graphic xmlns:a="http://schemas.openxmlformats.org/drawingml/2006/main">
+              <a:graphicData uri="http://schemas.openxmlformats.org/drawingml/2006/picture">
+                <pic:pic xmlns:pic="http://schemas.openxmlformats.org/drawingml/2006/picture">
+                  <pic:nvPicPr>
+                    <pic:cNvPr id="0" name="" descr=""/>
+                    <pic:cNvPicPr>
+                      <a:picLocks noChangeAspect="1" noChangeArrowheads="1"/>
+                    </pic:cNvPicPr>
+                  </pic:nvPicPr>
+                  <pic:blipFill>
+                    <a:blip r:embed="rId35" cstate="none"/>
+                    <a:srcRect/>
+                    <a:stretch>
+                      <a:fillRect/>
+                    </a:stretch>
+                  </pic:blipFill>
+                  <pic:spPr bwMode="auto">
+                    <a:xfrm>
+                      <a:off x="0" y="0"/>
+                      <a:ext cx="4876800" cy="2914650"/>
+                    </a:xfrm>
+                    <a:prstGeom prst="rect">
+                      <a:avLst/>
+                    </a:prstGeom>
+                  </pic:spPr>
+                </pic:pic>
+              </a:graphicData>
+            </a:graphic>
+          </wp:inline>
+        </w:drawing>
+      </w:r>
+    </w:p>
+    <w:p>
+      <w:pPr>
+        <w:spacing w:after="200"/>
+        <w:jc w:val="center"/>
+      </w:pPr>
+      <w:r>
+        <w:rPr>
+          <w:rFonts w:ascii="Arial" w:cs="Arial" w:eastAsia="Arial" w:hAnsi="Arial"/>
+          <w:i/>
+          <w:iCs/>
+          <w:color w:val="5B6770"/>
+          <w:sz w:val="18"/>
+          <w:szCs w:val="18"/>
+        </w:rPr>
+        <w:t xml:space="preserve">Figura 18 — Confirmação antes de cancelar o pedido</w:t>
+      </w:r>
+    </w:p>
+    <w:p>
+      <w:pPr>
+        <w:pStyle w:val="Heading2"/>
+        <w:keepNext/>
+      </w:pPr>
+      <w:r>
+        <w:rPr>
+          <w:rFonts w:ascii="Arial" w:cs="Arial" w:eastAsia="Arial" w:hAnsi="Arial"/>
+        </w:rPr>
+        <w:t xml:space="preserve">18.4 Apresentação</w:t>
       </w:r>
     </w:p>
     <w:p>
@@ -37627,37 +37735,7 @@
           <w:sz w:val="20"/>
           <w:szCs w:val="20"/>
         </w:rPr>
-        <w:t xml:space="preserve">Itens do pedido são criados </w:t>
-      </w:r>
-      <w:r>
-        <w:rPr>
-          <w:rFonts w:ascii="Arial" w:cs="Arial" w:eastAsia="Arial" w:hAnsi="Arial"/>
-          <w:i/>
-          <w:iCs/>
-          <w:sz w:val="20"/>
-          <w:szCs w:val="20"/>
-        </w:rPr>
-        <w:t xml:space="preserve">inline</w:t>
-      </w:r>
-      <w:r>
-        <w:rPr>
-          <w:rFonts w:ascii="Arial" w:cs="Arial" w:eastAsia="Arial" w:hAnsi="Arial"/>
-          <w:sz w:val="20"/>
-          <w:szCs w:val="20"/>
-        </w:rPr>
-        <w:t xml:space="preserve"> na tabela do rascunho.</w:t>
-      </w:r>
-    </w:p>
-    <w:p>
-      <w:pPr>
-        <w:pStyle w:val="Heading2"/>
-        <w:keepNext/>
-      </w:pPr>
-      <w:r>
-        <w:rPr>
-          <w:rFonts w:ascii="Arial" w:cs="Arial" w:eastAsia="Arial" w:hAnsi="Arial"/>
-        </w:rPr>
-        <w:t xml:space="preserve">18.4 Object Page dinâmica do pedido</w:t>
+        <w:t xml:space="preserve">Campos de cliente, endereço e item mostram o texto descritivo, sem o UUID técnico.</w:t>
       </w:r>
     </w:p>
     <w:p>
@@ -37675,7 +37753,7 @@
           <w:sz w:val="20"/>
           <w:szCs w:val="20"/>
         </w:rPr>
-        <w:t xml:space="preserve">Seções na ordem: Dados do Cliente, Dados do Pedido (com os campos administrativos), Itens, Pagamento e Finalização ou Cancelamento.</w:t>
+        <w:t xml:space="preserve">Códigos de CodeList aparecem só como texto, com criticidade nos status.</w:t>
       </w:r>
     </w:p>
     <w:p>
@@ -37693,24 +37771,25 @@
           <w:sz w:val="20"/>
           <w:szCs w:val="20"/>
         </w:rPr>
-        <w:t xml:space="preserve">Finalização e Cancelamento aparecem só nos status correspondentes, ocultas por expressão de anotação (</w:t>
-      </w:r>
-      <w:r>
-        <w:rPr>
-          <w:rFonts w:ascii="Consolas" w:cs="Consolas" w:eastAsia="Consolas" w:hAnsi="Consolas"/>
-          <w:color w:val="00144A"/>
-          <w:sz w:val="20"/>
-          <w:szCs w:val="20"/>
-        </w:rPr>
-        <w:t xml:space="preserve">hidden</w:t>
-      </w:r>
-      <w:r>
-        <w:rPr>
-          <w:rFonts w:ascii="Arial" w:cs="Arial" w:eastAsia="Arial" w:hAnsi="Arial"/>
-          <w:sz w:val="20"/>
-          <w:szCs w:val="20"/>
-        </w:rPr>
-        <w:t xml:space="preserve">) sobre indicadores persistidos do pedido.</w:t>
+        <w:t xml:space="preserve">Score do cliente em %, como </w:t>
+      </w:r>
+      <w:r>
+        <w:rPr>
+          <w:rFonts w:ascii="Arial" w:cs="Arial" w:eastAsia="Arial" w:hAnsi="Arial"/>
+          <w:i/>
+          <w:iCs/>
+          <w:sz w:val="20"/>
+          <w:szCs w:val="20"/>
+        </w:rPr>
+        <w:t xml:space="preserve">Process Indicator</w:t>
+      </w:r>
+      <w:r>
+        <w:rPr>
+          <w:rFonts w:ascii="Arial" w:cs="Arial" w:eastAsia="Arial" w:hAnsi="Arial"/>
+          <w:sz w:val="20"/>
+          <w:szCs w:val="20"/>
+        </w:rPr>
+        <w:t xml:space="preserve">: vermelho até 40, amarelo de 40 a 70, verde a partir de 70.</w:t>
       </w:r>
     </w:p>
     <w:p>
@@ -37728,41 +37807,7 @@
           <w:sz w:val="20"/>
           <w:szCs w:val="20"/>
         </w:rPr>
-        <w:t xml:space="preserve">Em </w:t>
-      </w:r>
-      <w:r>
-        <w:rPr>
-          <w:rFonts w:ascii="Consolas" w:cs="Consolas" w:eastAsia="Consolas" w:hAnsi="Consolas"/>
-          <w:color w:val="00144A"/>
-          <w:sz w:val="20"/>
-          <w:szCs w:val="20"/>
-        </w:rPr>
-        <w:t xml:space="preserve">FINALIZADO</w:t>
-      </w:r>
-      <w:r>
-        <w:rPr>
-          <w:rFonts w:ascii="Arial" w:cs="Arial" w:eastAsia="Arial" w:hAnsi="Arial"/>
-          <w:sz w:val="20"/>
-          <w:szCs w:val="20"/>
-        </w:rPr>
-        <w:t xml:space="preserve"> ou </w:t>
-      </w:r>
-      <w:r>
-        <w:rPr>
-          <w:rFonts w:ascii="Consolas" w:cs="Consolas" w:eastAsia="Consolas" w:hAnsi="Consolas"/>
-          <w:color w:val="00144A"/>
-          <w:sz w:val="20"/>
-          <w:szCs w:val="20"/>
-        </w:rPr>
-        <w:t xml:space="preserve">CANCELADO</w:t>
-      </w:r>
-      <w:r>
-        <w:rPr>
-          <w:rFonts w:ascii="Arial" w:cs="Arial" w:eastAsia="Arial" w:hAnsi="Arial"/>
-          <w:sz w:val="20"/>
-          <w:szCs w:val="20"/>
-        </w:rPr>
-        <w:t xml:space="preserve">, cliente e itens vêm dos snapshots; nos demais status, das tabelas principais.</w:t>
+        <w:t xml:space="preserve">Fotos de cliente e item na Object Page; cliente sem foto mostra um avatar.</w:t>
       </w:r>
     </w:p>
     <w:p>
@@ -37780,6 +37825,159 @@
           <w:sz w:val="20"/>
           <w:szCs w:val="20"/>
         </w:rPr>
+        <w:t xml:space="preserve">Itens do pedido são criados </w:t>
+      </w:r>
+      <w:r>
+        <w:rPr>
+          <w:rFonts w:ascii="Arial" w:cs="Arial" w:eastAsia="Arial" w:hAnsi="Arial"/>
+          <w:i/>
+          <w:iCs/>
+          <w:sz w:val="20"/>
+          <w:szCs w:val="20"/>
+        </w:rPr>
+        <w:t xml:space="preserve">inline</w:t>
+      </w:r>
+      <w:r>
+        <w:rPr>
+          <w:rFonts w:ascii="Arial" w:cs="Arial" w:eastAsia="Arial" w:hAnsi="Arial"/>
+          <w:sz w:val="20"/>
+          <w:szCs w:val="20"/>
+        </w:rPr>
+        <w:t xml:space="preserve"> na tabela do rascunho.</w:t>
+      </w:r>
+    </w:p>
+    <w:p>
+      <w:pPr>
+        <w:pStyle w:val="Heading2"/>
+        <w:keepNext/>
+      </w:pPr>
+      <w:r>
+        <w:rPr>
+          <w:rFonts w:ascii="Arial" w:cs="Arial" w:eastAsia="Arial" w:hAnsi="Arial"/>
+        </w:rPr>
+        <w:t xml:space="preserve">18.5 Object Page dinâmica do pedido</w:t>
+      </w:r>
+    </w:p>
+    <w:p>
+      <w:pPr>
+        <w:pStyle w:val="ListParagraph"/>
+        <w:numPr>
+          <w:ilvl w:val="0"/>
+          <w:numId w:val="2"/>
+        </w:numPr>
+        <w:spacing w:after="60"/>
+      </w:pPr>
+      <w:r>
+        <w:rPr>
+          <w:rFonts w:ascii="Arial" w:cs="Arial" w:eastAsia="Arial" w:hAnsi="Arial"/>
+          <w:sz w:val="20"/>
+          <w:szCs w:val="20"/>
+        </w:rPr>
+        <w:t xml:space="preserve">Seções na ordem: Dados do Cliente, Dados do Pedido (com os campos administrativos), Itens, Pagamento e Finalização ou Cancelamento.</w:t>
+      </w:r>
+    </w:p>
+    <w:p>
+      <w:pPr>
+        <w:pStyle w:val="ListParagraph"/>
+        <w:numPr>
+          <w:ilvl w:val="0"/>
+          <w:numId w:val="2"/>
+        </w:numPr>
+        <w:spacing w:after="60"/>
+      </w:pPr>
+      <w:r>
+        <w:rPr>
+          <w:rFonts w:ascii="Arial" w:cs="Arial" w:eastAsia="Arial" w:hAnsi="Arial"/>
+          <w:sz w:val="20"/>
+          <w:szCs w:val="20"/>
+        </w:rPr>
+        <w:t xml:space="preserve">Finalização e Cancelamento aparecem só nos status correspondentes, ocultas por expressão de anotação (</w:t>
+      </w:r>
+      <w:r>
+        <w:rPr>
+          <w:rFonts w:ascii="Consolas" w:cs="Consolas" w:eastAsia="Consolas" w:hAnsi="Consolas"/>
+          <w:color w:val="00144A"/>
+          <w:sz w:val="20"/>
+          <w:szCs w:val="20"/>
+        </w:rPr>
+        <w:t xml:space="preserve">hidden</w:t>
+      </w:r>
+      <w:r>
+        <w:rPr>
+          <w:rFonts w:ascii="Arial" w:cs="Arial" w:eastAsia="Arial" w:hAnsi="Arial"/>
+          <w:sz w:val="20"/>
+          <w:szCs w:val="20"/>
+        </w:rPr>
+        <w:t xml:space="preserve">) sobre indicadores persistidos do pedido.</w:t>
+      </w:r>
+    </w:p>
+    <w:p>
+      <w:pPr>
+        <w:pStyle w:val="ListParagraph"/>
+        <w:numPr>
+          <w:ilvl w:val="0"/>
+          <w:numId w:val="2"/>
+        </w:numPr>
+        <w:spacing w:after="60"/>
+      </w:pPr>
+      <w:r>
+        <w:rPr>
+          <w:rFonts w:ascii="Arial" w:cs="Arial" w:eastAsia="Arial" w:hAnsi="Arial"/>
+          <w:sz w:val="20"/>
+          <w:szCs w:val="20"/>
+        </w:rPr>
+        <w:t xml:space="preserve">Em </w:t>
+      </w:r>
+      <w:r>
+        <w:rPr>
+          <w:rFonts w:ascii="Consolas" w:cs="Consolas" w:eastAsia="Consolas" w:hAnsi="Consolas"/>
+          <w:color w:val="00144A"/>
+          <w:sz w:val="20"/>
+          <w:szCs w:val="20"/>
+        </w:rPr>
+        <w:t xml:space="preserve">FINALIZADO</w:t>
+      </w:r>
+      <w:r>
+        <w:rPr>
+          <w:rFonts w:ascii="Arial" w:cs="Arial" w:eastAsia="Arial" w:hAnsi="Arial"/>
+          <w:sz w:val="20"/>
+          <w:szCs w:val="20"/>
+        </w:rPr>
+        <w:t xml:space="preserve"> ou </w:t>
+      </w:r>
+      <w:r>
+        <w:rPr>
+          <w:rFonts w:ascii="Consolas" w:cs="Consolas" w:eastAsia="Consolas" w:hAnsi="Consolas"/>
+          <w:color w:val="00144A"/>
+          <w:sz w:val="20"/>
+          <w:szCs w:val="20"/>
+        </w:rPr>
+        <w:t xml:space="preserve">CANCELADO</w:t>
+      </w:r>
+      <w:r>
+        <w:rPr>
+          <w:rFonts w:ascii="Arial" w:cs="Arial" w:eastAsia="Arial" w:hAnsi="Arial"/>
+          <w:sz w:val="20"/>
+          <w:szCs w:val="20"/>
+        </w:rPr>
+        <w:t xml:space="preserve">, cliente e itens vêm dos snapshots; nos demais status, das tabelas principais.</w:t>
+      </w:r>
+    </w:p>
+    <w:p>
+      <w:pPr>
+        <w:pStyle w:val="ListParagraph"/>
+        <w:numPr>
+          <w:ilvl w:val="0"/>
+          <w:numId w:val="2"/>
+        </w:numPr>
+        <w:spacing w:after="60"/>
+      </w:pPr>
+      <w:r>
+        <w:rPr>
+          <w:rFonts w:ascii="Arial" w:cs="Arial" w:eastAsia="Arial" w:hAnsi="Arial"/>
+          <w:sz w:val="20"/>
+          <w:szCs w:val="20"/>
+        </w:rPr>
         <w:t xml:space="preserve">Pagamento e snapshot do cliente (composições </w:t>
       </w:r>
       <w:r>
@@ -37811,7 +38009,7 @@
           <wp:inline distT="0" distB="0" distL="0" distR="0">
             <wp:extent cx="4876800" cy="2914650"/>
             <wp:effectExtent t="0" r="0" b="0" l="0"/>
-            <wp:docPr id="1" name="finalizado.png" descr="Pedido finalizado com o snapshot do cliente" title="Figura 17 — Object Page do pedido finalizado"/>
+            <wp:docPr id="1" name="finalizado.png" descr="Pedido finalizado com o snapshot do cliente" title="Figura 19 — Object Page do pedido finalizado"/>
             <wp:cNvGraphicFramePr>
               <a:graphicFrameLocks xmlns:a="http://schemas.openxmlformats.org/drawingml/2006/main" noChangeAspect="1"/>
             </wp:cNvGraphicFramePr>
@@ -37861,7 +38059,7 @@
           <w:sz w:val="18"/>
           <w:szCs w:val="18"/>
         </w:rPr>
-        <w:t xml:space="preserve">Figura 17 — Object Page do pedido finalizado</w:t>
+        <w:t xml:space="preserve">Figura 19 — Object Page do pedido finalizado</w:t>
       </w:r>
     </w:p>
     <w:p>
@@ -37873,7 +38071,7 @@
         <w:rPr>
           <w:rFonts w:ascii="Arial" w:cs="Arial" w:eastAsia="Arial" w:hAnsi="Arial"/>
         </w:rPr>
-        <w:t xml:space="preserve">18.5 Telas das demais aplicações</w:t>
+        <w:t xml:space="preserve">18.6 Telas das demais aplicações</w:t>
       </w:r>
     </w:p>
     <w:p>
@@ -37887,7 +38085,7 @@
           <wp:inline distT="0" distB="0" distL="0" distR="0">
             <wp:extent cx="4876800" cy="2914650"/>
             <wp:effectExtent t="0" r="0" b="0" l="0"/>
-            <wp:docPr id="1" name="lista.png" descr="Lista de clientes" title="Figura 18 — Gestão de Clientes: lista"/>
+            <wp:docPr id="1" name="lista.png" descr="Lista de clientes" title="Figura 20 — Gestão de Clientes: lista"/>
             <wp:cNvGraphicFramePr>
               <a:graphicFrameLocks xmlns:a="http://schemas.openxmlformats.org/drawingml/2006/main" noChangeAspect="1"/>
             </wp:cNvGraphicFramePr>
@@ -37937,7 +38135,7 @@
           <w:sz w:val="18"/>
           <w:szCs w:val="18"/>
         </w:rPr>
-        <w:t xml:space="preserve">Figura 18 — Gestão de Clientes: lista</w:t>
+        <w:t xml:space="preserve">Figura 20 — Gestão de Clientes: lista</w:t>
       </w:r>
     </w:p>
     <w:p>
@@ -37951,7 +38149,7 @@
           <wp:inline distT="0" distB="0" distL="0" distR="0">
             <wp:extent cx="4876800" cy="2914650"/>
             <wp:effectExtent t="0" r="0" b="0" l="0"/>
-            <wp:docPr id="1" name="cliente.png" descr="Object Page do cliente com score e endereços" title="Figura 19 — Gestão de Clientes: Object Page"/>
+            <wp:docPr id="1" name="cliente.png" descr="Object Page do cliente com score e endereços" title="Figura 21 — Gestão de Clientes: Object Page"/>
             <wp:cNvGraphicFramePr>
               <a:graphicFrameLocks xmlns:a="http://schemas.openxmlformats.org/drawingml/2006/main" noChangeAspect="1"/>
             </wp:cNvGraphicFramePr>
@@ -38001,7 +38199,7 @@
           <w:sz w:val="18"/>
           <w:szCs w:val="18"/>
         </w:rPr>
-        <w:t xml:space="preserve">Figura 19 — Gestão de Clientes: Object Page</w:t>
+        <w:t xml:space="preserve">Figura 21 — Gestão de Clientes: Object Page</w:t>
       </w:r>
     </w:p>
     <w:p>
@@ -38015,7 +38213,7 @@
           <wp:inline distT="0" distB="0" distL="0" distR="0">
             <wp:extent cx="4876800" cy="2914650"/>
             <wp:effectExtent t="0" r="0" b="0" l="0"/>
-            <wp:docPr id="1" name="lista.png" descr="Lista de itens de estoque" title="Figura 20 — Gestão de Estoque: lista"/>
+            <wp:docPr id="1" name="lista.png" descr="Lista de itens de estoque" title="Figura 22 — Gestão de Estoque: lista"/>
             <wp:cNvGraphicFramePr>
               <a:graphicFrameLocks xmlns:a="http://schemas.openxmlformats.org/drawingml/2006/main" noChangeAspect="1"/>
             </wp:cNvGraphicFramePr>
@@ -38065,7 +38263,7 @@
           <w:sz w:val="18"/>
           <w:szCs w:val="18"/>
         </w:rPr>
-        <w:t xml:space="preserve">Figura 20 — Gestão de Estoque: lista</w:t>
+        <w:t xml:space="preserve">Figura 22 — Gestão de Estoque: lista</w:t>
       </w:r>
     </w:p>
     <w:p>
@@ -38079,7 +38277,7 @@
           <wp:inline distT="0" distB="0" distL="0" distR="0">
             <wp:extent cx="4876800" cy="2914650"/>
             <wp:effectExtent t="0" r="0" b="0" l="0"/>
-            <wp:docPr id="1" name="item.png" descr="Object Page do item com SKU gerado no Save" title="Figura 21 — Gestão de Estoque: Object Page"/>
+            <wp:docPr id="1" name="item.png" descr="Object Page do item com SKU gerado no Save" title="Figura 23 — Gestão de Estoque: Object Page"/>
             <wp:cNvGraphicFramePr>
               <a:graphicFrameLocks xmlns:a="http://schemas.openxmlformats.org/drawingml/2006/main" noChangeAspect="1"/>
             </wp:cNvGraphicFramePr>
@@ -38129,7 +38327,7 @@
           <w:sz w:val="18"/>
           <w:szCs w:val="18"/>
         </w:rPr>
-        <w:t xml:space="preserve">Figura 21 — Gestão de Estoque: Object Page</w:t>
+        <w:t xml:space="preserve">Figura 23 — Gestão de Estoque: Object Page</w:t>
       </w:r>
     </w:p>
     <w:p>
@@ -38143,7 +38341,7 @@
           <wp:inline distT="0" distB="0" distL="0" distR="0">
             <wp:extent cx="4876800" cy="2914650"/>
             <wp:effectExtent t="0" r="0" b="0" l="0"/>
-            <wp:docPr id="1" name="lista.png" descr="Lista de reembolsos" title="Figura 22 — Gestão de Reembolsos: lista"/>
+            <wp:docPr id="1" name="lista.png" descr="Lista de reembolsos" title="Figura 24 — Gestão de Reembolsos: lista"/>
             <wp:cNvGraphicFramePr>
               <a:graphicFrameLocks xmlns:a="http://schemas.openxmlformats.org/drawingml/2006/main" noChangeAspect="1"/>
             </wp:cNvGraphicFramePr>
@@ -38193,7 +38391,7 @@
           <w:sz w:val="18"/>
           <w:szCs w:val="18"/>
         </w:rPr>
-        <w:t xml:space="preserve">Figura 22 — Gestão de Reembolsos: lista</w:t>
+        <w:t xml:space="preserve">Figura 24 — Gestão de Reembolsos: lista</w:t>
       </w:r>
     </w:p>
     <w:p>
@@ -38219,7 +38417,7 @@
           <wp:inline distT="0" distB="0" distL="0" distR="0">
             <wp:extent cx="6096000" cy="1943100"/>
             <wp:effectExtent t="0" r="0" b="0" l="0"/>
-            <wp:docPr id="1" name="fluxo-analises.png" descr="Fluxograma dos apps de análise: catálogo do domínio, $apply com filter, groupby e aggregate, agregação no servidor, painel e detalhe" title="Figura 23 — Apps de análise"/>
+            <wp:docPr id="1" name="fluxo-analises.png" descr="Fluxograma dos apps de análise: catálogo do domínio, $apply com filter, groupby e aggregate, agregação no servidor, painel e detalhe" title="Figura 25 — Apps de análise"/>
             <wp:cNvGraphicFramePr>
               <a:graphicFrameLocks xmlns:a="http://schemas.openxmlformats.org/drawingml/2006/main" noChangeAspect="1"/>
             </wp:cNvGraphicFramePr>
@@ -38269,7 +38467,7 @@
           <w:sz w:val="18"/>
           <w:szCs w:val="18"/>
         </w:rPr>
-        <w:t xml:space="preserve">Figura 23 — Apps de análise</w:t>
+        <w:t xml:space="preserve">Figura 25 — Apps de análise</w:t>
       </w:r>
     </w:p>
     <w:p>
@@ -39267,7 +39465,7 @@
           <wp:inline distT="0" distB="0" distL="0" distR="0">
             <wp:extent cx="4876800" cy="2914650"/>
             <wp:effectExtent t="0" r="0" b="0" l="0"/>
-            <wp:docPr id="1" name="pedidos.png" descr="Painel da Análise de Pedidos de Compras" title="Figura 24 — Painel da Análise de Pedidos de Compras"/>
+            <wp:docPr id="1" name="pedidos.png" descr="Painel da Análise de Pedidos de Compras" title="Figura 26 — Painel da Análise de Pedidos de Compras"/>
             <wp:cNvGraphicFramePr>
               <a:graphicFrameLocks xmlns:a="http://schemas.openxmlformats.org/drawingml/2006/main" noChangeAspect="1"/>
             </wp:cNvGraphicFramePr>
@@ -39317,7 +39515,7 @@
           <w:sz w:val="18"/>
           <w:szCs w:val="18"/>
         </w:rPr>
-        <w:t xml:space="preserve">Figura 24 — Painel da Análise de Pedidos de Compras</w:t>
+        <w:t xml:space="preserve">Figura 26 — Painel da Análise de Pedidos de Compras</w:t>
       </w:r>
     </w:p>
     <w:p>
@@ -39331,7 +39529,7 @@
           <wp:inline distT="0" distB="0" distL="0" distR="0">
             <wp:extent cx="4876800" cy="2914650"/>
             <wp:effectExtent t="0" r="0" b="0" l="0"/>
-            <wp:docPr id="1" name="detalhe.png" descr="Detalhe da análise Valor dos reembolsos por status" title="Figura 25 — Página de detalhe de uma análise"/>
+            <wp:docPr id="1" name="detalhe.png" descr="Detalhe da análise Valor dos reembolsos por status" title="Figura 27 — Página de detalhe de uma análise"/>
             <wp:cNvGraphicFramePr>
               <a:graphicFrameLocks xmlns:a="http://schemas.openxmlformats.org/drawingml/2006/main" noChangeAspect="1"/>
             </wp:cNvGraphicFramePr>
@@ -39381,7 +39579,7 @@
           <w:sz w:val="18"/>
           <w:szCs w:val="18"/>
         </w:rPr>
-        <w:t xml:space="preserve">Figura 25 — Página de detalhe de uma análise</w:t>
+        <w:t xml:space="preserve">Figura 27 — Página de detalhe de uma análise</w:t>
       </w:r>
     </w:p>
     <w:p>
@@ -39740,7 +39938,7 @@
                 <w:sz w:val="17"/>
                 <w:szCs w:val="17"/>
               </w:rPr>
-              <w:t xml:space="preserve">Endereços</w:t>
+              <w:t xml:space="preserve">Clientes</w:t>
             </w:r>
           </w:p>
         </w:tc>
@@ -39770,7 +39968,7 @@
                 <w:sz w:val="17"/>
                 <w:szCs w:val="17"/>
               </w:rPr>
-              <w:t xml:space="preserve">Action </w:t>
+              <w:t xml:space="preserve">Precheck do update + validation </w:t>
             </w:r>
             <w:r>
               <w:rPr>
@@ -39779,7 +39977,7 @@
                 <w:sz w:val="17"/>
                 <w:szCs w:val="17"/>
               </w:rPr>
-              <w:t xml:space="preserve">DefinirEnderecoPrincipal</w:t>
+              <w:t xml:space="preserve">ValidarInativacaoCliente</w:t>
             </w:r>
           </w:p>
         </w:tc>
@@ -39809,7 +40007,7 @@
                 <w:sz w:val="17"/>
                 <w:szCs w:val="17"/>
               </w:rPr>
-              <w:t xml:space="preserve">Define o principal e desmarca os demais</w:t>
+              <w:t xml:space="preserve">Bloqueia inativar cliente com pedido em andamento, na alteração e no Save</w:t>
             </w:r>
           </w:p>
         </w:tc>
@@ -39874,7 +40072,7 @@
                 <w:sz w:val="17"/>
                 <w:szCs w:val="17"/>
               </w:rPr>
-              <w:t xml:space="preserve">Determination </w:t>
+              <w:t xml:space="preserve">Action </w:t>
             </w:r>
             <w:r>
               <w:rPr>
@@ -39883,7 +40081,15 @@
                 <w:sz w:val="17"/>
                 <w:szCs w:val="17"/>
               </w:rPr>
-              <w:t xml:space="preserve">PreencherEnderecoViaCep</w:t>
+              <w:t xml:space="preserve">DefinirEnderecoPrincipal</w:t>
+            </w:r>
+            <w:r>
+              <w:rPr>
+                <w:rFonts w:ascii="Arial" w:cs="Arial" w:eastAsia="Arial" w:hAnsi="Arial"/>
+                <w:sz w:val="17"/>
+                <w:szCs w:val="17"/>
+              </w:rPr>
+              <w:t xml:space="preserve"> com precheck</w:t>
             </w:r>
           </w:p>
         </w:tc>
@@ -39913,7 +40119,7 @@
                 <w:sz w:val="17"/>
                 <w:szCs w:val="17"/>
               </w:rPr>
-              <w:t xml:space="preserve">Preenche o endereço a partir do CEP</w:t>
+              <w:t xml:space="preserve">Define o principal e desmarca os demais; recusa vários endereços do mesmo cliente, o que já é principal e CEP não validado</w:t>
             </w:r>
           </w:p>
         </w:tc>
@@ -39978,7 +40184,7 @@
                 <w:sz w:val="17"/>
                 <w:szCs w:val="17"/>
               </w:rPr>
-              <w:t xml:space="preserve">Validations </w:t>
+              <w:t xml:space="preserve">Determination </w:t>
             </w:r>
             <w:r>
               <w:rPr>
@@ -39987,41 +40193,7 @@
                 <w:sz w:val="17"/>
                 <w:szCs w:val="17"/>
               </w:rPr>
-              <w:t xml:space="preserve">ValidarCep</w:t>
-            </w:r>
-            <w:r>
-              <w:rPr>
-                <w:rFonts w:ascii="Arial" w:cs="Arial" w:eastAsia="Arial" w:hAnsi="Arial"/>
-                <w:sz w:val="17"/>
-                <w:szCs w:val="17"/>
-              </w:rPr>
-              <w:t xml:space="preserve">, </w:t>
-            </w:r>
-            <w:r>
-              <w:rPr>
-                <w:rFonts w:ascii="Consolas" w:cs="Consolas" w:eastAsia="Consolas" w:hAnsi="Consolas"/>
-                <w:color w:val="00144A"/>
-                <w:sz w:val="17"/>
-                <w:szCs w:val="17"/>
-              </w:rPr>
-              <w:t xml:space="preserve">ValidarCepUnico</w:t>
-            </w:r>
-            <w:r>
-              <w:rPr>
-                <w:rFonts w:ascii="Arial" w:cs="Arial" w:eastAsia="Arial" w:hAnsi="Arial"/>
-                <w:sz w:val="17"/>
-                <w:szCs w:val="17"/>
-              </w:rPr>
-              <w:t xml:space="preserve">, </w:t>
-            </w:r>
-            <w:r>
-              <w:rPr>
-                <w:rFonts w:ascii="Consolas" w:cs="Consolas" w:eastAsia="Consolas" w:hAnsi="Consolas"/>
-                <w:color w:val="00144A"/>
-                <w:sz w:val="17"/>
-                <w:szCs w:val="17"/>
-              </w:rPr>
-              <w:t xml:space="preserve">ValidarNumero</w:t>
+              <w:t xml:space="preserve">PreencherEnderecoViaCep</w:t>
             </w:r>
           </w:p>
         </w:tc>
@@ -40051,7 +40223,7 @@
                 <w:sz w:val="17"/>
                 <w:szCs w:val="17"/>
               </w:rPr>
-              <w:t xml:space="preserve">CEP válido e único por cliente; número obrigatório</w:t>
+              <w:t xml:space="preserve">Preenche o endereço a partir do CEP</w:t>
             </w:r>
           </w:p>
         </w:tc>
@@ -40116,7 +40288,50 @@
                 <w:sz w:val="17"/>
                 <w:szCs w:val="17"/>
               </w:rPr>
-              <w:t xml:space="preserve">Feature control do campo Cep</w:t>
+              <w:t xml:space="preserve">Validations </w:t>
+            </w:r>
+            <w:r>
+              <w:rPr>
+                <w:rFonts w:ascii="Consolas" w:cs="Consolas" w:eastAsia="Consolas" w:hAnsi="Consolas"/>
+                <w:color w:val="00144A"/>
+                <w:sz w:val="17"/>
+                <w:szCs w:val="17"/>
+              </w:rPr>
+              <w:t xml:space="preserve">ValidarCep</w:t>
+            </w:r>
+            <w:r>
+              <w:rPr>
+                <w:rFonts w:ascii="Arial" w:cs="Arial" w:eastAsia="Arial" w:hAnsi="Arial"/>
+                <w:sz w:val="17"/>
+                <w:szCs w:val="17"/>
+              </w:rPr>
+              <w:t xml:space="preserve">, </w:t>
+            </w:r>
+            <w:r>
+              <w:rPr>
+                <w:rFonts w:ascii="Consolas" w:cs="Consolas" w:eastAsia="Consolas" w:hAnsi="Consolas"/>
+                <w:color w:val="00144A"/>
+                <w:sz w:val="17"/>
+                <w:szCs w:val="17"/>
+              </w:rPr>
+              <w:t xml:space="preserve">ValidarCepUnico</w:t>
+            </w:r>
+            <w:r>
+              <w:rPr>
+                <w:rFonts w:ascii="Arial" w:cs="Arial" w:eastAsia="Arial" w:hAnsi="Arial"/>
+                <w:sz w:val="17"/>
+                <w:szCs w:val="17"/>
+              </w:rPr>
+              <w:t xml:space="preserve">, </w:t>
+            </w:r>
+            <w:r>
+              <w:rPr>
+                <w:rFonts w:ascii="Consolas" w:cs="Consolas" w:eastAsia="Consolas" w:hAnsi="Consolas"/>
+                <w:color w:val="00144A"/>
+                <w:sz w:val="17"/>
+                <w:szCs w:val="17"/>
+              </w:rPr>
+              <w:t xml:space="preserve">ValidarNumero</w:t>
             </w:r>
           </w:p>
         </w:tc>
@@ -40146,7 +40361,7 @@
                 <w:sz w:val="17"/>
                 <w:szCs w:val="17"/>
               </w:rPr>
-              <w:t xml:space="preserve">Obrigatório no cadastro, somente leitura depois de gravado</w:t>
+              <w:t xml:space="preserve">CEP válido e único por cliente; número obrigatório</w:t>
             </w:r>
           </w:p>
         </w:tc>
@@ -40181,7 +40396,7 @@
                 <w:sz w:val="17"/>
                 <w:szCs w:val="17"/>
               </w:rPr>
-              <w:t xml:space="preserve">Estoque</w:t>
+              <w:t xml:space="preserve">Endereços</w:t>
             </w:r>
           </w:p>
         </w:tc>
@@ -40211,24 +40426,7 @@
                 <w:sz w:val="17"/>
                 <w:szCs w:val="17"/>
               </w:rPr>
-              <w:t xml:space="preserve">Determination </w:t>
-            </w:r>
-            <w:r>
-              <w:rPr>
-                <w:rFonts w:ascii="Consolas" w:cs="Consolas" w:eastAsia="Consolas" w:hAnsi="Consolas"/>
-                <w:color w:val="00144A"/>
-                <w:sz w:val="17"/>
-                <w:szCs w:val="17"/>
-              </w:rPr>
-              <w:t xml:space="preserve">GerarSku</w:t>
-            </w:r>
-            <w:r>
-              <w:rPr>
-                <w:rFonts w:ascii="Arial" w:cs="Arial" w:eastAsia="Arial" w:hAnsi="Arial"/>
-                <w:sz w:val="17"/>
-                <w:szCs w:val="17"/>
-              </w:rPr>
-              <w:t xml:space="preserve"> (on save, também no Prepare)</w:t>
+              <w:t xml:space="preserve">Feature control do campo Cep</w:t>
             </w:r>
           </w:p>
         </w:tc>
@@ -40258,7 +40456,7 @@
                 <w:sz w:val="17"/>
                 <w:szCs w:val="17"/>
               </w:rPr>
-              <w:t xml:space="preserve">SKU único com o prefixo da categoria</w:t>
+              <w:t xml:space="preserve">Obrigatório no cadastro, somente leitura depois de gravado</w:t>
             </w:r>
           </w:p>
         </w:tc>
@@ -40332,7 +40530,15 @@
                 <w:sz w:val="17"/>
                 <w:szCs w:val="17"/>
               </w:rPr>
-              <w:t xml:space="preserve">RecalcularStatusEstoque</w:t>
+              <w:t xml:space="preserve">GerarSku</w:t>
+            </w:r>
+            <w:r>
+              <w:rPr>
+                <w:rFonts w:ascii="Arial" w:cs="Arial" w:eastAsia="Arial" w:hAnsi="Arial"/>
+                <w:sz w:val="17"/>
+                <w:szCs w:val="17"/>
+              </w:rPr>
+              <w:t xml:space="preserve"> (on save, também no Prepare)</w:t>
             </w:r>
           </w:p>
         </w:tc>
@@ -40362,7 +40568,7 @@
                 <w:sz w:val="17"/>
                 <w:szCs w:val="17"/>
               </w:rPr>
-              <w:t xml:space="preserve">Disponível e status conforme a quantidade</w:t>
+              <w:t xml:space="preserve">SKU único com o prefixo da categoria</w:t>
             </w:r>
           </w:p>
         </w:tc>
@@ -40427,7 +40633,7 @@
                 <w:sz w:val="17"/>
                 <w:szCs w:val="17"/>
               </w:rPr>
-              <w:t xml:space="preserve">Validations </w:t>
+              <w:t xml:space="preserve">Determination </w:t>
             </w:r>
             <w:r>
               <w:rPr>
@@ -40436,75 +40642,7 @@
                 <w:sz w:val="17"/>
                 <w:szCs w:val="17"/>
               </w:rPr>
-              <w:t xml:space="preserve">ValidarItem</w:t>
-            </w:r>
-            <w:r>
-              <w:rPr>
-                <w:rFonts w:ascii="Arial" w:cs="Arial" w:eastAsia="Arial" w:hAnsi="Arial"/>
-                <w:sz w:val="17"/>
-                <w:szCs w:val="17"/>
-              </w:rPr>
-              <w:t xml:space="preserve">, </w:t>
-            </w:r>
-            <w:r>
-              <w:rPr>
-                <w:rFonts w:ascii="Consolas" w:cs="Consolas" w:eastAsia="Consolas" w:hAnsi="Consolas"/>
-                <w:color w:val="00144A"/>
-                <w:sz w:val="17"/>
-                <w:szCs w:val="17"/>
-              </w:rPr>
-              <w:t xml:space="preserve">ValidarQuantidades</w:t>
-            </w:r>
-            <w:r>
-              <w:rPr>
-                <w:rFonts w:ascii="Arial" w:cs="Arial" w:eastAsia="Arial" w:hAnsi="Arial"/>
-                <w:sz w:val="17"/>
-                <w:szCs w:val="17"/>
-              </w:rPr>
-              <w:t xml:space="preserve">, </w:t>
-            </w:r>
-            <w:r>
-              <w:rPr>
-                <w:rFonts w:ascii="Consolas" w:cs="Consolas" w:eastAsia="Consolas" w:hAnsi="Consolas"/>
-                <w:color w:val="00144A"/>
-                <w:sz w:val="17"/>
-                <w:szCs w:val="17"/>
-              </w:rPr>
-              <w:t xml:space="preserve">ValidarInativacaoItem</w:t>
-            </w:r>
-            <w:r>
-              <w:rPr>
-                <w:rFonts w:ascii="Arial" w:cs="Arial" w:eastAsia="Arial" w:hAnsi="Arial"/>
-                <w:sz w:val="17"/>
-                <w:szCs w:val="17"/>
-              </w:rPr>
-              <w:t xml:space="preserve">, </w:t>
-            </w:r>
-            <w:r>
-              <w:rPr>
-                <w:rFonts w:ascii="Consolas" w:cs="Consolas" w:eastAsia="Consolas" w:hAnsi="Consolas"/>
-                <w:color w:val="00144A"/>
-                <w:sz w:val="17"/>
-                <w:szCs w:val="17"/>
-              </w:rPr>
-              <w:t xml:space="preserve">ValidarSkuUnico</w:t>
-            </w:r>
-            <w:r>
-              <w:rPr>
-                <w:rFonts w:ascii="Arial" w:cs="Arial" w:eastAsia="Arial" w:hAnsi="Arial"/>
-                <w:sz w:val="17"/>
-                <w:szCs w:val="17"/>
-              </w:rPr>
-              <w:t xml:space="preserve">, </w:t>
-            </w:r>
-            <w:r>
-              <w:rPr>
-                <w:rFonts w:ascii="Consolas" w:cs="Consolas" w:eastAsia="Consolas" w:hAnsi="Consolas"/>
-                <w:color w:val="00144A"/>
-                <w:sz w:val="17"/>
-                <w:szCs w:val="17"/>
-              </w:rPr>
-              <w:t xml:space="preserve">ValidarFoto</w:t>
+              <w:t xml:space="preserve">RecalcularStatusEstoque</w:t>
             </w:r>
           </w:p>
         </w:tc>
@@ -40534,7 +40672,7 @@
                 <w:sz w:val="17"/>
                 <w:szCs w:val="17"/>
               </w:rPr>
-              <w:t xml:space="preserve">Dados, quantidades, inativação, unicidade e foto</w:t>
+              <w:t xml:space="preserve">Disponível e status conforme a quantidade</w:t>
             </w:r>
           </w:p>
         </w:tc>
@@ -40599,7 +40737,7 @@
                 <w:sz w:val="17"/>
                 <w:szCs w:val="17"/>
               </w:rPr>
-              <w:t xml:space="preserve">Actions internas </w:t>
+              <w:t xml:space="preserve">Validations </w:t>
             </w:r>
             <w:r>
               <w:rPr>
@@ -40608,7 +40746,7 @@
                 <w:sz w:val="17"/>
                 <w:szCs w:val="17"/>
               </w:rPr>
-              <w:t xml:space="preserve">ReservarEstoque</w:t>
+              <w:t xml:space="preserve">ValidarItem</w:t>
             </w:r>
             <w:r>
               <w:rPr>
@@ -40625,7 +40763,7 @@
                 <w:sz w:val="17"/>
                 <w:szCs w:val="17"/>
               </w:rPr>
-              <w:t xml:space="preserve">LiberarReserva</w:t>
+              <w:t xml:space="preserve">ValidarQuantidades</w:t>
             </w:r>
             <w:r>
               <w:rPr>
@@ -40642,7 +40780,41 @@
                 <w:sz w:val="17"/>
                 <w:szCs w:val="17"/>
               </w:rPr>
-              <w:t xml:space="preserve">BaixarEstoque</w:t>
+              <w:t xml:space="preserve">ValidarInativacaoItem</w:t>
+            </w:r>
+            <w:r>
+              <w:rPr>
+                <w:rFonts w:ascii="Arial" w:cs="Arial" w:eastAsia="Arial" w:hAnsi="Arial"/>
+                <w:sz w:val="17"/>
+                <w:szCs w:val="17"/>
+              </w:rPr>
+              <w:t xml:space="preserve">, </w:t>
+            </w:r>
+            <w:r>
+              <w:rPr>
+                <w:rFonts w:ascii="Consolas" w:cs="Consolas" w:eastAsia="Consolas" w:hAnsi="Consolas"/>
+                <w:color w:val="00144A"/>
+                <w:sz w:val="17"/>
+                <w:szCs w:val="17"/>
+              </w:rPr>
+              <w:t xml:space="preserve">ValidarSkuUnico</w:t>
+            </w:r>
+            <w:r>
+              <w:rPr>
+                <w:rFonts w:ascii="Arial" w:cs="Arial" w:eastAsia="Arial" w:hAnsi="Arial"/>
+                <w:sz w:val="17"/>
+                <w:szCs w:val="17"/>
+              </w:rPr>
+              <w:t xml:space="preserve">, </w:t>
+            </w:r>
+            <w:r>
+              <w:rPr>
+                <w:rFonts w:ascii="Consolas" w:cs="Consolas" w:eastAsia="Consolas" w:hAnsi="Consolas"/>
+                <w:color w:val="00144A"/>
+                <w:sz w:val="17"/>
+                <w:szCs w:val="17"/>
+              </w:rPr>
+              <w:t xml:space="preserve">ValidarFoto</w:t>
             </w:r>
           </w:p>
         </w:tc>
@@ -40672,7 +40844,7 @@
                 <w:sz w:val="17"/>
                 <w:szCs w:val="17"/>
               </w:rPr>
-              <w:t xml:space="preserve">Movimentam o estoque sob lock; só o BO Pedido as chama</w:t>
+              <w:t xml:space="preserve">Dados, quantidades, inativação, unicidade e foto</w:t>
             </w:r>
           </w:p>
         </w:tc>
@@ -40707,7 +40879,7 @@
                 <w:sz w:val="17"/>
                 <w:szCs w:val="17"/>
               </w:rPr>
-              <w:t xml:space="preserve">Pedidos</w:t>
+              <w:t xml:space="preserve">Estoque</w:t>
             </w:r>
           </w:p>
         </w:tc>
@@ -40737,33 +40909,7 @@
                 <w:sz w:val="17"/>
                 <w:szCs w:val="17"/>
               </w:rPr>
-              <w:t xml:space="preserve">Validation </w:t>
-            </w:r>
-            <w:r>
-              <w:rPr>
-                <w:rFonts w:ascii="Consolas" w:cs="Consolas" w:eastAsia="Consolas" w:hAnsi="Consolas"/>
-                <w:color w:val="00144A"/>
-                <w:sz w:val="17"/>
-                <w:szCs w:val="17"/>
-              </w:rPr>
-              <w:t xml:space="preserve">ValidarRegistro</w:t>
-            </w:r>
-            <w:r>
-              <w:rPr>
-                <w:rFonts w:ascii="Arial" w:cs="Arial" w:eastAsia="Arial" w:hAnsi="Arial"/>
-                <w:sz w:val="17"/>
-                <w:szCs w:val="17"/>
-              </w:rPr>
-              <w:t xml:space="preserve"> + determination </w:t>
-            </w:r>
-            <w:r>
-              <w:rPr>
-                <w:rFonts w:ascii="Consolas" w:cs="Consolas" w:eastAsia="Consolas" w:hAnsi="Consolas"/>
-                <w:color w:val="00144A"/>
-                <w:sz w:val="17"/>
-                <w:szCs w:val="17"/>
-              </w:rPr>
-              <w:t xml:space="preserve">ReservarEstoqueRegistro</w:t>
+              <w:t xml:space="preserve">Precheck do update</w:t>
             </w:r>
           </w:p>
         </w:tc>
@@ -40793,7 +40939,7 @@
                 <w:sz w:val="17"/>
                 <w:szCs w:val="17"/>
               </w:rPr>
-              <w:t xml:space="preserve">Registro com reserva pela diferença</w:t>
+              <w:t xml:space="preserve">Barra a inativação com disponível ou pedido ativo já na alteração do campo</w:t>
             </w:r>
           </w:p>
         </w:tc>
@@ -40828,7 +40974,7 @@
                 <w:sz w:val="17"/>
                 <w:szCs w:val="17"/>
               </w:rPr>
-              <w:t xml:space="preserve">Pedidos</w:t>
+              <w:t xml:space="preserve">Estoque</w:t>
             </w:r>
           </w:p>
         </w:tc>
@@ -40858,7 +41004,7 @@
                 <w:sz w:val="17"/>
                 <w:szCs w:val="17"/>
               </w:rPr>
-              <w:t xml:space="preserve">Draft action </w:t>
+              <w:t xml:space="preserve">Actions internas </w:t>
             </w:r>
             <w:r>
               <w:rPr>
@@ -40867,15 +41013,41 @@
                 <w:sz w:val="17"/>
                 <w:szCs w:val="17"/>
               </w:rPr>
-              <w:t xml:space="preserve">Activate</w:t>
-            </w:r>
-            <w:r>
-              <w:rPr>
-                <w:rFonts w:ascii="Arial" w:cs="Arial" w:eastAsia="Arial" w:hAnsi="Arial"/>
-                <w:sz w:val="17"/>
-                <w:szCs w:val="17"/>
-              </w:rPr>
-              <w:t xml:space="preserve"> com implementação adicional</w:t>
+              <w:t xml:space="preserve">ReservarEstoque</w:t>
+            </w:r>
+            <w:r>
+              <w:rPr>
+                <w:rFonts w:ascii="Arial" w:cs="Arial" w:eastAsia="Arial" w:hAnsi="Arial"/>
+                <w:sz w:val="17"/>
+                <w:szCs w:val="17"/>
+              </w:rPr>
+              <w:t xml:space="preserve">, </w:t>
+            </w:r>
+            <w:r>
+              <w:rPr>
+                <w:rFonts w:ascii="Consolas" w:cs="Consolas" w:eastAsia="Consolas" w:hAnsi="Consolas"/>
+                <w:color w:val="00144A"/>
+                <w:sz w:val="17"/>
+                <w:szCs w:val="17"/>
+              </w:rPr>
+              <w:t xml:space="preserve">LiberarReserva</w:t>
+            </w:r>
+            <w:r>
+              <w:rPr>
+                <w:rFonts w:ascii="Arial" w:cs="Arial" w:eastAsia="Arial" w:hAnsi="Arial"/>
+                <w:sz w:val="17"/>
+                <w:szCs w:val="17"/>
+              </w:rPr>
+              <w:t xml:space="preserve">, </w:t>
+            </w:r>
+            <w:r>
+              <w:rPr>
+                <w:rFonts w:ascii="Consolas" w:cs="Consolas" w:eastAsia="Consolas" w:hAnsi="Consolas"/>
+                <w:color w:val="00144A"/>
+                <w:sz w:val="17"/>
+                <w:szCs w:val="17"/>
+              </w:rPr>
+              <w:t xml:space="preserve">BaixarEstoque</w:t>
             </w:r>
           </w:p>
         </w:tc>
@@ -40905,7 +41077,7 @@
                 <w:sz w:val="17"/>
                 <w:szCs w:val="17"/>
               </w:rPr>
-              <w:t xml:space="preserve">Libera a reserva de itens removidos</w:t>
+              <w:t xml:space="preserve">Movimentam o estoque sob lock; só o BO Pedido as chama</w:t>
             </w:r>
           </w:p>
         </w:tc>
@@ -40970,7 +41142,7 @@
                 <w:sz w:val="17"/>
                 <w:szCs w:val="17"/>
               </w:rPr>
-              <w:t xml:space="preserve">Determinations </w:t>
+              <w:t xml:space="preserve">Validation </w:t>
             </w:r>
             <w:r>
               <w:rPr>
@@ -40979,15 +41151,15 @@
                 <w:sz w:val="17"/>
                 <w:szCs w:val="17"/>
               </w:rPr>
-              <w:t xml:space="preserve">DefinirStatusInicial</w:t>
-            </w:r>
-            <w:r>
-              <w:rPr>
-                <w:rFonts w:ascii="Arial" w:cs="Arial" w:eastAsia="Arial" w:hAnsi="Arial"/>
-                <w:sz w:val="17"/>
-                <w:szCs w:val="17"/>
-              </w:rPr>
-              <w:t xml:space="preserve">, </w:t>
+              <w:t xml:space="preserve">ValidarRegistro</w:t>
+            </w:r>
+            <w:r>
+              <w:rPr>
+                <w:rFonts w:ascii="Arial" w:cs="Arial" w:eastAsia="Arial" w:hAnsi="Arial"/>
+                <w:sz w:val="17"/>
+                <w:szCs w:val="17"/>
+              </w:rPr>
+              <w:t xml:space="preserve"> + determination </w:t>
             </w:r>
             <w:r>
               <w:rPr>
@@ -40996,75 +41168,7 @@
                 <w:sz w:val="17"/>
                 <w:szCs w:val="17"/>
               </w:rPr>
-              <w:t xml:space="preserve">GerarNumeroPedido</w:t>
-            </w:r>
-            <w:r>
-              <w:rPr>
-                <w:rFonts w:ascii="Arial" w:cs="Arial" w:eastAsia="Arial" w:hAnsi="Arial"/>
-                <w:sz w:val="17"/>
-                <w:szCs w:val="17"/>
-              </w:rPr>
-              <w:t xml:space="preserve">, </w:t>
-            </w:r>
-            <w:r>
-              <w:rPr>
-                <w:rFonts w:ascii="Consolas" w:cs="Consolas" w:eastAsia="Consolas" w:hAnsi="Consolas"/>
-                <w:color w:val="00144A"/>
-                <w:sz w:val="17"/>
-                <w:szCs w:val="17"/>
-              </w:rPr>
-              <w:t xml:space="preserve">AtualizarEndereco</w:t>
-            </w:r>
-            <w:r>
-              <w:rPr>
-                <w:rFonts w:ascii="Arial" w:cs="Arial" w:eastAsia="Arial" w:hAnsi="Arial"/>
-                <w:sz w:val="17"/>
-                <w:szCs w:val="17"/>
-              </w:rPr>
-              <w:t xml:space="preserve">, </w:t>
-            </w:r>
-            <w:r>
-              <w:rPr>
-                <w:rFonts w:ascii="Consolas" w:cs="Consolas" w:eastAsia="Consolas" w:hAnsi="Consolas"/>
-                <w:color w:val="00144A"/>
-                <w:sz w:val="17"/>
-                <w:szCs w:val="17"/>
-              </w:rPr>
-              <w:t xml:space="preserve">CalcularTotalPedido</w:t>
-            </w:r>
-            <w:r>
-              <w:rPr>
-                <w:rFonts w:ascii="Arial" w:cs="Arial" w:eastAsia="Arial" w:hAnsi="Arial"/>
-                <w:sz w:val="17"/>
-                <w:szCs w:val="17"/>
-              </w:rPr>
-              <w:t xml:space="preserve">, </w:t>
-            </w:r>
-            <w:r>
-              <w:rPr>
-                <w:rFonts w:ascii="Consolas" w:cs="Consolas" w:eastAsia="Consolas" w:hAnsi="Consolas"/>
-                <w:color w:val="00144A"/>
-                <w:sz w:val="17"/>
-                <w:szCs w:val="17"/>
-              </w:rPr>
-              <w:t xml:space="preserve">CalcularValorItem</w:t>
-            </w:r>
-            <w:r>
-              <w:rPr>
-                <w:rFonts w:ascii="Arial" w:cs="Arial" w:eastAsia="Arial" w:hAnsi="Arial"/>
-                <w:sz w:val="17"/>
-                <w:szCs w:val="17"/>
-              </w:rPr>
-              <w:t xml:space="preserve">, </w:t>
-            </w:r>
-            <w:r>
-              <w:rPr>
-                <w:rFonts w:ascii="Consolas" w:cs="Consolas" w:eastAsia="Consolas" w:hAnsi="Consolas"/>
-                <w:color w:val="00144A"/>
-                <w:sz w:val="17"/>
-                <w:szCs w:val="17"/>
-              </w:rPr>
-              <w:t xml:space="preserve">AtualizarFlagsStatus</w:t>
+              <w:t xml:space="preserve">ReservarEstoqueRegistro</w:t>
             </w:r>
           </w:p>
         </w:tc>
@@ -41094,7 +41198,7 @@
                 <w:sz w:val="17"/>
                 <w:szCs w:val="17"/>
               </w:rPr>
-              <w:t xml:space="preserve">Status inicial, número, endereço, totais e indicadores de status</w:t>
+              <w:t xml:space="preserve">Registro com reserva pela diferença</w:t>
             </w:r>
           </w:p>
         </w:tc>
@@ -41159,7 +41263,7 @@
                 <w:sz w:val="17"/>
                 <w:szCs w:val="17"/>
               </w:rPr>
-              <w:t xml:space="preserve">Validations </w:t>
+              <w:t xml:space="preserve">Draft action </w:t>
             </w:r>
             <w:r>
               <w:rPr>
@@ -41168,24 +41272,15 @@
                 <w:sz w:val="17"/>
                 <w:szCs w:val="17"/>
               </w:rPr>
-              <w:t xml:space="preserve">ValidarCliente</w:t>
-            </w:r>
-            <w:r>
-              <w:rPr>
-                <w:rFonts w:ascii="Arial" w:cs="Arial" w:eastAsia="Arial" w:hAnsi="Arial"/>
-                <w:sz w:val="17"/>
-                <w:szCs w:val="17"/>
-              </w:rPr>
-              <w:t xml:space="preserve">, </w:t>
-            </w:r>
-            <w:r>
-              <w:rPr>
-                <w:rFonts w:ascii="Consolas" w:cs="Consolas" w:eastAsia="Consolas" w:hAnsi="Consolas"/>
-                <w:color w:val="00144A"/>
-                <w:sz w:val="17"/>
-                <w:szCs w:val="17"/>
-              </w:rPr>
-              <w:t xml:space="preserve">ValidarItemPedido</w:t>
+              <w:t xml:space="preserve">Activate</w:t>
+            </w:r>
+            <w:r>
+              <w:rPr>
+                <w:rFonts w:ascii="Arial" w:cs="Arial" w:eastAsia="Arial" w:hAnsi="Arial"/>
+                <w:sz w:val="17"/>
+                <w:szCs w:val="17"/>
+              </w:rPr>
+              <w:t xml:space="preserve"> com implementação adicional</w:t>
             </w:r>
           </w:p>
         </w:tc>
@@ -41215,7 +41310,7 @@
                 <w:sz w:val="17"/>
                 <w:szCs w:val="17"/>
               </w:rPr>
-              <w:t xml:space="preserve">Cliente ativo; item ativo com quantidade maior que zero</w:t>
+              <w:t xml:space="preserve">Libera a reserva de itens removidos</w:t>
             </w:r>
           </w:p>
         </w:tc>
@@ -41280,7 +41375,101 @@
                 <w:sz w:val="17"/>
                 <w:szCs w:val="17"/>
               </w:rPr>
-              <w:t xml:space="preserve">Precheck da inclusão de item</w:t>
+              <w:t xml:space="preserve">Determinations </w:t>
+            </w:r>
+            <w:r>
+              <w:rPr>
+                <w:rFonts w:ascii="Consolas" w:cs="Consolas" w:eastAsia="Consolas" w:hAnsi="Consolas"/>
+                <w:color w:val="00144A"/>
+                <w:sz w:val="17"/>
+                <w:szCs w:val="17"/>
+              </w:rPr>
+              <w:t xml:space="preserve">DefinirStatusInicial</w:t>
+            </w:r>
+            <w:r>
+              <w:rPr>
+                <w:rFonts w:ascii="Arial" w:cs="Arial" w:eastAsia="Arial" w:hAnsi="Arial"/>
+                <w:sz w:val="17"/>
+                <w:szCs w:val="17"/>
+              </w:rPr>
+              <w:t xml:space="preserve">, </w:t>
+            </w:r>
+            <w:r>
+              <w:rPr>
+                <w:rFonts w:ascii="Consolas" w:cs="Consolas" w:eastAsia="Consolas" w:hAnsi="Consolas"/>
+                <w:color w:val="00144A"/>
+                <w:sz w:val="17"/>
+                <w:szCs w:val="17"/>
+              </w:rPr>
+              <w:t xml:space="preserve">GerarNumeroPedido</w:t>
+            </w:r>
+            <w:r>
+              <w:rPr>
+                <w:rFonts w:ascii="Arial" w:cs="Arial" w:eastAsia="Arial" w:hAnsi="Arial"/>
+                <w:sz w:val="17"/>
+                <w:szCs w:val="17"/>
+              </w:rPr>
+              <w:t xml:space="preserve">, </w:t>
+            </w:r>
+            <w:r>
+              <w:rPr>
+                <w:rFonts w:ascii="Consolas" w:cs="Consolas" w:eastAsia="Consolas" w:hAnsi="Consolas"/>
+                <w:color w:val="00144A"/>
+                <w:sz w:val="17"/>
+                <w:szCs w:val="17"/>
+              </w:rPr>
+              <w:t xml:space="preserve">AtualizarEndereco</w:t>
+            </w:r>
+            <w:r>
+              <w:rPr>
+                <w:rFonts w:ascii="Arial" w:cs="Arial" w:eastAsia="Arial" w:hAnsi="Arial"/>
+                <w:sz w:val="17"/>
+                <w:szCs w:val="17"/>
+              </w:rPr>
+              <w:t xml:space="preserve">, </w:t>
+            </w:r>
+            <w:r>
+              <w:rPr>
+                <w:rFonts w:ascii="Consolas" w:cs="Consolas" w:eastAsia="Consolas" w:hAnsi="Consolas"/>
+                <w:color w:val="00144A"/>
+                <w:sz w:val="17"/>
+                <w:szCs w:val="17"/>
+              </w:rPr>
+              <w:t xml:space="preserve">CalcularTotalPedido</w:t>
+            </w:r>
+            <w:r>
+              <w:rPr>
+                <w:rFonts w:ascii="Arial" w:cs="Arial" w:eastAsia="Arial" w:hAnsi="Arial"/>
+                <w:sz w:val="17"/>
+                <w:szCs w:val="17"/>
+              </w:rPr>
+              <w:t xml:space="preserve">, </w:t>
+            </w:r>
+            <w:r>
+              <w:rPr>
+                <w:rFonts w:ascii="Consolas" w:cs="Consolas" w:eastAsia="Consolas" w:hAnsi="Consolas"/>
+                <w:color w:val="00144A"/>
+                <w:sz w:val="17"/>
+                <w:szCs w:val="17"/>
+              </w:rPr>
+              <w:t xml:space="preserve">CalcularValorItem</w:t>
+            </w:r>
+            <w:r>
+              <w:rPr>
+                <w:rFonts w:ascii="Arial" w:cs="Arial" w:eastAsia="Arial" w:hAnsi="Arial"/>
+                <w:sz w:val="17"/>
+                <w:szCs w:val="17"/>
+              </w:rPr>
+              <w:t xml:space="preserve">, </w:t>
+            </w:r>
+            <w:r>
+              <w:rPr>
+                <w:rFonts w:ascii="Consolas" w:cs="Consolas" w:eastAsia="Consolas" w:hAnsi="Consolas"/>
+                <w:color w:val="00144A"/>
+                <w:sz w:val="17"/>
+                <w:szCs w:val="17"/>
+              </w:rPr>
+              <w:t xml:space="preserve">AtualizarFlagsStatus</w:t>
             </w:r>
           </w:p>
         </w:tc>
@@ -41310,7 +41499,7 @@
                 <w:sz w:val="17"/>
                 <w:szCs w:val="17"/>
               </w:rPr>
-              <w:t xml:space="preserve">Bloqueia item sem estoque disponível</w:t>
+              <w:t xml:space="preserve">Status inicial, número, endereço, totais e indicadores de status</w:t>
             </w:r>
           </w:p>
         </w:tc>
@@ -41375,7 +41564,7 @@
                 <w:sz w:val="17"/>
                 <w:szCs w:val="17"/>
               </w:rPr>
-              <w:t xml:space="preserve">Action </w:t>
+              <w:t xml:space="preserve">Validations </w:t>
             </w:r>
             <w:r>
               <w:rPr>
@@ -41384,15 +41573,24 @@
                 <w:sz w:val="17"/>
                 <w:szCs w:val="17"/>
               </w:rPr>
-              <w:t xml:space="preserve">SimularPagamento</w:t>
-            </w:r>
-            <w:r>
-              <w:rPr>
-                <w:rFonts w:ascii="Arial" w:cs="Arial" w:eastAsia="Arial" w:hAnsi="Arial"/>
-                <w:sz w:val="17"/>
-                <w:szCs w:val="17"/>
-              </w:rPr>
-              <w:t xml:space="preserve"> (Efetuar Pagamento)</w:t>
+              <w:t xml:space="preserve">ValidarCliente</w:t>
+            </w:r>
+            <w:r>
+              <w:rPr>
+                <w:rFonts w:ascii="Arial" w:cs="Arial" w:eastAsia="Arial" w:hAnsi="Arial"/>
+                <w:sz w:val="17"/>
+                <w:szCs w:val="17"/>
+              </w:rPr>
+              <w:t xml:space="preserve">, </w:t>
+            </w:r>
+            <w:r>
+              <w:rPr>
+                <w:rFonts w:ascii="Consolas" w:cs="Consolas" w:eastAsia="Consolas" w:hAnsi="Consolas"/>
+                <w:color w:val="00144A"/>
+                <w:sz w:val="17"/>
+                <w:szCs w:val="17"/>
+              </w:rPr>
+              <w:t xml:space="preserve">ValidarItemPedido</w:t>
             </w:r>
           </w:p>
         </w:tc>
@@ -41422,7 +41620,7 @@
                 <w:sz w:val="17"/>
                 <w:szCs w:val="17"/>
               </w:rPr>
-              <w:t xml:space="preserve">Pagamento fictício sem dados sensíveis</w:t>
+              <w:t xml:space="preserve">Cliente ativo; item ativo com quantidade maior que zero</w:t>
             </w:r>
           </w:p>
         </w:tc>
@@ -41487,16 +41685,7 @@
                 <w:sz w:val="17"/>
                 <w:szCs w:val="17"/>
               </w:rPr>
-              <w:t xml:space="preserve">Action </w:t>
-            </w:r>
-            <w:r>
-              <w:rPr>
-                <w:rFonts w:ascii="Consolas" w:cs="Consolas" w:eastAsia="Consolas" w:hAnsi="Consolas"/>
-                <w:color w:val="00144A"/>
-                <w:sz w:val="17"/>
-                <w:szCs w:val="17"/>
-              </w:rPr>
-              <w:t xml:space="preserve">AprovarPedido</w:t>
+              <w:t xml:space="preserve">Precheck da inclusão de item</w:t>
             </w:r>
           </w:p>
         </w:tc>
@@ -41526,7 +41715,7 @@
                 <w:sz w:val="17"/>
                 <w:szCs w:val="17"/>
               </w:rPr>
-              <w:t xml:space="preserve">Baixa o estoque, gera snapshots e finaliza</w:t>
+              <w:t xml:space="preserve">Bloqueia item sem estoque disponível</w:t>
             </w:r>
           </w:p>
         </w:tc>
@@ -41600,7 +41789,15 @@
                 <w:sz w:val="17"/>
                 <w:szCs w:val="17"/>
               </w:rPr>
-              <w:t xml:space="preserve">CancelarPedido</w:t>
+              <w:t xml:space="preserve">SimularPagamento</w:t>
+            </w:r>
+            <w:r>
+              <w:rPr>
+                <w:rFonts w:ascii="Arial" w:cs="Arial" w:eastAsia="Arial" w:hAnsi="Arial"/>
+                <w:sz w:val="17"/>
+                <w:szCs w:val="17"/>
+              </w:rPr>
+              <w:t xml:space="preserve"> (Efetuar Pagamento) com precheck</w:t>
             </w:r>
           </w:p>
         </w:tc>
@@ -41630,7 +41827,7 @@
                 <w:sz w:val="17"/>
                 <w:szCs w:val="17"/>
               </w:rPr>
-              <w:t xml:space="preserve">Cancela ou abre a solicitação de reembolso</w:t>
+              <w:t xml:space="preserve">Pagamento fictício sem dados sensíveis; o precheck valida todos os campos do cartão de uma vez</w:t>
             </w:r>
           </w:p>
         </w:tc>
@@ -41695,7 +41892,7 @@
                 <w:sz w:val="17"/>
                 <w:szCs w:val="17"/>
               </w:rPr>
-              <w:t xml:space="preserve">Actions internas </w:t>
+              <w:t xml:space="preserve">Action </w:t>
             </w:r>
             <w:r>
               <w:rPr>
@@ -41704,41 +41901,7 @@
                 <w:sz w:val="17"/>
                 <w:szCs w:val="17"/>
               </w:rPr>
-              <w:t xml:space="preserve">CancelarPorReembolso</w:t>
-            </w:r>
-            <w:r>
-              <w:rPr>
-                <w:rFonts w:ascii="Arial" w:cs="Arial" w:eastAsia="Arial" w:hAnsi="Arial"/>
-                <w:sz w:val="17"/>
-                <w:szCs w:val="17"/>
-              </w:rPr>
-              <w:t xml:space="preserve">, </w:t>
-            </w:r>
-            <w:r>
-              <w:rPr>
-                <w:rFonts w:ascii="Consolas" w:cs="Consolas" w:eastAsia="Consolas" w:hAnsi="Consolas"/>
-                <w:color w:val="00144A"/>
-                <w:sz w:val="17"/>
-                <w:szCs w:val="17"/>
-              </w:rPr>
-              <w:t xml:space="preserve">RetomarPedido</w:t>
-            </w:r>
-            <w:r>
-              <w:rPr>
-                <w:rFonts w:ascii="Arial" w:cs="Arial" w:eastAsia="Arial" w:hAnsi="Arial"/>
-                <w:sz w:val="17"/>
-                <w:szCs w:val="17"/>
-              </w:rPr>
-              <w:t xml:space="preserve">, </w:t>
-            </w:r>
-            <w:r>
-              <w:rPr>
-                <w:rFonts w:ascii="Consolas" w:cs="Consolas" w:eastAsia="Consolas" w:hAnsi="Consolas"/>
-                <w:color w:val="00144A"/>
-                <w:sz w:val="17"/>
-                <w:szCs w:val="17"/>
-              </w:rPr>
-              <w:t xml:space="preserve">RecalcularTotal</w:t>
+              <w:t xml:space="preserve">AprovarPedido</w:t>
             </w:r>
           </w:p>
         </w:tc>
@@ -41768,7 +41931,7 @@
                 <w:sz w:val="17"/>
                 <w:szCs w:val="17"/>
               </w:rPr>
-              <w:t xml:space="preserve">Chamadas pelo BO Reembolso ou pelo próprio BO</w:t>
+              <w:t xml:space="preserve">Baixa o estoque, gera snapshots e finaliza</w:t>
             </w:r>
           </w:p>
         </w:tc>
@@ -41803,7 +41966,7 @@
                 <w:sz w:val="17"/>
                 <w:szCs w:val="17"/>
               </w:rPr>
-              <w:t xml:space="preserve">Reembolsos</w:t>
+              <w:t xml:space="preserve">Pedidos</w:t>
             </w:r>
           </w:p>
         </w:tc>
@@ -41833,7 +41996,7 @@
                 <w:sz w:val="17"/>
                 <w:szCs w:val="17"/>
               </w:rPr>
-              <w:t xml:space="preserve">Actions </w:t>
+              <w:t xml:space="preserve">Action </w:t>
             </w:r>
             <w:r>
               <w:rPr>
@@ -41842,24 +42005,7 @@
                 <w:sz w:val="17"/>
                 <w:szCs w:val="17"/>
               </w:rPr>
-              <w:t xml:space="preserve">AprovarReembolso</w:t>
-            </w:r>
-            <w:r>
-              <w:rPr>
-                <w:rFonts w:ascii="Arial" w:cs="Arial" w:eastAsia="Arial" w:hAnsi="Arial"/>
-                <w:sz w:val="17"/>
-                <w:szCs w:val="17"/>
-              </w:rPr>
-              <w:t xml:space="preserve">, </w:t>
-            </w:r>
-            <w:r>
-              <w:rPr>
-                <w:rFonts w:ascii="Consolas" w:cs="Consolas" w:eastAsia="Consolas" w:hAnsi="Consolas"/>
-                <w:color w:val="00144A"/>
-                <w:sz w:val="17"/>
-                <w:szCs w:val="17"/>
-              </w:rPr>
-              <w:t xml:space="preserve">RejeitarReembolso</w:t>
+              <w:t xml:space="preserve">CancelarPedido</w:t>
             </w:r>
           </w:p>
         </w:tc>
@@ -41889,24 +42035,7 @@
                 <w:sz w:val="17"/>
                 <w:szCs w:val="17"/>
               </w:rPr>
-              <w:t xml:space="preserve">Decidem a solicitação </w:t>
-            </w:r>
-            <w:r>
-              <w:rPr>
-                <w:rFonts w:ascii="Consolas" w:cs="Consolas" w:eastAsia="Consolas" w:hAnsi="Consolas"/>
-                <w:color w:val="00144A"/>
-                <w:sz w:val="17"/>
-                <w:szCs w:val="17"/>
-              </w:rPr>
-              <w:t xml:space="preserve">PENDENTE</w:t>
-            </w:r>
-            <w:r>
-              <w:rPr>
-                <w:rFonts w:ascii="Arial" w:cs="Arial" w:eastAsia="Arial" w:hAnsi="Arial"/>
-                <w:sz w:val="17"/>
-                <w:szCs w:val="17"/>
-              </w:rPr>
-              <w:t xml:space="preserve"> na mesma LUW</w:t>
+              <w:t xml:space="preserve">Cancela ou abre a solicitação de reembolso</w:t>
             </w:r>
           </w:p>
         </w:tc>
@@ -41941,7 +42070,7 @@
                 <w:sz w:val="17"/>
                 <w:szCs w:val="17"/>
               </w:rPr>
-              <w:t xml:space="preserve">Todos</w:t>
+              <w:t xml:space="preserve">Pedidos</w:t>
             </w:r>
           </w:p>
         </w:tc>
@@ -41971,7 +42100,7 @@
                 <w:sz w:val="17"/>
                 <w:szCs w:val="17"/>
               </w:rPr>
-              <w:t xml:space="preserve">Action estática </w:t>
+              <w:t xml:space="preserve">Actions internas </w:t>
             </w:r>
             <w:r>
               <w:rPr>
@@ -41980,6 +42109,282 @@
                 <w:sz w:val="17"/>
                 <w:szCs w:val="17"/>
               </w:rPr>
+              <w:t xml:space="preserve">CancelarPorReembolso</w:t>
+            </w:r>
+            <w:r>
+              <w:rPr>
+                <w:rFonts w:ascii="Arial" w:cs="Arial" w:eastAsia="Arial" w:hAnsi="Arial"/>
+                <w:sz w:val="17"/>
+                <w:szCs w:val="17"/>
+              </w:rPr>
+              <w:t xml:space="preserve">, </w:t>
+            </w:r>
+            <w:r>
+              <w:rPr>
+                <w:rFonts w:ascii="Consolas" w:cs="Consolas" w:eastAsia="Consolas" w:hAnsi="Consolas"/>
+                <w:color w:val="00144A"/>
+                <w:sz w:val="17"/>
+                <w:szCs w:val="17"/>
+              </w:rPr>
+              <w:t xml:space="preserve">RetomarPedido</w:t>
+            </w:r>
+            <w:r>
+              <w:rPr>
+                <w:rFonts w:ascii="Arial" w:cs="Arial" w:eastAsia="Arial" w:hAnsi="Arial"/>
+                <w:sz w:val="17"/>
+                <w:szCs w:val="17"/>
+              </w:rPr>
+              <w:t xml:space="preserve">, </w:t>
+            </w:r>
+            <w:r>
+              <w:rPr>
+                <w:rFonts w:ascii="Consolas" w:cs="Consolas" w:eastAsia="Consolas" w:hAnsi="Consolas"/>
+                <w:color w:val="00144A"/>
+                <w:sz w:val="17"/>
+                <w:szCs w:val="17"/>
+              </w:rPr>
+              <w:t xml:space="preserve">RecalcularTotal</w:t>
+            </w:r>
+          </w:p>
+        </w:tc>
+        <w:tc>
+          <w:tcPr>
+            <w:tcW w:type="dxa" w:w="3641"/>
+            <w:tcBorders>
+              <w:top w:val="single" w:color="C9D3DD" w:sz="4"/>
+              <w:left w:val="single" w:color="C9D3DD" w:sz="4"/>
+              <w:bottom w:val="single" w:color="C9D3DD" w:sz="4"/>
+              <w:right w:val="single" w:color="C9D3DD" w:sz="4"/>
+            </w:tcBorders>
+            <w:tcMar>
+              <w:top w:type="dxa" w:w="50"/>
+              <w:left w:type="dxa" w:w="80"/>
+              <w:bottom w:type="dxa" w:w="50"/>
+              <w:right w:type="dxa" w:w="80"/>
+            </w:tcMar>
+          </w:tcPr>
+          <w:p>
+            <w:pPr>
+              <w:spacing w:before="0" w:after="0"/>
+            </w:pPr>
+            <w:r>
+              <w:rPr>
+                <w:rFonts w:ascii="Arial" w:cs="Arial" w:eastAsia="Arial" w:hAnsi="Arial"/>
+                <w:sz w:val="17"/>
+                <w:szCs w:val="17"/>
+              </w:rPr>
+              <w:t xml:space="preserve">Chamadas pelo BO Reembolso ou pelo próprio BO</w:t>
+            </w:r>
+          </w:p>
+        </w:tc>
+      </w:tr>
+      <w:tr>
+        <w:trPr>
+          <w:cantSplit/>
+        </w:trPr>
+        <w:tc>
+          <w:tcPr>
+            <w:tcW w:type="dxa" w:w="1636"/>
+            <w:tcBorders>
+              <w:top w:val="single" w:color="C9D3DD" w:sz="4"/>
+              <w:left w:val="single" w:color="C9D3DD" w:sz="4"/>
+              <w:bottom w:val="single" w:color="C9D3DD" w:sz="4"/>
+              <w:right w:val="single" w:color="C9D3DD" w:sz="4"/>
+            </w:tcBorders>
+            <w:tcMar>
+              <w:top w:type="dxa" w:w="50"/>
+              <w:left w:type="dxa" w:w="80"/>
+              <w:bottom w:type="dxa" w:w="50"/>
+              <w:right w:type="dxa" w:w="80"/>
+            </w:tcMar>
+          </w:tcPr>
+          <w:p>
+            <w:pPr>
+              <w:spacing w:before="0" w:after="0"/>
+            </w:pPr>
+            <w:r>
+              <w:rPr>
+                <w:rFonts w:ascii="Arial" w:cs="Arial" w:eastAsia="Arial" w:hAnsi="Arial"/>
+                <w:sz w:val="17"/>
+                <w:szCs w:val="17"/>
+              </w:rPr>
+              <w:t xml:space="preserve">Reembolsos</w:t>
+            </w:r>
+          </w:p>
+        </w:tc>
+        <w:tc>
+          <w:tcPr>
+            <w:tcW w:type="dxa" w:w="4589"/>
+            <w:tcBorders>
+              <w:top w:val="single" w:color="C9D3DD" w:sz="4"/>
+              <w:left w:val="single" w:color="C9D3DD" w:sz="4"/>
+              <w:bottom w:val="single" w:color="C9D3DD" w:sz="4"/>
+              <w:right w:val="single" w:color="C9D3DD" w:sz="4"/>
+            </w:tcBorders>
+            <w:tcMar>
+              <w:top w:type="dxa" w:w="50"/>
+              <w:left w:type="dxa" w:w="80"/>
+              <w:bottom w:type="dxa" w:w="50"/>
+              <w:right w:type="dxa" w:w="80"/>
+            </w:tcMar>
+          </w:tcPr>
+          <w:p>
+            <w:pPr>
+              <w:spacing w:before="0" w:after="0"/>
+            </w:pPr>
+            <w:r>
+              <w:rPr>
+                <w:rFonts w:ascii="Arial" w:cs="Arial" w:eastAsia="Arial" w:hAnsi="Arial"/>
+                <w:sz w:val="17"/>
+                <w:szCs w:val="17"/>
+              </w:rPr>
+              <w:t xml:space="preserve">Actions </w:t>
+            </w:r>
+            <w:r>
+              <w:rPr>
+                <w:rFonts w:ascii="Consolas" w:cs="Consolas" w:eastAsia="Consolas" w:hAnsi="Consolas"/>
+                <w:color w:val="00144A"/>
+                <w:sz w:val="17"/>
+                <w:szCs w:val="17"/>
+              </w:rPr>
+              <w:t xml:space="preserve">AprovarReembolso</w:t>
+            </w:r>
+            <w:r>
+              <w:rPr>
+                <w:rFonts w:ascii="Arial" w:cs="Arial" w:eastAsia="Arial" w:hAnsi="Arial"/>
+                <w:sz w:val="17"/>
+                <w:szCs w:val="17"/>
+              </w:rPr>
+              <w:t xml:space="preserve">, </w:t>
+            </w:r>
+            <w:r>
+              <w:rPr>
+                <w:rFonts w:ascii="Consolas" w:cs="Consolas" w:eastAsia="Consolas" w:hAnsi="Consolas"/>
+                <w:color w:val="00144A"/>
+                <w:sz w:val="17"/>
+                <w:szCs w:val="17"/>
+              </w:rPr>
+              <w:t xml:space="preserve">RejeitarReembolso</w:t>
+            </w:r>
+          </w:p>
+        </w:tc>
+        <w:tc>
+          <w:tcPr>
+            <w:tcW w:type="dxa" w:w="3641"/>
+            <w:tcBorders>
+              <w:top w:val="single" w:color="C9D3DD" w:sz="4"/>
+              <w:left w:val="single" w:color="C9D3DD" w:sz="4"/>
+              <w:bottom w:val="single" w:color="C9D3DD" w:sz="4"/>
+              <w:right w:val="single" w:color="C9D3DD" w:sz="4"/>
+            </w:tcBorders>
+            <w:tcMar>
+              <w:top w:type="dxa" w:w="50"/>
+              <w:left w:type="dxa" w:w="80"/>
+              <w:bottom w:type="dxa" w:w="50"/>
+              <w:right w:type="dxa" w:w="80"/>
+            </w:tcMar>
+          </w:tcPr>
+          <w:p>
+            <w:pPr>
+              <w:spacing w:before="0" w:after="0"/>
+            </w:pPr>
+            <w:r>
+              <w:rPr>
+                <w:rFonts w:ascii="Arial" w:cs="Arial" w:eastAsia="Arial" w:hAnsi="Arial"/>
+                <w:sz w:val="17"/>
+                <w:szCs w:val="17"/>
+              </w:rPr>
+              <w:t xml:space="preserve">Decidem a solicitação </w:t>
+            </w:r>
+            <w:r>
+              <w:rPr>
+                <w:rFonts w:ascii="Consolas" w:cs="Consolas" w:eastAsia="Consolas" w:hAnsi="Consolas"/>
+                <w:color w:val="00144A"/>
+                <w:sz w:val="17"/>
+                <w:szCs w:val="17"/>
+              </w:rPr>
+              <w:t xml:space="preserve">PENDENTE</w:t>
+            </w:r>
+            <w:r>
+              <w:rPr>
+                <w:rFonts w:ascii="Arial" w:cs="Arial" w:eastAsia="Arial" w:hAnsi="Arial"/>
+                <w:sz w:val="17"/>
+                <w:szCs w:val="17"/>
+              </w:rPr>
+              <w:t xml:space="preserve"> na mesma LUW</w:t>
+            </w:r>
+          </w:p>
+        </w:tc>
+      </w:tr>
+      <w:tr>
+        <w:trPr>
+          <w:cantSplit/>
+        </w:trPr>
+        <w:tc>
+          <w:tcPr>
+            <w:tcW w:type="dxa" w:w="1636"/>
+            <w:tcBorders>
+              <w:top w:val="single" w:color="C9D3DD" w:sz="4"/>
+              <w:left w:val="single" w:color="C9D3DD" w:sz="4"/>
+              <w:bottom w:val="single" w:color="C9D3DD" w:sz="4"/>
+              <w:right w:val="single" w:color="C9D3DD" w:sz="4"/>
+            </w:tcBorders>
+            <w:tcMar>
+              <w:top w:type="dxa" w:w="50"/>
+              <w:left w:type="dxa" w:w="80"/>
+              <w:bottom w:type="dxa" w:w="50"/>
+              <w:right w:type="dxa" w:w="80"/>
+            </w:tcMar>
+          </w:tcPr>
+          <w:p>
+            <w:pPr>
+              <w:spacing w:before="0" w:after="0"/>
+            </w:pPr>
+            <w:r>
+              <w:rPr>
+                <w:rFonts w:ascii="Arial" w:cs="Arial" w:eastAsia="Arial" w:hAnsi="Arial"/>
+                <w:sz w:val="17"/>
+                <w:szCs w:val="17"/>
+              </w:rPr>
+              <w:t xml:space="preserve">Todos</w:t>
+            </w:r>
+          </w:p>
+        </w:tc>
+        <w:tc>
+          <w:tcPr>
+            <w:tcW w:type="dxa" w:w="4589"/>
+            <w:tcBorders>
+              <w:top w:val="single" w:color="C9D3DD" w:sz="4"/>
+              <w:left w:val="single" w:color="C9D3DD" w:sz="4"/>
+              <w:bottom w:val="single" w:color="C9D3DD" w:sz="4"/>
+              <w:right w:val="single" w:color="C9D3DD" w:sz="4"/>
+            </w:tcBorders>
+            <w:tcMar>
+              <w:top w:type="dxa" w:w="50"/>
+              <w:left w:type="dxa" w:w="80"/>
+              <w:bottom w:type="dxa" w:w="50"/>
+              <w:right w:type="dxa" w:w="80"/>
+            </w:tcMar>
+          </w:tcPr>
+          <w:p>
+            <w:pPr>
+              <w:spacing w:before="0" w:after="0"/>
+            </w:pPr>
+            <w:r>
+              <w:rPr>
+                <w:rFonts w:ascii="Arial" w:cs="Arial" w:eastAsia="Arial" w:hAnsi="Arial"/>
+                <w:sz w:val="17"/>
+                <w:szCs w:val="17"/>
+              </w:rPr>
+              <w:t xml:space="preserve">Action estática </w:t>
+            </w:r>
+            <w:r>
+              <w:rPr>
+                <w:rFonts w:ascii="Consolas" w:cs="Consolas" w:eastAsia="Consolas" w:hAnsi="Consolas"/>
+                <w:color w:val="00144A"/>
+                <w:sz w:val="17"/>
+                <w:szCs w:val="17"/>
+              </w:rPr>
               <w:t xml:space="preserve">ImportarPlanilha</w:t>
             </w:r>
           </w:p>
@@ -42016,6 +42421,54 @@
         </w:tc>
       </w:tr>
     </w:tbl>
+    <w:p>
+      <w:pPr>
+        <w:spacing w:before="160" w:after="120"/>
+        <w:jc w:val="left"/>
+      </w:pPr>
+      <w:r>
+        <w:rPr>
+          <w:rFonts w:ascii="Arial" w:cs="Arial" w:eastAsia="Arial" w:hAnsi="Arial"/>
+          <w:sz w:val="20"/>
+          <w:szCs w:val="20"/>
+        </w:rPr>
+        <w:t xml:space="preserve">Os handlers processam todas as instâncias de uma chamada em lote: nenhuma leitura ou gravação, por SQL ou por EML, fica dentro de laço. As consultas usam </w:t>
+      </w:r>
+      <w:r>
+        <w:rPr>
+          <w:rFonts w:ascii="Consolas" w:cs="Consolas" w:eastAsia="Consolas" w:hAnsi="Consolas"/>
+          <w:color w:val="00144A"/>
+          <w:sz w:val="20"/>
+          <w:szCs w:val="20"/>
+        </w:rPr>
+        <w:t xml:space="preserve">FOR ALL ENTRIES</w:t>
+      </w:r>
+      <w:r>
+        <w:rPr>
+          <w:rFonts w:ascii="Arial" w:cs="Arial" w:eastAsia="Arial" w:hAnsi="Arial"/>
+          <w:sz w:val="20"/>
+          <w:szCs w:val="20"/>
+        </w:rPr>
+        <w:t xml:space="preserve"> ou </w:t>
+      </w:r>
+      <w:r>
+        <w:rPr>
+          <w:rFonts w:ascii="Consolas" w:cs="Consolas" w:eastAsia="Consolas" w:hAnsi="Consolas"/>
+          <w:color w:val="00144A"/>
+          <w:sz w:val="20"/>
+          <w:szCs w:val="20"/>
+        </w:rPr>
+        <w:t xml:space="preserve">UNION</w:t>
+      </w:r>
+      <w:r>
+        <w:rPr>
+          <w:rFonts w:ascii="Arial" w:cs="Arial" w:eastAsia="Arial" w:hAnsi="Arial"/>
+          <w:sz w:val="20"/>
+          <w:szCs w:val="20"/>
+        </w:rPr>
+        <w:t xml:space="preserve"> com tabela de faixa; as CodeLists são lidas uma vez por chamada; as ações do pedido movimentam o estoque numa única chamada ao BO Item por tipo de movimento (com compensação se uma parte falhar) e criam snapshots e solicitações de reembolso numa única chamada EML. Ficam em laço, por natureza, a consulta ao ViaCEP (uma vez por CEP distinto), a numeração por objeto de numeração e o processamento de cada arquivo importado.</w:t>
+      </w:r>
+    </w:p>
     <w:p>
       <w:pPr>
         <w:spacing w:after="80"/>
@@ -42542,7 +42995,7 @@
                 <w:sz w:val="17"/>
                 <w:szCs w:val="17"/>
               </w:rPr>
-              <w:t xml:space="preserve">CEP_INDISPONIVEL</w:t>
+              <w:t xml:space="preserve">CLIENTE_INATIVACAO_BLOQUEADA</w:t>
             </w:r>
           </w:p>
         </w:tc>
@@ -42572,7 +43025,7 @@
                 <w:sz w:val="17"/>
                 <w:szCs w:val="17"/>
               </w:rPr>
-              <w:t xml:space="preserve">Não foi possível validar o CEP agora. Tente novamente em instantes.</w:t>
+              <w:t xml:space="preserve">Cliente possui pedido em andamento. Inativação bloqueada.</w:t>
             </w:r>
           </w:p>
         </w:tc>
@@ -42607,7 +43060,7 @@
                 <w:sz w:val="17"/>
                 <w:szCs w:val="17"/>
               </w:rPr>
-              <w:t xml:space="preserve">CEP_INVALIDO</w:t>
+              <w:t xml:space="preserve">ENDERECO_PRINCIPAL_UNICO</w:t>
             </w:r>
           </w:p>
         </w:tc>
@@ -42637,7 +43090,7 @@
                 <w:sz w:val="17"/>
                 <w:szCs w:val="17"/>
               </w:rPr>
-              <w:t xml:space="preserve">CEP inválido ou não encontrado. Verifique o número informado.</w:t>
+              <w:t xml:space="preserve">Selecione apenas um endereço para definir como principal.</w:t>
             </w:r>
           </w:p>
         </w:tc>
@@ -42672,7 +43125,7 @@
                 <w:sz w:val="17"/>
                 <w:szCs w:val="17"/>
               </w:rPr>
-              <w:t xml:space="preserve">CEP_DUPLICADO_CLIENTE</w:t>
+              <w:t xml:space="preserve">ENDERECO_JA_PRINCIPAL</w:t>
             </w:r>
           </w:p>
         </w:tc>
@@ -42702,7 +43155,7 @@
                 <w:sz w:val="17"/>
                 <w:szCs w:val="17"/>
               </w:rPr>
-              <w:t xml:space="preserve">Já existe um endereço cadastrado com este CEP para este cliente.</w:t>
+              <w:t xml:space="preserve">Este endereço já é o endereço principal do cliente.</w:t>
             </w:r>
           </w:p>
         </w:tc>
@@ -42737,7 +43190,7 @@
                 <w:sz w:val="17"/>
                 <w:szCs w:val="17"/>
               </w:rPr>
-              <w:t xml:space="preserve">ENDERECO_NUMERO_OBRIGATORIO</w:t>
+              <w:t xml:space="preserve">ENDERECO_PRINCIPAL_CEP_INVAL</w:t>
             </w:r>
           </w:p>
         </w:tc>
@@ -42767,7 +43220,7 @@
                 <w:sz w:val="17"/>
                 <w:szCs w:val="17"/>
               </w:rPr>
-              <w:t xml:space="preserve">Número do endereço é obrigatório.</w:t>
+              <w:t xml:space="preserve">Endereço com CEP não validado não pode ser o principal.</w:t>
             </w:r>
           </w:p>
         </w:tc>
@@ -42802,7 +43255,7 @@
                 <w:sz w:val="17"/>
                 <w:szCs w:val="17"/>
               </w:rPr>
-              <w:t xml:space="preserve">FOTO_FORMATO_INVALIDO</w:t>
+              <w:t xml:space="preserve">CEP_INDISPONIVEL</w:t>
             </w:r>
           </w:p>
         </w:tc>
@@ -42832,7 +43285,7 @@
                 <w:sz w:val="17"/>
                 <w:szCs w:val="17"/>
               </w:rPr>
-              <w:t xml:space="preserve">Formato de imagem inválido. Utilize JPEG, PNG ou WEBP.</w:t>
+              <w:t xml:space="preserve">Não foi possível validar o CEP agora. Tente novamente em instantes.</w:t>
             </w:r>
           </w:p>
         </w:tc>
@@ -42867,7 +43320,7 @@
                 <w:sz w:val="17"/>
                 <w:szCs w:val="17"/>
               </w:rPr>
-              <w:t xml:space="preserve">CAMPO_OBRIGATORIO</w:t>
+              <w:t xml:space="preserve">CEP_INVALIDO</w:t>
             </w:r>
           </w:p>
         </w:tc>
@@ -42897,7 +43350,7 @@
                 <w:sz w:val="17"/>
                 <w:szCs w:val="17"/>
               </w:rPr>
-              <w:t xml:space="preserve">Campo &amp;1 é obrigatório.</w:t>
+              <w:t xml:space="preserve">CEP inválido ou não encontrado. Verifique o número informado.</w:t>
             </w:r>
           </w:p>
         </w:tc>
@@ -42932,7 +43385,7 @@
                 <w:sz w:val="17"/>
                 <w:szCs w:val="17"/>
               </w:rPr>
-              <w:t xml:space="preserve">EMAIL_INVALIDO</w:t>
+              <w:t xml:space="preserve">CEP_DUPLICADO_CLIENTE</w:t>
             </w:r>
           </w:p>
         </w:tc>
@@ -42962,7 +43415,7 @@
                 <w:sz w:val="17"/>
                 <w:szCs w:val="17"/>
               </w:rPr>
-              <w:t xml:space="preserve">E-mail em formato inválido.</w:t>
+              <w:t xml:space="preserve">Já existe um endereço cadastrado com este CEP para este cliente.</w:t>
             </w:r>
           </w:p>
         </w:tc>
@@ -42997,7 +43450,7 @@
                 <w:sz w:val="17"/>
                 <w:szCs w:val="17"/>
               </w:rPr>
-              <w:t xml:space="preserve">TELEFONE_INVALIDO</w:t>
+              <w:t xml:space="preserve">ENDERECO_NUMERO_OBRIGATORIO</w:t>
             </w:r>
           </w:p>
         </w:tc>
@@ -43027,7 +43480,7 @@
                 <w:sz w:val="17"/>
                 <w:szCs w:val="17"/>
               </w:rPr>
-              <w:t xml:space="preserve">Telefone deve conter 10 ou 11 dígitos (DDD + número).</w:t>
+              <w:t xml:space="preserve">Número do endereço é obrigatório.</w:t>
             </w:r>
           </w:p>
         </w:tc>
@@ -43062,7 +43515,7 @@
                 <w:sz w:val="17"/>
                 <w:szCs w:val="17"/>
               </w:rPr>
-              <w:t xml:space="preserve">DATA_NASCIMENTO_FUTURA</w:t>
+              <w:t xml:space="preserve">FOTO_FORMATO_INVALIDO</w:t>
             </w:r>
           </w:p>
         </w:tc>
@@ -43092,7 +43545,7 @@
                 <w:sz w:val="17"/>
                 <w:szCs w:val="17"/>
               </w:rPr>
-              <w:t xml:space="preserve">Data de nascimento não pode ser futura.</w:t>
+              <w:t xml:space="preserve">Formato de imagem inválido. Utilize JPEG, PNG ou WEBP.</w:t>
             </w:r>
           </w:p>
         </w:tc>
@@ -43127,7 +43580,7 @@
                 <w:sz w:val="17"/>
                 <w:szCs w:val="17"/>
               </w:rPr>
-              <w:t xml:space="preserve">ITEM_SKU_DUPLICADO</w:t>
+              <w:t xml:space="preserve">CAMPO_OBRIGATORIO</w:t>
             </w:r>
           </w:p>
         </w:tc>
@@ -43157,7 +43610,7 @@
                 <w:sz w:val="17"/>
                 <w:szCs w:val="17"/>
               </w:rPr>
-              <w:t xml:space="preserve">Já existe item cadastrado com este SKU.</w:t>
+              <w:t xml:space="preserve">Campo &amp;1 é obrigatório.</w:t>
             </w:r>
           </w:p>
         </w:tc>
@@ -43192,7 +43645,7 @@
                 <w:sz w:val="17"/>
                 <w:szCs w:val="17"/>
               </w:rPr>
-              <w:t xml:space="preserve">ITEM_SEM_ESTOQUE</w:t>
+              <w:t xml:space="preserve">EMAIL_INVALIDO</w:t>
             </w:r>
           </w:p>
         </w:tc>
@@ -43222,7 +43675,7 @@
                 <w:sz w:val="17"/>
                 <w:szCs w:val="17"/>
               </w:rPr>
-              <w:t xml:space="preserve">Item &amp;1 está sem estoque disponível e não pode ser adicionado ao pedido.</w:t>
+              <w:t xml:space="preserve">E-mail em formato inválido.</w:t>
             </w:r>
           </w:p>
         </w:tc>
@@ -43257,7 +43710,7 @@
                 <w:sz w:val="17"/>
                 <w:szCs w:val="17"/>
               </w:rPr>
-              <w:t xml:space="preserve">ITEM_ESTOQUE_INSUFICIENTE</w:t>
+              <w:t xml:space="preserve">TELEFONE_INVALIDO</w:t>
             </w:r>
           </w:p>
         </w:tc>
@@ -43287,7 +43740,7 @@
                 <w:sz w:val="17"/>
                 <w:szCs w:val="17"/>
               </w:rPr>
-              <w:t xml:space="preserve">Estoque insuficiente para o item &amp;1 (disponível: &amp;2).</w:t>
+              <w:t xml:space="preserve">Telefone deve conter 10 ou 11 dígitos (DDD + número).</w:t>
             </w:r>
           </w:p>
         </w:tc>
@@ -43322,7 +43775,7 @@
                 <w:sz w:val="17"/>
                 <w:szCs w:val="17"/>
               </w:rPr>
-              <w:t xml:space="preserve">ITEM_ESTOQUE_CONCORRENTE</w:t>
+              <w:t xml:space="preserve">DATA_NASCIMENTO_FUTURA</w:t>
             </w:r>
           </w:p>
         </w:tc>
@@ -43352,7 +43805,7 @@
                 <w:sz w:val="17"/>
                 <w:szCs w:val="17"/>
               </w:rPr>
-              <w:t xml:space="preserve">Estoque do item &amp;1 alterado por outra operação. Atualize e tente de novo.</w:t>
+              <w:t xml:space="preserve">Data de nascimento não pode ser futura.</w:t>
             </w:r>
           </w:p>
         </w:tc>
@@ -43387,7 +43840,7 @@
                 <w:sz w:val="17"/>
                 <w:szCs w:val="17"/>
               </w:rPr>
-              <w:t xml:space="preserve">ITEM_INATIVO</w:t>
+              <w:t xml:space="preserve">ITEM_SKU_DUPLICADO</w:t>
             </w:r>
           </w:p>
         </w:tc>
@@ -43417,7 +43870,7 @@
                 <w:sz w:val="17"/>
                 <w:szCs w:val="17"/>
               </w:rPr>
-              <w:t xml:space="preserve">Item &amp;1 inativo não pode ser usado em novo pedido.</w:t>
+              <w:t xml:space="preserve">Já existe item cadastrado com este SKU.</w:t>
             </w:r>
           </w:p>
         </w:tc>
@@ -43452,7 +43905,7 @@
                 <w:sz w:val="17"/>
                 <w:szCs w:val="17"/>
               </w:rPr>
-              <w:t xml:space="preserve">ITEM_INATIVACAO_BLOQUEADA</w:t>
+              <w:t xml:space="preserve">ITEM_SEM_ESTOQUE</w:t>
             </w:r>
           </w:p>
         </w:tc>
@@ -43482,7 +43935,7 @@
                 <w:sz w:val="17"/>
                 <w:szCs w:val="17"/>
               </w:rPr>
-              <w:t xml:space="preserve">Item possui estoque disponível ou pedido ativo. Inativação bloqueada.</w:t>
+              <w:t xml:space="preserve">Item &amp;1 está sem estoque disponível e não pode ser adicionado ao pedido.</w:t>
             </w:r>
           </w:p>
         </w:tc>
@@ -43517,7 +43970,7 @@
                 <w:sz w:val="17"/>
                 <w:szCs w:val="17"/>
               </w:rPr>
-              <w:t xml:space="preserve">ITEM_EXCLUSAO_BLOQUEADA</w:t>
+              <w:t xml:space="preserve">ITEM_ESTOQUE_INSUFICIENTE</w:t>
             </w:r>
           </w:p>
         </w:tc>
@@ -43547,7 +44000,7 @@
                 <w:sz w:val="17"/>
                 <w:szCs w:val="17"/>
               </w:rPr>
-              <w:t xml:space="preserve">Item não pode ser excluído pois está vinculado a pedido ou reserva.</w:t>
+              <w:t xml:space="preserve">Estoque insuficiente para o item &amp;1 (disponível: &amp;2).</w:t>
             </w:r>
           </w:p>
         </w:tc>
@@ -43582,7 +44035,7 @@
                 <w:sz w:val="17"/>
                 <w:szCs w:val="17"/>
               </w:rPr>
-              <w:t xml:space="preserve">ITEM_QTDE_INVALIDA</w:t>
+              <w:t xml:space="preserve">ITEM_ESTOQUE_CONCORRENTE</w:t>
             </w:r>
           </w:p>
         </w:tc>
@@ -43612,7 +44065,7 @@
                 <w:sz w:val="17"/>
                 <w:szCs w:val="17"/>
               </w:rPr>
-              <w:t xml:space="preserve">Quantidade do item deve ser maior que zero.</w:t>
+              <w:t xml:space="preserve">Estoque do item &amp;1 alterado por outra operação. Atualize e tente de novo.</w:t>
             </w:r>
           </w:p>
         </w:tc>
@@ -43647,7 +44100,7 @@
                 <w:sz w:val="17"/>
                 <w:szCs w:val="17"/>
               </w:rPr>
-              <w:t xml:space="preserve">ITEM_PRECO_INVALIDO</w:t>
+              <w:t xml:space="preserve">ITEM_INATIVO</w:t>
             </w:r>
           </w:p>
         </w:tc>
@@ -43677,7 +44130,7 @@
                 <w:sz w:val="17"/>
                 <w:szCs w:val="17"/>
               </w:rPr>
-              <w:t xml:space="preserve">Preço unitário deve ser maior ou igual a zero.</w:t>
+              <w:t xml:space="preserve">Item &amp;1 inativo não pode ser usado em novo pedido.</w:t>
             </w:r>
           </w:p>
         </w:tc>
@@ -43712,7 +44165,7 @@
                 <w:sz w:val="17"/>
                 <w:szCs w:val="17"/>
               </w:rPr>
-              <w:t xml:space="preserve">ITEM_QTDE_ESTOQUE_INVALIDA</w:t>
+              <w:t xml:space="preserve">ITEM_INATIVACAO_BLOQUEADA</w:t>
             </w:r>
           </w:p>
         </w:tc>
@@ -43742,7 +44195,7 @@
                 <w:sz w:val="17"/>
                 <w:szCs w:val="17"/>
               </w:rPr>
-              <w:t xml:space="preserve">Qtde em estoque não pode ser negativa nem menor que a reservada (&amp;1).</w:t>
+              <w:t xml:space="preserve">Item possui estoque disponível ou pedido ativo. Inativação bloqueada.</w:t>
             </w:r>
           </w:p>
         </w:tc>
@@ -43777,7 +44230,7 @@
                 <w:sz w:val="17"/>
                 <w:szCs w:val="17"/>
               </w:rPr>
-              <w:t xml:space="preserve">ITEM_RESERVA_INCONSISTENTE</w:t>
+              <w:t xml:space="preserve">ITEM_EXCLUSAO_BLOQUEADA</w:t>
             </w:r>
           </w:p>
         </w:tc>
@@ -43807,7 +44260,7 @@
                 <w:sz w:val="17"/>
                 <w:szCs w:val="17"/>
               </w:rPr>
-              <w:t xml:space="preserve">Reserva do item &amp;1 inconsistente com o pedido.</w:t>
+              <w:t xml:space="preserve">Item não pode ser excluído pois está vinculado a pedido ou reserva.</w:t>
             </w:r>
           </w:p>
         </w:tc>
@@ -43842,7 +44295,7 @@
                 <w:sz w:val="17"/>
                 <w:szCs w:val="17"/>
               </w:rPr>
-              <w:t xml:space="preserve">PEDIDO_SEM_ITENS</w:t>
+              <w:t xml:space="preserve">ITEM_QTDE_INVALIDA</w:t>
             </w:r>
           </w:p>
         </w:tc>
@@ -43872,7 +44325,7 @@
                 <w:sz w:val="17"/>
                 <w:szCs w:val="17"/>
               </w:rPr>
-              <w:t xml:space="preserve">Pedido deve possuir ao menos um item.</w:t>
+              <w:t xml:space="preserve">Quantidade do item deve ser maior que zero.</w:t>
             </w:r>
           </w:p>
         </w:tc>
@@ -43907,7 +44360,7 @@
                 <w:sz w:val="17"/>
                 <w:szCs w:val="17"/>
               </w:rPr>
-              <w:t xml:space="preserve">PEDIDO_STATUS_INVALIDO</w:t>
+              <w:t xml:space="preserve">ITEM_PRECO_INVALIDO</w:t>
             </w:r>
           </w:p>
         </w:tc>
@@ -43937,7 +44390,7 @@
                 <w:sz w:val="17"/>
                 <w:szCs w:val="17"/>
               </w:rPr>
-              <w:t xml:space="preserve">Transição de status não permitida (status atual: &amp;1).</w:t>
+              <w:t xml:space="preserve">Preço unitário deve ser maior ou igual a zero.</w:t>
             </w:r>
           </w:p>
         </w:tc>
@@ -43972,7 +44425,7 @@
                 <w:sz w:val="17"/>
                 <w:szCs w:val="17"/>
               </w:rPr>
-              <w:t xml:space="preserve">PEDIDO_EDICAO_BLOQUEADA</w:t>
+              <w:t xml:space="preserve">ITEM_QTDE_ESTOQUE_INVALIDA</w:t>
             </w:r>
           </w:p>
         </w:tc>
@@ -44002,7 +44455,7 @@
                 <w:sz w:val="17"/>
                 <w:szCs w:val="17"/>
               </w:rPr>
-              <w:t xml:space="preserve">Pedido só pode ser editado ou excluído no status ABERTO.</w:t>
+              <w:t xml:space="preserve">Qtde em estoque não pode ser negativa nem menor que a reservada (&amp;1).</w:t>
             </w:r>
           </w:p>
         </w:tc>
@@ -44037,7 +44490,7 @@
                 <w:sz w:val="17"/>
                 <w:szCs w:val="17"/>
               </w:rPr>
-              <w:t xml:space="preserve">PEDIDO_PAGAMENTO_PENDENTE</w:t>
+              <w:t xml:space="preserve">ITEM_RESERVA_INCONSISTENTE</w:t>
             </w:r>
           </w:p>
         </w:tc>
@@ -44067,7 +44520,7 @@
                 <w:sz w:val="17"/>
                 <w:szCs w:val="17"/>
               </w:rPr>
-              <w:t xml:space="preserve">Pagamento pendente. O pedido não pode ser finalizado.</w:t>
+              <w:t xml:space="preserve">Reserva do item &amp;1 inconsistente com o pedido.</w:t>
             </w:r>
           </w:p>
         </w:tc>
@@ -44102,7 +44555,7 @@
                 <w:sz w:val="17"/>
                 <w:szCs w:val="17"/>
               </w:rPr>
-              <w:t xml:space="preserve">PEDIDO_FINALIZADO_IMUTAVEL</w:t>
+              <w:t xml:space="preserve">PEDIDO_SEM_ITENS</w:t>
             </w:r>
           </w:p>
         </w:tc>
@@ -44132,7 +44585,7 @@
                 <w:sz w:val="17"/>
                 <w:szCs w:val="17"/>
               </w:rPr>
-              <w:t xml:space="preserve">Pedido finalizado não pode ser alterado.</w:t>
+              <w:t xml:space="preserve">Pedido deve possuir ao menos um item.</w:t>
             </w:r>
           </w:p>
         </w:tc>
@@ -44167,7 +44620,7 @@
                 <w:sz w:val="17"/>
                 <w:szCs w:val="17"/>
               </w:rPr>
-              <w:t xml:space="preserve">PEDIDO_CANCELADO_IMUTAVEL</w:t>
+              <w:t xml:space="preserve">PEDIDO_STATUS_INVALIDO</w:t>
             </w:r>
           </w:p>
         </w:tc>
@@ -44197,7 +44650,7 @@
                 <w:sz w:val="17"/>
                 <w:szCs w:val="17"/>
               </w:rPr>
-              <w:t xml:space="preserve">Pedido cancelado não pode ser alterado.</w:t>
+              <w:t xml:space="preserve">Transição de status não permitida (status atual: &amp;1).</w:t>
             </w:r>
           </w:p>
         </w:tc>
@@ -44232,7 +44685,7 @@
                 <w:sz w:val="17"/>
                 <w:szCs w:val="17"/>
               </w:rPr>
-              <w:t xml:space="preserve">PEDIDO_MOTIVO_CANCEL_OBRIG</w:t>
+              <w:t xml:space="preserve">PEDIDO_EDICAO_BLOQUEADA</w:t>
             </w:r>
           </w:p>
         </w:tc>
@@ -44262,7 +44715,7 @@
                 <w:sz w:val="17"/>
                 <w:szCs w:val="17"/>
               </w:rPr>
-              <w:t xml:space="preserve">Informe o motivo do cancelamento.</w:t>
+              <w:t xml:space="preserve">Pedido só pode ser editado ou excluído no status ABERTO.</w:t>
             </w:r>
           </w:p>
         </w:tc>
@@ -44297,7 +44750,7 @@
                 <w:sz w:val="17"/>
                 <w:szCs w:val="17"/>
               </w:rPr>
-              <w:t xml:space="preserve">PEDIDO_CONFIRMADO</w:t>
+              <w:t xml:space="preserve">PEDIDO_PAGAMENTO_PENDENTE</w:t>
             </w:r>
           </w:p>
         </w:tc>
@@ -44327,7 +44780,7 @@
                 <w:sz w:val="17"/>
                 <w:szCs w:val="17"/>
               </w:rPr>
-              <w:t xml:space="preserve">Pedido &amp;1 registrado. Estoque reservado.</w:t>
+              <w:t xml:space="preserve">Pagamento pendente. O pedido não pode ser finalizado.</w:t>
             </w:r>
           </w:p>
         </w:tc>
@@ -44362,7 +44815,7 @@
                 <w:sz w:val="17"/>
                 <w:szCs w:val="17"/>
               </w:rPr>
-              <w:t xml:space="preserve">PEDIDO_FINALIZADO</w:t>
+              <w:t xml:space="preserve">PEDIDO_FINALIZADO_IMUTAVEL</w:t>
             </w:r>
           </w:p>
         </w:tc>
@@ -44392,7 +44845,7 @@
                 <w:sz w:val="17"/>
                 <w:szCs w:val="17"/>
               </w:rPr>
-              <w:t xml:space="preserve">Pedido &amp;1 finalizado com sucesso.</w:t>
+              <w:t xml:space="preserve">Pedido finalizado não pode ser alterado.</w:t>
             </w:r>
           </w:p>
         </w:tc>
@@ -44427,7 +44880,7 @@
                 <w:sz w:val="17"/>
                 <w:szCs w:val="17"/>
               </w:rPr>
-              <w:t xml:space="preserve">PEDIDO_CANCELADO</w:t>
+              <w:t xml:space="preserve">PEDIDO_CANCELADO_IMUTAVEL</w:t>
             </w:r>
           </w:p>
         </w:tc>
@@ -44457,7 +44910,7 @@
                 <w:sz w:val="17"/>
                 <w:szCs w:val="17"/>
               </w:rPr>
-              <w:t xml:space="preserve">Pedido &amp;1 cancelado.</w:t>
+              <w:t xml:space="preserve">Pedido cancelado não pode ser alterado.</w:t>
             </w:r>
           </w:p>
         </w:tc>
@@ -44492,7 +44945,7 @@
                 <w:sz w:val="17"/>
                 <w:szCs w:val="17"/>
               </w:rPr>
-              <w:t xml:space="preserve">PEDIDO_REEMBOLSO_SOLICITADO</w:t>
+              <w:t xml:space="preserve">PEDIDO_MOTIVO_CANCEL_OBRIG</w:t>
             </w:r>
           </w:p>
         </w:tc>
@@ -44522,7 +44975,7 @@
                 <w:sz w:val="17"/>
                 <w:szCs w:val="17"/>
               </w:rPr>
-              <w:t xml:space="preserve">Pedido &amp;1 enviado para processamento de reembolso.</w:t>
+              <w:t xml:space="preserve">Informe o motivo do cancelamento.</w:t>
             </w:r>
           </w:p>
         </w:tc>
@@ -44557,7 +45010,7 @@
                 <w:sz w:val="17"/>
                 <w:szCs w:val="17"/>
               </w:rPr>
-              <w:t xml:space="preserve">PAGAMENTO_APROVADO</w:t>
+              <w:t xml:space="preserve">PEDIDO_CONFIRMADO</w:t>
             </w:r>
           </w:p>
         </w:tc>
@@ -44587,7 +45040,7 @@
                 <w:sz w:val="17"/>
                 <w:szCs w:val="17"/>
               </w:rPr>
-              <w:t xml:space="preserve">Pagamento aprovado com sucesso.</w:t>
+              <w:t xml:space="preserve">Pedido &amp;1 registrado. Estoque reservado.</w:t>
             </w:r>
           </w:p>
         </w:tc>
@@ -44622,6 +45075,266 @@
                 <w:sz w:val="17"/>
                 <w:szCs w:val="17"/>
               </w:rPr>
+              <w:t xml:space="preserve">PEDIDO_FINALIZADO</w:t>
+            </w:r>
+          </w:p>
+        </w:tc>
+        <w:tc>
+          <w:tcPr>
+            <w:tcW w:type="dxa" w:w="5330"/>
+            <w:tcBorders>
+              <w:top w:val="single" w:color="C9D3DD" w:sz="4"/>
+              <w:left w:val="single" w:color="C9D3DD" w:sz="4"/>
+              <w:bottom w:val="single" w:color="C9D3DD" w:sz="4"/>
+              <w:right w:val="single" w:color="C9D3DD" w:sz="4"/>
+            </w:tcBorders>
+            <w:tcMar>
+              <w:top w:type="dxa" w:w="50"/>
+              <w:left w:type="dxa" w:w="80"/>
+              <w:bottom w:type="dxa" w:w="50"/>
+              <w:right w:type="dxa" w:w="80"/>
+            </w:tcMar>
+          </w:tcPr>
+          <w:p>
+            <w:pPr>
+              <w:spacing w:before="0" w:after="0"/>
+            </w:pPr>
+            <w:r>
+              <w:rPr>
+                <w:rFonts w:ascii="Arial" w:cs="Arial" w:eastAsia="Arial" w:hAnsi="Arial"/>
+                <w:sz w:val="17"/>
+                <w:szCs w:val="17"/>
+              </w:rPr>
+              <w:t xml:space="preserve">Pedido &amp;1 finalizado com sucesso.</w:t>
+            </w:r>
+          </w:p>
+        </w:tc>
+      </w:tr>
+      <w:tr>
+        <w:trPr>
+          <w:cantSplit/>
+        </w:trPr>
+        <w:tc>
+          <w:tcPr>
+            <w:tcW w:type="dxa" w:w="4536"/>
+            <w:tcBorders>
+              <w:top w:val="single" w:color="C9D3DD" w:sz="4"/>
+              <w:left w:val="single" w:color="C9D3DD" w:sz="4"/>
+              <w:bottom w:val="single" w:color="C9D3DD" w:sz="4"/>
+              <w:right w:val="single" w:color="C9D3DD" w:sz="4"/>
+            </w:tcBorders>
+            <w:tcMar>
+              <w:top w:type="dxa" w:w="50"/>
+              <w:left w:type="dxa" w:w="80"/>
+              <w:bottom w:type="dxa" w:w="50"/>
+              <w:right w:type="dxa" w:w="80"/>
+            </w:tcMar>
+          </w:tcPr>
+          <w:p>
+            <w:pPr>
+              <w:spacing w:before="0" w:after="0"/>
+            </w:pPr>
+            <w:r>
+              <w:rPr>
+                <w:rFonts w:ascii="Arial" w:cs="Arial" w:eastAsia="Arial" w:hAnsi="Arial"/>
+                <w:sz w:val="17"/>
+                <w:szCs w:val="17"/>
+              </w:rPr>
+              <w:t xml:space="preserve">PEDIDO_CANCELADO</w:t>
+            </w:r>
+          </w:p>
+        </w:tc>
+        <w:tc>
+          <w:tcPr>
+            <w:tcW w:type="dxa" w:w="5330"/>
+            <w:tcBorders>
+              <w:top w:val="single" w:color="C9D3DD" w:sz="4"/>
+              <w:left w:val="single" w:color="C9D3DD" w:sz="4"/>
+              <w:bottom w:val="single" w:color="C9D3DD" w:sz="4"/>
+              <w:right w:val="single" w:color="C9D3DD" w:sz="4"/>
+            </w:tcBorders>
+            <w:tcMar>
+              <w:top w:type="dxa" w:w="50"/>
+              <w:left w:type="dxa" w:w="80"/>
+              <w:bottom w:type="dxa" w:w="50"/>
+              <w:right w:type="dxa" w:w="80"/>
+            </w:tcMar>
+          </w:tcPr>
+          <w:p>
+            <w:pPr>
+              <w:spacing w:before="0" w:after="0"/>
+            </w:pPr>
+            <w:r>
+              <w:rPr>
+                <w:rFonts w:ascii="Arial" w:cs="Arial" w:eastAsia="Arial" w:hAnsi="Arial"/>
+                <w:sz w:val="17"/>
+                <w:szCs w:val="17"/>
+              </w:rPr>
+              <w:t xml:space="preserve">Pedido &amp;1 cancelado.</w:t>
+            </w:r>
+          </w:p>
+        </w:tc>
+      </w:tr>
+      <w:tr>
+        <w:trPr>
+          <w:cantSplit/>
+        </w:trPr>
+        <w:tc>
+          <w:tcPr>
+            <w:tcW w:type="dxa" w:w="4536"/>
+            <w:tcBorders>
+              <w:top w:val="single" w:color="C9D3DD" w:sz="4"/>
+              <w:left w:val="single" w:color="C9D3DD" w:sz="4"/>
+              <w:bottom w:val="single" w:color="C9D3DD" w:sz="4"/>
+              <w:right w:val="single" w:color="C9D3DD" w:sz="4"/>
+            </w:tcBorders>
+            <w:tcMar>
+              <w:top w:type="dxa" w:w="50"/>
+              <w:left w:type="dxa" w:w="80"/>
+              <w:bottom w:type="dxa" w:w="50"/>
+              <w:right w:type="dxa" w:w="80"/>
+            </w:tcMar>
+          </w:tcPr>
+          <w:p>
+            <w:pPr>
+              <w:spacing w:before="0" w:after="0"/>
+            </w:pPr>
+            <w:r>
+              <w:rPr>
+                <w:rFonts w:ascii="Arial" w:cs="Arial" w:eastAsia="Arial" w:hAnsi="Arial"/>
+                <w:sz w:val="17"/>
+                <w:szCs w:val="17"/>
+              </w:rPr>
+              <w:t xml:space="preserve">PEDIDO_REEMBOLSO_SOLICITADO</w:t>
+            </w:r>
+          </w:p>
+        </w:tc>
+        <w:tc>
+          <w:tcPr>
+            <w:tcW w:type="dxa" w:w="5330"/>
+            <w:tcBorders>
+              <w:top w:val="single" w:color="C9D3DD" w:sz="4"/>
+              <w:left w:val="single" w:color="C9D3DD" w:sz="4"/>
+              <w:bottom w:val="single" w:color="C9D3DD" w:sz="4"/>
+              <w:right w:val="single" w:color="C9D3DD" w:sz="4"/>
+            </w:tcBorders>
+            <w:tcMar>
+              <w:top w:type="dxa" w:w="50"/>
+              <w:left w:type="dxa" w:w="80"/>
+              <w:bottom w:type="dxa" w:w="50"/>
+              <w:right w:type="dxa" w:w="80"/>
+            </w:tcMar>
+          </w:tcPr>
+          <w:p>
+            <w:pPr>
+              <w:spacing w:before="0" w:after="0"/>
+            </w:pPr>
+            <w:r>
+              <w:rPr>
+                <w:rFonts w:ascii="Arial" w:cs="Arial" w:eastAsia="Arial" w:hAnsi="Arial"/>
+                <w:sz w:val="17"/>
+                <w:szCs w:val="17"/>
+              </w:rPr>
+              <w:t xml:space="preserve">Pedido &amp;1 enviado para processamento de reembolso.</w:t>
+            </w:r>
+          </w:p>
+        </w:tc>
+      </w:tr>
+      <w:tr>
+        <w:trPr>
+          <w:cantSplit/>
+        </w:trPr>
+        <w:tc>
+          <w:tcPr>
+            <w:tcW w:type="dxa" w:w="4536"/>
+            <w:tcBorders>
+              <w:top w:val="single" w:color="C9D3DD" w:sz="4"/>
+              <w:left w:val="single" w:color="C9D3DD" w:sz="4"/>
+              <w:bottom w:val="single" w:color="C9D3DD" w:sz="4"/>
+              <w:right w:val="single" w:color="C9D3DD" w:sz="4"/>
+            </w:tcBorders>
+            <w:tcMar>
+              <w:top w:type="dxa" w:w="50"/>
+              <w:left w:type="dxa" w:w="80"/>
+              <w:bottom w:type="dxa" w:w="50"/>
+              <w:right w:type="dxa" w:w="80"/>
+            </w:tcMar>
+          </w:tcPr>
+          <w:p>
+            <w:pPr>
+              <w:spacing w:before="0" w:after="0"/>
+            </w:pPr>
+            <w:r>
+              <w:rPr>
+                <w:rFonts w:ascii="Arial" w:cs="Arial" w:eastAsia="Arial" w:hAnsi="Arial"/>
+                <w:sz w:val="17"/>
+                <w:szCs w:val="17"/>
+              </w:rPr>
+              <w:t xml:space="preserve">PAGAMENTO_APROVADO</w:t>
+            </w:r>
+          </w:p>
+        </w:tc>
+        <w:tc>
+          <w:tcPr>
+            <w:tcW w:type="dxa" w:w="5330"/>
+            <w:tcBorders>
+              <w:top w:val="single" w:color="C9D3DD" w:sz="4"/>
+              <w:left w:val="single" w:color="C9D3DD" w:sz="4"/>
+              <w:bottom w:val="single" w:color="C9D3DD" w:sz="4"/>
+              <w:right w:val="single" w:color="C9D3DD" w:sz="4"/>
+            </w:tcBorders>
+            <w:tcMar>
+              <w:top w:type="dxa" w:w="50"/>
+              <w:left w:type="dxa" w:w="80"/>
+              <w:bottom w:type="dxa" w:w="50"/>
+              <w:right w:type="dxa" w:w="80"/>
+            </w:tcMar>
+          </w:tcPr>
+          <w:p>
+            <w:pPr>
+              <w:spacing w:before="0" w:after="0"/>
+            </w:pPr>
+            <w:r>
+              <w:rPr>
+                <w:rFonts w:ascii="Arial" w:cs="Arial" w:eastAsia="Arial" w:hAnsi="Arial"/>
+                <w:sz w:val="17"/>
+                <w:szCs w:val="17"/>
+              </w:rPr>
+              <w:t xml:space="preserve">Pagamento aprovado com sucesso.</w:t>
+            </w:r>
+          </w:p>
+        </w:tc>
+      </w:tr>
+      <w:tr>
+        <w:trPr>
+          <w:cantSplit/>
+        </w:trPr>
+        <w:tc>
+          <w:tcPr>
+            <w:tcW w:type="dxa" w:w="4536"/>
+            <w:tcBorders>
+              <w:top w:val="single" w:color="C9D3DD" w:sz="4"/>
+              <w:left w:val="single" w:color="C9D3DD" w:sz="4"/>
+              <w:bottom w:val="single" w:color="C9D3DD" w:sz="4"/>
+              <w:right w:val="single" w:color="C9D3DD" w:sz="4"/>
+            </w:tcBorders>
+            <w:tcMar>
+              <w:top w:type="dxa" w:w="50"/>
+              <w:left w:type="dxa" w:w="80"/>
+              <w:bottom w:type="dxa" w:w="50"/>
+              <w:right w:type="dxa" w:w="80"/>
+            </w:tcMar>
+          </w:tcPr>
+          <w:p>
+            <w:pPr>
+              <w:spacing w:before="0" w:after="0"/>
+            </w:pPr>
+            <w:r>
+              <w:rPr>
+                <w:rFonts w:ascii="Arial" w:cs="Arial" w:eastAsia="Arial" w:hAnsi="Arial"/>
+                <w:sz w:val="17"/>
+                <w:szCs w:val="17"/>
+              </w:rPr>
               <w:t xml:space="preserve">PAGAMENTO_RECUSADO</w:t>
             </w:r>
           </w:p>
@@ -44652,7 +45365,7 @@
                 <w:sz w:val="17"/>
                 <w:szCs w:val="17"/>
               </w:rPr>
-              <w:t xml:space="preserve">Pagamento recusado. O pedido permanecerá aguardando pagamento.</w:t>
+              <w:t xml:space="preserve">Pagamento recusado. O pedido permanecerá aguardando pagamento. (severidade de informação)</w:t>
             </w:r>
           </w:p>
         </w:tc>
@@ -45447,14 +46160,20 @@
     </w:p>
     <w:p>
       <w:pPr>
-        <w:pStyle w:val="Heading2"/>
-        <w:keepNext/>
+        <w:pStyle w:val="ListParagraph"/>
+        <w:numPr>
+          <w:ilvl w:val="0"/>
+          <w:numId w:val="2"/>
+        </w:numPr>
+        <w:spacing w:after="60"/>
       </w:pPr>
       <w:r>
         <w:rPr>
           <w:rFonts w:ascii="Arial" w:cs="Arial" w:eastAsia="Arial" w:hAnsi="Arial"/>
-        </w:rPr>
-        <w:t xml:space="preserve">22.2 Estoque</w:t>
+          <w:sz w:val="20"/>
+          <w:szCs w:val="20"/>
+        </w:rPr>
+        <w:t xml:space="preserve">Dado um cliente com pedido em andamento, quando o administrador desmarcar Ativo, então a alteração é recusada na hora.</w:t>
       </w:r>
     </w:p>
     <w:p>
@@ -45472,7 +46191,19 @@
           <w:sz w:val="20"/>
           <w:szCs w:val="20"/>
         </w:rPr>
-        <w:t xml:space="preserve">Dado um item salvo com categoria, então o SKU é gerado no Save com as 3 primeiras letras da categoria.</w:t>
+        <w:t xml:space="preserve">Dada a tabela de endereços, quando o usuário selecionar uma linha, então nenhuma outra fica selecionada; se o endereço já for o principal ou tiver CEP não validado, Definir endereço principal é recusado.</w:t>
+      </w:r>
+    </w:p>
+    <w:p>
+      <w:pPr>
+        <w:pStyle w:val="Heading2"/>
+        <w:keepNext/>
+      </w:pPr>
+      <w:r>
+        <w:rPr>
+          <w:rFonts w:ascii="Arial" w:cs="Arial" w:eastAsia="Arial" w:hAnsi="Arial"/>
+        </w:rPr>
+        <w:t xml:space="preserve">22.2 Estoque</w:t>
       </w:r>
     </w:p>
     <w:p>
@@ -45490,7 +46221,7 @@
           <w:sz w:val="20"/>
           <w:szCs w:val="20"/>
         </w:rPr>
-        <w:t xml:space="preserve">Dado QtdeEstoque = 10 e QtdeReservada = 3, então QtdeDisponivel = 7.</w:t>
+        <w:t xml:space="preserve">Dado um item salvo com categoria, então o SKU é gerado no Save com as 3 primeiras letras da categoria.</w:t>
       </w:r>
     </w:p>
     <w:p>
@@ -45508,58 +46239,7 @@
           <w:sz w:val="20"/>
           <w:szCs w:val="20"/>
         </w:rPr>
-        <w:t xml:space="preserve">Dado QtdeDisponivel = 0, 1 a 10 ou ≥ 11, então o status é </w:t>
-      </w:r>
-      <w:r>
-        <w:rPr>
-          <w:rFonts w:ascii="Consolas" w:cs="Consolas" w:eastAsia="Consolas" w:hAnsi="Consolas"/>
-          <w:color w:val="00144A"/>
-          <w:sz w:val="20"/>
-          <w:szCs w:val="20"/>
-        </w:rPr>
-        <w:t xml:space="preserve">SEM_ESTOQUE</w:t>
-      </w:r>
-      <w:r>
-        <w:rPr>
-          <w:rFonts w:ascii="Arial" w:cs="Arial" w:eastAsia="Arial" w:hAnsi="Arial"/>
-          <w:sz w:val="20"/>
-          <w:szCs w:val="20"/>
-        </w:rPr>
-        <w:t xml:space="preserve">, </w:t>
-      </w:r>
-      <w:r>
-        <w:rPr>
-          <w:rFonts w:ascii="Consolas" w:cs="Consolas" w:eastAsia="Consolas" w:hAnsi="Consolas"/>
-          <w:color w:val="00144A"/>
-          <w:sz w:val="20"/>
-          <w:szCs w:val="20"/>
-        </w:rPr>
-        <w:t xml:space="preserve">ACABANDO</w:t>
-      </w:r>
-      <w:r>
-        <w:rPr>
-          <w:rFonts w:ascii="Arial" w:cs="Arial" w:eastAsia="Arial" w:hAnsi="Arial"/>
-          <w:sz w:val="20"/>
-          <w:szCs w:val="20"/>
-        </w:rPr>
-        <w:t xml:space="preserve"> ou </w:t>
-      </w:r>
-      <w:r>
-        <w:rPr>
-          <w:rFonts w:ascii="Consolas" w:cs="Consolas" w:eastAsia="Consolas" w:hAnsi="Consolas"/>
-          <w:color w:val="00144A"/>
-          <w:sz w:val="20"/>
-          <w:szCs w:val="20"/>
-        </w:rPr>
-        <w:t xml:space="preserve">EM_ESTOQUE</w:t>
-      </w:r>
-      <w:r>
-        <w:rPr>
-          <w:rFonts w:ascii="Arial" w:cs="Arial" w:eastAsia="Arial" w:hAnsi="Arial"/>
-          <w:sz w:val="20"/>
-          <w:szCs w:val="20"/>
-        </w:rPr>
-        <w:t xml:space="preserve">.</w:t>
+        <w:t xml:space="preserve">Dado QtdeEstoque = 10 e QtdeReservada = 3, então QtdeDisponivel = 7.</w:t>
       </w:r>
     </w:p>
     <w:p>
@@ -45577,19 +46257,58 @@
           <w:sz w:val="20"/>
           <w:szCs w:val="20"/>
         </w:rPr>
-        <w:t xml:space="preserve">Dados dois registros de pedido simultâneos para o mesmo item, então o segundo é bloqueado se o primeiro consumir a disponibilidade.</w:t>
-      </w:r>
-    </w:p>
-    <w:p>
-      <w:pPr>
-        <w:pStyle w:val="Heading2"/>
-        <w:keepNext/>
-      </w:pPr>
-      <w:r>
-        <w:rPr>
-          <w:rFonts w:ascii="Arial" w:cs="Arial" w:eastAsia="Arial" w:hAnsi="Arial"/>
-        </w:rPr>
-        <w:t xml:space="preserve">22.3 Pedidos</w:t>
+        <w:t xml:space="preserve">Dado QtdeDisponivel = 0, 1 a 10 ou ≥ 11, então o status é </w:t>
+      </w:r>
+      <w:r>
+        <w:rPr>
+          <w:rFonts w:ascii="Consolas" w:cs="Consolas" w:eastAsia="Consolas" w:hAnsi="Consolas"/>
+          <w:color w:val="00144A"/>
+          <w:sz w:val="20"/>
+          <w:szCs w:val="20"/>
+        </w:rPr>
+        <w:t xml:space="preserve">SEM_ESTOQUE</w:t>
+      </w:r>
+      <w:r>
+        <w:rPr>
+          <w:rFonts w:ascii="Arial" w:cs="Arial" w:eastAsia="Arial" w:hAnsi="Arial"/>
+          <w:sz w:val="20"/>
+          <w:szCs w:val="20"/>
+        </w:rPr>
+        <w:t xml:space="preserve">, </w:t>
+      </w:r>
+      <w:r>
+        <w:rPr>
+          <w:rFonts w:ascii="Consolas" w:cs="Consolas" w:eastAsia="Consolas" w:hAnsi="Consolas"/>
+          <w:color w:val="00144A"/>
+          <w:sz w:val="20"/>
+          <w:szCs w:val="20"/>
+        </w:rPr>
+        <w:t xml:space="preserve">ACABANDO</w:t>
+      </w:r>
+      <w:r>
+        <w:rPr>
+          <w:rFonts w:ascii="Arial" w:cs="Arial" w:eastAsia="Arial" w:hAnsi="Arial"/>
+          <w:sz w:val="20"/>
+          <w:szCs w:val="20"/>
+        </w:rPr>
+        <w:t xml:space="preserve"> ou </w:t>
+      </w:r>
+      <w:r>
+        <w:rPr>
+          <w:rFonts w:ascii="Consolas" w:cs="Consolas" w:eastAsia="Consolas" w:hAnsi="Consolas"/>
+          <w:color w:val="00144A"/>
+          <w:sz w:val="20"/>
+          <w:szCs w:val="20"/>
+        </w:rPr>
+        <w:t xml:space="preserve">EM_ESTOQUE</w:t>
+      </w:r>
+      <w:r>
+        <w:rPr>
+          <w:rFonts w:ascii="Arial" w:cs="Arial" w:eastAsia="Arial" w:hAnsi="Arial"/>
+          <w:sz w:val="20"/>
+          <w:szCs w:val="20"/>
+        </w:rPr>
+        <w:t xml:space="preserve">.</w:t>
       </w:r>
     </w:p>
     <w:p>
@@ -45607,7 +46326,19 @@
           <w:sz w:val="20"/>
           <w:szCs w:val="20"/>
         </w:rPr>
-        <w:t xml:space="preserve">Dado um rascunho, então nenhuma reserva é feita.</w:t>
+        <w:t xml:space="preserve">Dados dois registros de pedido simultâneos para o mesmo item, então o segundo é bloqueado se o primeiro consumir a disponibilidade.</w:t>
+      </w:r>
+    </w:p>
+    <w:p>
+      <w:pPr>
+        <w:pStyle w:val="Heading2"/>
+        <w:keepNext/>
+      </w:pPr>
+      <w:r>
+        <w:rPr>
+          <w:rFonts w:ascii="Arial" w:cs="Arial" w:eastAsia="Arial" w:hAnsi="Arial"/>
+        </w:rPr>
+        <w:t xml:space="preserve">22.3 Pedidos</w:t>
       </w:r>
     </w:p>
     <w:p>
@@ -45625,24 +46356,7 @@
           <w:sz w:val="20"/>
           <w:szCs w:val="20"/>
         </w:rPr>
-        <w:t xml:space="preserve">Dado um rascunho válido, quando salvo, então o pedido fica </w:t>
-      </w:r>
-      <w:r>
-        <w:rPr>
-          <w:rFonts w:ascii="Consolas" w:cs="Consolas" w:eastAsia="Consolas" w:hAnsi="Consolas"/>
-          <w:color w:val="00144A"/>
-          <w:sz w:val="20"/>
-          <w:szCs w:val="20"/>
-        </w:rPr>
-        <w:t xml:space="preserve">ABERTO</w:t>
-      </w:r>
-      <w:r>
-        <w:rPr>
-          <w:rFonts w:ascii="Arial" w:cs="Arial" w:eastAsia="Arial" w:hAnsi="Arial"/>
-          <w:sz w:val="20"/>
-          <w:szCs w:val="20"/>
-        </w:rPr>
-        <w:t xml:space="preserve"> e o estoque é reservado.</w:t>
+        <w:t xml:space="preserve">Dado um rascunho, então nenhuma reserva é feita.</w:t>
       </w:r>
     </w:p>
     <w:p>
@@ -45660,7 +46374,24 @@
           <w:sz w:val="20"/>
           <w:szCs w:val="20"/>
         </w:rPr>
-        <w:t xml:space="preserve">Dado um rascunho sem itens, sem endereço principal ou sem estoque suficiente, quando salvo, então o registro é bloqueado sem reserva gravada.</w:t>
+        <w:t xml:space="preserve">Dado um rascunho válido, quando salvo, então o pedido fica </w:t>
+      </w:r>
+      <w:r>
+        <w:rPr>
+          <w:rFonts w:ascii="Consolas" w:cs="Consolas" w:eastAsia="Consolas" w:hAnsi="Consolas"/>
+          <w:color w:val="00144A"/>
+          <w:sz w:val="20"/>
+          <w:szCs w:val="20"/>
+        </w:rPr>
+        <w:t xml:space="preserve">ABERTO</w:t>
+      </w:r>
+      <w:r>
+        <w:rPr>
+          <w:rFonts w:ascii="Arial" w:cs="Arial" w:eastAsia="Arial" w:hAnsi="Arial"/>
+          <w:sz w:val="20"/>
+          <w:szCs w:val="20"/>
+        </w:rPr>
+        <w:t xml:space="preserve"> e o estoque é reservado.</w:t>
       </w:r>
     </w:p>
     <w:p>
@@ -45678,24 +46409,7 @@
           <w:sz w:val="20"/>
           <w:szCs w:val="20"/>
         </w:rPr>
-        <w:t xml:space="preserve">Dado um pedido </w:t>
-      </w:r>
-      <w:r>
-        <w:rPr>
-          <w:rFonts w:ascii="Consolas" w:cs="Consolas" w:eastAsia="Consolas" w:hAnsi="Consolas"/>
-          <w:color w:val="00144A"/>
-          <w:sz w:val="20"/>
-          <w:szCs w:val="20"/>
-        </w:rPr>
-        <w:t xml:space="preserve">ABERTO</w:t>
-      </w:r>
-      <w:r>
-        <w:rPr>
-          <w:rFonts w:ascii="Arial" w:cs="Arial" w:eastAsia="Arial" w:hAnsi="Arial"/>
-          <w:sz w:val="20"/>
-          <w:szCs w:val="20"/>
-        </w:rPr>
-        <w:t xml:space="preserve">, quando itens forem alterados, incluídos ou removidos, então a reserva reflete só a diferença.</w:t>
+        <w:t xml:space="preserve">Dado um rascunho sem itens, sem endereço principal ou sem estoque suficiente, quando salvo, então o registro é bloqueado sem reserva gravada.</w:t>
       </w:r>
     </w:p>
     <w:p>
@@ -45713,7 +46427,7 @@
           <w:sz w:val="20"/>
           <w:szCs w:val="20"/>
         </w:rPr>
-        <w:t xml:space="preserve">Dado um pagamento aprovado, então o pedido vai a </w:t>
+        <w:t xml:space="preserve">Dado um pedido </w:t>
       </w:r>
       <w:r>
         <w:rPr>
@@ -45722,23 +46436,6 @@
           <w:sz w:val="20"/>
           <w:szCs w:val="20"/>
         </w:rPr>
-        <w:t xml:space="preserve">AGUARDANDO_APROVACAO</w:t>
-      </w:r>
-      <w:r>
-        <w:rPr>
-          <w:rFonts w:ascii="Arial" w:cs="Arial" w:eastAsia="Arial" w:hAnsi="Arial"/>
-          <w:sz w:val="20"/>
-          <w:szCs w:val="20"/>
-        </w:rPr>
-        <w:t xml:space="preserve">; recusado, permanece </w:t>
-      </w:r>
-      <w:r>
-        <w:rPr>
-          <w:rFonts w:ascii="Consolas" w:cs="Consolas" w:eastAsia="Consolas" w:hAnsi="Consolas"/>
-          <w:color w:val="00144A"/>
-          <w:sz w:val="20"/>
-          <w:szCs w:val="20"/>
-        </w:rPr>
         <w:t xml:space="preserve">ABERTO</w:t>
       </w:r>
       <w:r>
@@ -45747,7 +46444,7 @@
           <w:sz w:val="20"/>
           <w:szCs w:val="20"/>
         </w:rPr>
-        <w:t xml:space="preserve">.</w:t>
+        <w:t xml:space="preserve">, quando itens forem alterados, incluídos ou removidos, então a reserva reflete só a diferença.</w:t>
       </w:r>
     </w:p>
     <w:p>
@@ -45765,7 +46462,7 @@
           <w:sz w:val="20"/>
           <w:szCs w:val="20"/>
         </w:rPr>
-        <w:t xml:space="preserve">Dado um pedido </w:t>
+        <w:t xml:space="preserve">Dado um pagamento aprovado, então o pedido vai a </w:t>
       </w:r>
       <w:r>
         <w:rPr>
@@ -45782,7 +46479,7 @@
           <w:sz w:val="20"/>
           <w:szCs w:val="20"/>
         </w:rPr>
-        <w:t xml:space="preserve">, quando aprovado, então o estoque é baixado, os snapshots gerados e o status muda para </w:t>
+        <w:t xml:space="preserve">; recusado, permanece </w:t>
       </w:r>
       <w:r>
         <w:rPr>
@@ -45791,7 +46488,7 @@
           <w:sz w:val="20"/>
           <w:szCs w:val="20"/>
         </w:rPr>
-        <w:t xml:space="preserve">FINALIZADO</w:t>
+        <w:t xml:space="preserve">ABERTO</w:t>
       </w:r>
       <w:r>
         <w:rPr>
@@ -45817,7 +46514,7 @@
           <w:sz w:val="20"/>
           <w:szCs w:val="20"/>
         </w:rPr>
-        <w:t xml:space="preserve">Dado um pedido sem pagamento aprovado, quando cancelado com motivo, então a reserva é liberada e o status muda para </w:t>
+        <w:t xml:space="preserve">Dado um pedido </w:t>
       </w:r>
       <w:r>
         <w:rPr>
@@ -45826,7 +46523,24 @@
           <w:sz w:val="20"/>
           <w:szCs w:val="20"/>
         </w:rPr>
-        <w:t xml:space="preserve">CANCELADO</w:t>
+        <w:t xml:space="preserve">AGUARDANDO_APROVACAO</w:t>
+      </w:r>
+      <w:r>
+        <w:rPr>
+          <w:rFonts w:ascii="Arial" w:cs="Arial" w:eastAsia="Arial" w:hAnsi="Arial"/>
+          <w:sz w:val="20"/>
+          <w:szCs w:val="20"/>
+        </w:rPr>
+        <w:t xml:space="preserve">, quando aprovado, então o estoque é baixado, os snapshots gerados e o status muda para </w:t>
+      </w:r>
+      <w:r>
+        <w:rPr>
+          <w:rFonts w:ascii="Consolas" w:cs="Consolas" w:eastAsia="Consolas" w:hAnsi="Consolas"/>
+          <w:color w:val="00144A"/>
+          <w:sz w:val="20"/>
+          <w:szCs w:val="20"/>
+        </w:rPr>
+        <w:t xml:space="preserve">FINALIZADO</w:t>
       </w:r>
       <w:r>
         <w:rPr>
@@ -45852,7 +46566,7 @@
           <w:sz w:val="20"/>
           <w:szCs w:val="20"/>
         </w:rPr>
-        <w:t xml:space="preserve">Dado um pedido com pagamento aprovado, quando cancelado, então é criada uma solicitação </w:t>
+        <w:t xml:space="preserve">Dado um pedido sem pagamento aprovado, quando cancelado com motivo, então a reserva é liberada e o status muda para </w:t>
       </w:r>
       <w:r>
         <w:rPr>
@@ -45861,32 +46575,15 @@
           <w:sz w:val="20"/>
           <w:szCs w:val="20"/>
         </w:rPr>
-        <w:t xml:space="preserve">PENDENTE</w:t>
-      </w:r>
-      <w:r>
-        <w:rPr>
-          <w:rFonts w:ascii="Arial" w:cs="Arial" w:eastAsia="Arial" w:hAnsi="Arial"/>
-          <w:sz w:val="20"/>
-          <w:szCs w:val="20"/>
-        </w:rPr>
-        <w:t xml:space="preserve"> e o status muda para </w:t>
-      </w:r>
-      <w:r>
-        <w:rPr>
-          <w:rFonts w:ascii="Consolas" w:cs="Consolas" w:eastAsia="Consolas" w:hAnsi="Consolas"/>
-          <w:color w:val="00144A"/>
-          <w:sz w:val="20"/>
-          <w:szCs w:val="20"/>
-        </w:rPr>
-        <w:t xml:space="preserve">PROCESSANDO_REEMBOLSO</w:t>
-      </w:r>
-      <w:r>
-        <w:rPr>
-          <w:rFonts w:ascii="Arial" w:cs="Arial" w:eastAsia="Arial" w:hAnsi="Arial"/>
-          <w:sz w:val="20"/>
-          <w:szCs w:val="20"/>
-        </w:rPr>
-        <w:t xml:space="preserve">, mantendo a reserva.</w:t>
+        <w:t xml:space="preserve">CANCELADO</w:t>
+      </w:r>
+      <w:r>
+        <w:rPr>
+          <w:rFonts w:ascii="Arial" w:cs="Arial" w:eastAsia="Arial" w:hAnsi="Arial"/>
+          <w:sz w:val="20"/>
+          <w:szCs w:val="20"/>
+        </w:rPr>
+        <w:t xml:space="preserve">.</w:t>
       </w:r>
     </w:p>
     <w:p>
@@ -45904,19 +46601,41 @@
           <w:sz w:val="20"/>
           <w:szCs w:val="20"/>
         </w:rPr>
-        <w:t xml:space="preserve">Dado um pedido encerrado, quando aberto, então cliente e itens vêm dos snapshots e nenhuma edição é possível.</w:t>
-      </w:r>
-    </w:p>
-    <w:p>
-      <w:pPr>
-        <w:pStyle w:val="Heading2"/>
-        <w:keepNext/>
-      </w:pPr>
-      <w:r>
-        <w:rPr>
-          <w:rFonts w:ascii="Arial" w:cs="Arial" w:eastAsia="Arial" w:hAnsi="Arial"/>
-        </w:rPr>
-        <w:t xml:space="preserve">22.4 Reembolsos</w:t>
+        <w:t xml:space="preserve">Dado um pedido com pagamento aprovado, quando cancelado, então é criada uma solicitação </w:t>
+      </w:r>
+      <w:r>
+        <w:rPr>
+          <w:rFonts w:ascii="Consolas" w:cs="Consolas" w:eastAsia="Consolas" w:hAnsi="Consolas"/>
+          <w:color w:val="00144A"/>
+          <w:sz w:val="20"/>
+          <w:szCs w:val="20"/>
+        </w:rPr>
+        <w:t xml:space="preserve">PENDENTE</w:t>
+      </w:r>
+      <w:r>
+        <w:rPr>
+          <w:rFonts w:ascii="Arial" w:cs="Arial" w:eastAsia="Arial" w:hAnsi="Arial"/>
+          <w:sz w:val="20"/>
+          <w:szCs w:val="20"/>
+        </w:rPr>
+        <w:t xml:space="preserve"> e o status muda para </w:t>
+      </w:r>
+      <w:r>
+        <w:rPr>
+          <w:rFonts w:ascii="Consolas" w:cs="Consolas" w:eastAsia="Consolas" w:hAnsi="Consolas"/>
+          <w:color w:val="00144A"/>
+          <w:sz w:val="20"/>
+          <w:szCs w:val="20"/>
+        </w:rPr>
+        <w:t xml:space="preserve">PROCESSANDO_REEMBOLSO</w:t>
+      </w:r>
+      <w:r>
+        <w:rPr>
+          <w:rFonts w:ascii="Arial" w:cs="Arial" w:eastAsia="Arial" w:hAnsi="Arial"/>
+          <w:sz w:val="20"/>
+          <w:szCs w:val="20"/>
+        </w:rPr>
+        <w:t xml:space="preserve">, mantendo a reserva.</w:t>
       </w:r>
     </w:p>
     <w:p>
@@ -45934,41 +46653,7 @@
           <w:sz w:val="20"/>
           <w:szCs w:val="20"/>
         </w:rPr>
-        <w:t xml:space="preserve">Dada uma solicitação </w:t>
-      </w:r>
-      <w:r>
-        <w:rPr>
-          <w:rFonts w:ascii="Consolas" w:cs="Consolas" w:eastAsia="Consolas" w:hAnsi="Consolas"/>
-          <w:color w:val="00144A"/>
-          <w:sz w:val="20"/>
-          <w:szCs w:val="20"/>
-        </w:rPr>
-        <w:t xml:space="preserve">PENDENTE</w:t>
-      </w:r>
-      <w:r>
-        <w:rPr>
-          <w:rFonts w:ascii="Arial" w:cs="Arial" w:eastAsia="Arial" w:hAnsi="Arial"/>
-          <w:sz w:val="20"/>
-          <w:szCs w:val="20"/>
-        </w:rPr>
-        <w:t xml:space="preserve">, quando aprovada, então o pedido é cancelado, a reserva liberada e o pagamento fica </w:t>
-      </w:r>
-      <w:r>
-        <w:rPr>
-          <w:rFonts w:ascii="Consolas" w:cs="Consolas" w:eastAsia="Consolas" w:hAnsi="Consolas"/>
-          <w:color w:val="00144A"/>
-          <w:sz w:val="20"/>
-          <w:szCs w:val="20"/>
-        </w:rPr>
-        <w:t xml:space="preserve">DEVOLVIDO</w:t>
-      </w:r>
-      <w:r>
-        <w:rPr>
-          <w:rFonts w:ascii="Arial" w:cs="Arial" w:eastAsia="Arial" w:hAnsi="Arial"/>
-          <w:sz w:val="20"/>
-          <w:szCs w:val="20"/>
-        </w:rPr>
-        <w:t xml:space="preserve">.</w:t>
+        <w:t xml:space="preserve">Dado um pedido encerrado, quando aberto, então cliente e itens vêm dos snapshots e nenhuma edição é possível.</w:t>
       </w:r>
     </w:p>
     <w:p>
@@ -45986,24 +46671,7 @@
           <w:sz w:val="20"/>
           <w:szCs w:val="20"/>
         </w:rPr>
-        <w:t xml:space="preserve">Dada uma solicitação </w:t>
-      </w:r>
-      <w:r>
-        <w:rPr>
-          <w:rFonts w:ascii="Consolas" w:cs="Consolas" w:eastAsia="Consolas" w:hAnsi="Consolas"/>
-          <w:color w:val="00144A"/>
-          <w:sz w:val="20"/>
-          <w:szCs w:val="20"/>
-        </w:rPr>
-        <w:t xml:space="preserve">PENDENTE</w:t>
-      </w:r>
-      <w:r>
-        <w:rPr>
-          <w:rFonts w:ascii="Arial" w:cs="Arial" w:eastAsia="Arial" w:hAnsi="Arial"/>
-          <w:sz w:val="20"/>
-          <w:szCs w:val="20"/>
-        </w:rPr>
-        <w:t xml:space="preserve">, quando rejeitada sem motivo, então a ação é bloqueada; com motivo, o pedido retoma o status anterior.</w:t>
+        <w:t xml:space="preserve">Dado qualquer pedido, quando o usuário escolher Efetuar Pagamento, Aprovar pedido ou Cancelar pedido, então a ação só executa depois da confirmação.</w:t>
       </w:r>
     </w:p>
     <w:p>
@@ -46021,7 +46689,159 @@
           <w:sz w:val="20"/>
           <w:szCs w:val="20"/>
         </w:rPr>
+        <w:t xml:space="preserve">Dado o diálogo de pagamento com um campo vazio ou fora do formato, quando confirmado, então todos os erros são mostrados de uma vez e nada é gravado.</w:t>
+      </w:r>
+    </w:p>
+    <w:p>
+      <w:pPr>
+        <w:pStyle w:val="Heading2"/>
+        <w:keepNext/>
+      </w:pPr>
+      <w:r>
+        <w:rPr>
+          <w:rFonts w:ascii="Arial" w:cs="Arial" w:eastAsia="Arial" w:hAnsi="Arial"/>
+        </w:rPr>
+        <w:t xml:space="preserve">22.4 Reembolsos</w:t>
+      </w:r>
+    </w:p>
+    <w:p>
+      <w:pPr>
+        <w:pStyle w:val="ListParagraph"/>
+        <w:numPr>
+          <w:ilvl w:val="0"/>
+          <w:numId w:val="2"/>
+        </w:numPr>
+        <w:spacing w:after="60"/>
+      </w:pPr>
+      <w:r>
+        <w:rPr>
+          <w:rFonts w:ascii="Arial" w:cs="Arial" w:eastAsia="Arial" w:hAnsi="Arial"/>
+          <w:sz w:val="20"/>
+          <w:szCs w:val="20"/>
+        </w:rPr>
+        <w:t xml:space="preserve">Dada uma solicitação </w:t>
+      </w:r>
+      <w:r>
+        <w:rPr>
+          <w:rFonts w:ascii="Consolas" w:cs="Consolas" w:eastAsia="Consolas" w:hAnsi="Consolas"/>
+          <w:color w:val="00144A"/>
+          <w:sz w:val="20"/>
+          <w:szCs w:val="20"/>
+        </w:rPr>
+        <w:t xml:space="preserve">PENDENTE</w:t>
+      </w:r>
+      <w:r>
+        <w:rPr>
+          <w:rFonts w:ascii="Arial" w:cs="Arial" w:eastAsia="Arial" w:hAnsi="Arial"/>
+          <w:sz w:val="20"/>
+          <w:szCs w:val="20"/>
+        </w:rPr>
+        <w:t xml:space="preserve">, quando aprovada, então o pedido é cancelado, a reserva liberada e o pagamento fica </w:t>
+      </w:r>
+      <w:r>
+        <w:rPr>
+          <w:rFonts w:ascii="Consolas" w:cs="Consolas" w:eastAsia="Consolas" w:hAnsi="Consolas"/>
+          <w:color w:val="00144A"/>
+          <w:sz w:val="20"/>
+          <w:szCs w:val="20"/>
+        </w:rPr>
+        <w:t xml:space="preserve">DEVOLVIDO</w:t>
+      </w:r>
+      <w:r>
+        <w:rPr>
+          <w:rFonts w:ascii="Arial" w:cs="Arial" w:eastAsia="Arial" w:hAnsi="Arial"/>
+          <w:sz w:val="20"/>
+          <w:szCs w:val="20"/>
+        </w:rPr>
+        <w:t xml:space="preserve">.</w:t>
+      </w:r>
+    </w:p>
+    <w:p>
+      <w:pPr>
+        <w:pStyle w:val="ListParagraph"/>
+        <w:numPr>
+          <w:ilvl w:val="0"/>
+          <w:numId w:val="2"/>
+        </w:numPr>
+        <w:spacing w:after="60"/>
+      </w:pPr>
+      <w:r>
+        <w:rPr>
+          <w:rFonts w:ascii="Arial" w:cs="Arial" w:eastAsia="Arial" w:hAnsi="Arial"/>
+          <w:sz w:val="20"/>
+          <w:szCs w:val="20"/>
+        </w:rPr>
+        <w:t xml:space="preserve">Dada uma solicitação </w:t>
+      </w:r>
+      <w:r>
+        <w:rPr>
+          <w:rFonts w:ascii="Consolas" w:cs="Consolas" w:eastAsia="Consolas" w:hAnsi="Consolas"/>
+          <w:color w:val="00144A"/>
+          <w:sz w:val="20"/>
+          <w:szCs w:val="20"/>
+        </w:rPr>
+        <w:t xml:space="preserve">PENDENTE</w:t>
+      </w:r>
+      <w:r>
+        <w:rPr>
+          <w:rFonts w:ascii="Arial" w:cs="Arial" w:eastAsia="Arial" w:hAnsi="Arial"/>
+          <w:sz w:val="20"/>
+          <w:szCs w:val="20"/>
+        </w:rPr>
+        <w:t xml:space="preserve">, quando rejeitada sem motivo, então a ação é bloqueada; com motivo, o pedido retoma o status anterior.</w:t>
+      </w:r>
+    </w:p>
+    <w:p>
+      <w:pPr>
+        <w:pStyle w:val="ListParagraph"/>
+        <w:numPr>
+          <w:ilvl w:val="0"/>
+          <w:numId w:val="2"/>
+        </w:numPr>
+        <w:spacing w:after="60"/>
+      </w:pPr>
+      <w:r>
+        <w:rPr>
+          <w:rFonts w:ascii="Arial" w:cs="Arial" w:eastAsia="Arial" w:hAnsi="Arial"/>
+          <w:sz w:val="20"/>
+          <w:szCs w:val="20"/>
+        </w:rPr>
         <w:t xml:space="preserve">Dada uma solicitação já decidida, então Aprovar e Rejeitar não ficam disponíveis.</w:t>
+      </w:r>
+    </w:p>
+    <w:p>
+      <w:pPr>
+        <w:pStyle w:val="ListParagraph"/>
+        <w:numPr>
+          <w:ilvl w:val="0"/>
+          <w:numId w:val="2"/>
+        </w:numPr>
+        <w:spacing w:after="60"/>
+      </w:pPr>
+      <w:r>
+        <w:rPr>
+          <w:rFonts w:ascii="Arial" w:cs="Arial" w:eastAsia="Arial" w:hAnsi="Arial"/>
+          <w:sz w:val="20"/>
+          <w:szCs w:val="20"/>
+        </w:rPr>
+        <w:t xml:space="preserve">Dada uma solicitação </w:t>
+      </w:r>
+      <w:r>
+        <w:rPr>
+          <w:rFonts w:ascii="Consolas" w:cs="Consolas" w:eastAsia="Consolas" w:hAnsi="Consolas"/>
+          <w:color w:val="00144A"/>
+          <w:sz w:val="20"/>
+          <w:szCs w:val="20"/>
+        </w:rPr>
+        <w:t xml:space="preserve">PENDENTE</w:t>
+      </w:r>
+      <w:r>
+        <w:rPr>
+          <w:rFonts w:ascii="Arial" w:cs="Arial" w:eastAsia="Arial" w:hAnsi="Arial"/>
+          <w:sz w:val="20"/>
+          <w:szCs w:val="20"/>
+        </w:rPr>
+        <w:t xml:space="preserve">, quando o usuário escolher Aprovar ou Rejeitar no menu "Ações", então a decisão só segue para o diálogo do motivo depois da confirmação.</w:t>
       </w:r>
     </w:p>
     <w:p>
@@ -50045,7 +50865,7 @@
                 <w:sz w:val="17"/>
                 <w:szCs w:val="17"/>
               </w:rPr>
-              <w:t xml:space="preserve">Bandeira, máscara, aprovação, recusa e dados inválidos</w:t>
+              <w:t xml:space="preserve">Bandeira, máscara, aprovação, recusa, dados inválidos e validação de todos os campos de uma vez</w:t>
             </w:r>
           </w:p>
         </w:tc>
@@ -50235,7 +51055,7 @@
                 <w:sz w:val="17"/>
                 <w:szCs w:val="17"/>
               </w:rPr>
-              <w:t xml:space="preserve">Validações do Save, normalização, preenchimento pelo CEP, endereço principal, CEP único e exclusão bloqueada</w:t>
+              <w:t xml:space="preserve">Validações do Save, normalização, preenchimento pelo CEP, endereço principal e seu precheck, CEP único, exclusão e inativação bloqueadas</w:t>
             </w:r>
           </w:p>
         </w:tc>
@@ -50330,7 +51150,7 @@
                 <w:sz w:val="17"/>
                 <w:szCs w:val="17"/>
               </w:rPr>
-              <w:t xml:space="preserve">Reserva, liberação e baixa com recálculo do saldo, validações, inativação e exclusão bloqueadas</w:t>
+              <w:t xml:space="preserve">Reserva, liberação e baixa com recálculo do saldo, validações, inativação (precheck e Save) e exclusão bloqueadas</w:t>
             </w:r>
           </w:p>
         </w:tc>
@@ -50425,7 +51245,7 @@
                 <w:sz w:val="17"/>
                 <w:szCs w:val="17"/>
               </w:rPr>
-              <w:t xml:space="preserve">Registro com reserva, edição de itens, validações do Save, precheck de estoque, total, pagamento, aprovação, cancelamento e snapshots</w:t>
+              <w:t xml:space="preserve">Registro com reserva, edição de itens, validações do Save, precheck de estoque e do pagamento, total, pagamento, aprovação, cancelamento e snapshots</w:t>
             </w:r>
           </w:p>
         </w:tc>

</xml_diff>